<commit_message>
Show which commit is live, check each production deploy, explain sign-in setup errors
Co-Authored-By: Claude Sonnet 5.5 <noreply@anthropic.com>
Claude-Session: https://claude.ai/code/session_01CEBT7Vo5qSapA8phj8RKSd
</commit_message>
<xml_diff>
--- a/docs/GloblexAI-Office-ERP-Operations-and-Training-Guide.docx
+++ b/docs/GloblexAI-Office-ERP-Operations-and-Training-Guide.docx
@@ -14221,7 +14221,7 @@
           <w:b w:val="0"/>
           <w:i w:val="0"/>
         </w:rPr>
-        <w:t>Trigger a new deployment so it takes effect.</w:t>
+        <w:t>Trigger a new production deployment and wait for it to finish. The change does not apply until it does. Then open /api/health and check that "version" matches the latest commit on GitHub.</w:t>
       </w:r>
     </w:p>
     <w:p>
@@ -15557,6 +15557,121 @@
                 <w:sz w:val="20"/>
               </w:rPr>
               <w:t xml:space="preserve">Administrator: set ANTHROPIC_API_KEY (13.1)</w:t>
+            </w:r>
+          </w:p>
+        </w:tc>
+      </w:tr>
+      <w:tr>
+        <w:tc>
+          <w:tcPr>
+            <w:tcW w:type="dxa" w:w="3168"/>
+          </w:tcPr>
+          <w:p>
+            <w:pPr>
+              <w:spacing w:after="40"/>
+            </w:pPr>
+            <w:r>
+              <w:rPr>
+                <w:b w:val="0"/>
+                <w:i w:val="0"/>
+                <w:sz w:val="20"/>
+              </w:rPr>
+              <w:t xml:space="preserve">New changes or a new passphrase do not take effect</w:t>
+            </w:r>
+          </w:p>
+        </w:tc>
+        <w:tc>
+          <w:tcPr>
+            <w:tcW w:type="dxa" w:w="2880"/>
+          </w:tcPr>
+          <w:p>
+            <w:pPr>
+              <w:spacing w:after="40"/>
+            </w:pPr>
+            <w:r>
+              <w:rPr>
+                <w:b w:val="0"/>
+                <w:i w:val="0"/>
+                <w:sz w:val="20"/>
+              </w:rPr>
+              <w:t xml:space="preserve">The latest production deploy was skipped (Netlify pauses production deploys when the account is out of credits) or failed</w:t>
+            </w:r>
+          </w:p>
+        </w:tc>
+        <w:tc>
+          <w:tcPr>
+            <w:tcW w:type="dxa" w:w="3312"/>
+          </w:tcPr>
+          <w:p>
+            <w:pPr>
+              <w:spacing w:after="40"/>
+            </w:pPr>
+            <w:r>
+              <w:rPr>
+                <w:b w:val="0"/>
+                <w:i w:val="0"/>
+                <w:sz w:val="20"/>
+              </w:rPr>
+              <w:t xml:space="preserve">Open the latest production deploy in Netlify. If it says Skipped, check Usage and billing and add credits or upgrade, or contact Netlify support. Compare "version" at /api/health with GitHub. The "Check production deploy" workflow on GitHub also fails when the live site is behind</w:t>
+            </w:r>
+          </w:p>
+        </w:tc>
+      </w:tr>
+      <w:tr>
+        <w:tc>
+          <w:tcPr>
+            <w:tcW w:type="dxa" w:w="3168"/>
+            <w:shd w:val="clear" w:color="auto" w:fill="F4F7FB"/>
+          </w:tcPr>
+          <w:p>
+            <w:pPr>
+              <w:spacing w:after="40"/>
+            </w:pPr>
+            <w:r>
+              <w:rPr>
+                <w:b w:val="0"/>
+                <w:i w:val="0"/>
+                <w:sz w:val="20"/>
+              </w:rPr>
+              <w:t xml:space="preserve">Sign-in says it is not set up on the server</w:t>
+            </w:r>
+          </w:p>
+        </w:tc>
+        <w:tc>
+          <w:tcPr>
+            <w:tcW w:type="dxa" w:w="2880"/>
+            <w:shd w:val="clear" w:color="auto" w:fill="F4F7FB"/>
+          </w:tcPr>
+          <w:p>
+            <w:pPr>
+              <w:spacing w:after="40"/>
+            </w:pPr>
+            <w:r>
+              <w:rPr>
+                <w:b w:val="0"/>
+                <w:i w:val="0"/>
+                <w:sz w:val="20"/>
+              </w:rPr>
+              <w:t xml:space="preserve">APP_PASSWORD or SESSION_SECRET is missing from the environment</w:t>
+            </w:r>
+          </w:p>
+        </w:tc>
+        <w:tc>
+          <w:tcPr>
+            <w:tcW w:type="dxa" w:w="3312"/>
+            <w:shd w:val="clear" w:color="auto" w:fill="F4F7FB"/>
+          </w:tcPr>
+          <w:p>
+            <w:pPr>
+              <w:spacing w:after="40"/>
+            </w:pPr>
+            <w:r>
+              <w:rPr>
+                <w:b w:val="0"/>
+                <w:i w:val="0"/>
+                <w:sz w:val="20"/>
+              </w:rPr>
+              <w:t xml:space="preserve">Administrator: set both in Netlify and run a new production deploy (13.1, 13.2)</w:t>
             </w:r>
           </w:p>
         </w:tc>

</xml_diff>

<commit_message>
Show which commit is live, check each production deploy, explain sign-in setup errors (#71)
Claude-Session: https://claude.ai/code/session_01CEBT7Vo5qSapA8phj8RKSd

Co-authored-by: Claude <noreply@anthropic.com>
</commit_message>
<xml_diff>
--- a/docs/GloblexAI-Office-ERP-Operations-and-Training-Guide.docx
+++ b/docs/GloblexAI-Office-ERP-Operations-and-Training-Guide.docx
@@ -14221,7 +14221,7 @@
           <w:b w:val="0"/>
           <w:i w:val="0"/>
         </w:rPr>
-        <w:t>Trigger a new deployment so it takes effect.</w:t>
+        <w:t>Trigger a new production deployment and wait for it to finish. The change does not apply until it does. Then open /api/health and check that "version" matches the latest commit on GitHub.</w:t>
       </w:r>
     </w:p>
     <w:p>
@@ -15557,6 +15557,121 @@
                 <w:sz w:val="20"/>
               </w:rPr>
               <w:t xml:space="preserve">Administrator: set ANTHROPIC_API_KEY (13.1)</w:t>
+            </w:r>
+          </w:p>
+        </w:tc>
+      </w:tr>
+      <w:tr>
+        <w:tc>
+          <w:tcPr>
+            <w:tcW w:type="dxa" w:w="3168"/>
+          </w:tcPr>
+          <w:p>
+            <w:pPr>
+              <w:spacing w:after="40"/>
+            </w:pPr>
+            <w:r>
+              <w:rPr>
+                <w:b w:val="0"/>
+                <w:i w:val="0"/>
+                <w:sz w:val="20"/>
+              </w:rPr>
+              <w:t xml:space="preserve">New changes or a new passphrase do not take effect</w:t>
+            </w:r>
+          </w:p>
+        </w:tc>
+        <w:tc>
+          <w:tcPr>
+            <w:tcW w:type="dxa" w:w="2880"/>
+          </w:tcPr>
+          <w:p>
+            <w:pPr>
+              <w:spacing w:after="40"/>
+            </w:pPr>
+            <w:r>
+              <w:rPr>
+                <w:b w:val="0"/>
+                <w:i w:val="0"/>
+                <w:sz w:val="20"/>
+              </w:rPr>
+              <w:t xml:space="preserve">The latest production deploy was skipped (Netlify pauses production deploys when the account is out of credits) or failed</w:t>
+            </w:r>
+          </w:p>
+        </w:tc>
+        <w:tc>
+          <w:tcPr>
+            <w:tcW w:type="dxa" w:w="3312"/>
+          </w:tcPr>
+          <w:p>
+            <w:pPr>
+              <w:spacing w:after="40"/>
+            </w:pPr>
+            <w:r>
+              <w:rPr>
+                <w:b w:val="0"/>
+                <w:i w:val="0"/>
+                <w:sz w:val="20"/>
+              </w:rPr>
+              <w:t xml:space="preserve">Open the latest production deploy in Netlify. If it says Skipped, check Usage and billing and add credits or upgrade, or contact Netlify support. Compare "version" at /api/health with GitHub. The "Check production deploy" workflow on GitHub also fails when the live site is behind</w:t>
+            </w:r>
+          </w:p>
+        </w:tc>
+      </w:tr>
+      <w:tr>
+        <w:tc>
+          <w:tcPr>
+            <w:tcW w:type="dxa" w:w="3168"/>
+            <w:shd w:val="clear" w:color="auto" w:fill="F4F7FB"/>
+          </w:tcPr>
+          <w:p>
+            <w:pPr>
+              <w:spacing w:after="40"/>
+            </w:pPr>
+            <w:r>
+              <w:rPr>
+                <w:b w:val="0"/>
+                <w:i w:val="0"/>
+                <w:sz w:val="20"/>
+              </w:rPr>
+              <w:t xml:space="preserve">Sign-in says it is not set up on the server</w:t>
+            </w:r>
+          </w:p>
+        </w:tc>
+        <w:tc>
+          <w:tcPr>
+            <w:tcW w:type="dxa" w:w="2880"/>
+            <w:shd w:val="clear" w:color="auto" w:fill="F4F7FB"/>
+          </w:tcPr>
+          <w:p>
+            <w:pPr>
+              <w:spacing w:after="40"/>
+            </w:pPr>
+            <w:r>
+              <w:rPr>
+                <w:b w:val="0"/>
+                <w:i w:val="0"/>
+                <w:sz w:val="20"/>
+              </w:rPr>
+              <w:t xml:space="preserve">APP_PASSWORD or SESSION_SECRET is missing from the environment</w:t>
+            </w:r>
+          </w:p>
+        </w:tc>
+        <w:tc>
+          <w:tcPr>
+            <w:tcW w:type="dxa" w:w="3312"/>
+            <w:shd w:val="clear" w:color="auto" w:fill="F4F7FB"/>
+          </w:tcPr>
+          <w:p>
+            <w:pPr>
+              <w:spacing w:after="40"/>
+            </w:pPr>
+            <w:r>
+              <w:rPr>
+                <w:b w:val="0"/>
+                <w:i w:val="0"/>
+                <w:sz w:val="20"/>
+              </w:rPr>
+              <w:t xml:space="preserve">Administrator: set both in Netlify and run a new production deploy (13.1, 13.2)</w:t>
             </w:r>
           </w:p>
         </w:tc>

</xml_diff>

<commit_message>
Tax filing: provincial and state tax, earned income and education credits, Training guide Part 12
Co-Authored-By: Claude Sonnet 5.5 <noreply@anthropic.com>
Claude-Session: https://claude.ai/code/session_01CEBT7Vo5qSapA8phj8RKSd
</commit_message>
<xml_diff>
--- a/docs/GloblexAI-Office-ERP-Operations-and-Training-Guide.docx
+++ b/docs/GloblexAI-Office-ERP-Operations-and-Training-Guide.docx
@@ -91,7 +91,7 @@
           <w:color w:val="555F6D"/>
           <w:sz w:val="20"/>
         </w:rPr>
-        <w:t>Version 1.1 · October 2026</w:t>
+        <w:t>Version 1.2 · October 2026</w:t>
       </w:r>
     </w:p>
     <w:p>
@@ -124,7 +124,7 @@
           <w:b w:val="0"/>
           <w:i w:val="0"/>
         </w:rPr>
-        <w:t xml:space="preserve">This guide takes you from your first sign-in to running a normal day in the application. Read Parts 1 to 3 once. Use Parts 4 to 11 as a reference for the area you work in, and Part 12 for the daily, weekly and month-end routines.</w:t>
+        <w:t xml:space="preserve">This guide takes you from your first sign-in to running a normal day in the application. Read Parts 1 to 3 once. Use Parts 4 to 12 as a reference for the area you work in, and Part 13 for the daily, weekly and month-end routines.</w:t>
       </w:r>
     </w:p>
     <w:tbl>
@@ -371,7 +371,7 @@
                 <w:i w:val="0"/>
                 <w:sz w:val="20"/>
               </w:rPr>
-              <w:t xml:space="preserve">Part 10 (Accounting tabs), Part 11 (AI bookkeeping) and Part 12 (routines)</w:t>
+              <w:t xml:space="preserve">Part 10 (Accounting tabs), Part 11 (AI bookkeeping) and Part 13 (routines)</w:t>
             </w:r>
           </w:p>
         </w:tc>
@@ -411,7 +411,7 @@
                 <w:i w:val="0"/>
                 <w:sz w:val="20"/>
               </w:rPr>
-              <w:t xml:space="preserve">Part 9 (Counsel) and Part 12 (routines)</w:t>
+              <w:t xml:space="preserve">Part 9 (Counsel) and Part 13 (routines)</w:t>
             </w:r>
           </w:p>
         </w:tc>
@@ -431,6 +431,45 @@
                 <w:i w:val="0"/>
                 <w:sz w:val="20"/>
               </w:rPr>
+              <w:t xml:space="preserve">Anyone preparing a tax return</w:t>
+            </w:r>
+          </w:p>
+        </w:tc>
+        <w:tc>
+          <w:tcPr>
+            <w:tcW w:type="dxa" w:w="5904"/>
+          </w:tcPr>
+          <w:p>
+            <w:pPr>
+              <w:spacing w:after="40"/>
+            </w:pPr>
+            <w:r>
+              <w:rPr>
+                <w:b w:val="0"/>
+                <w:i w:val="0"/>
+                <w:sz w:val="20"/>
+              </w:rPr>
+              <w:t xml:space="preserve">Part 12 (Tax filing)</w:t>
+            </w:r>
+          </w:p>
+        </w:tc>
+      </w:tr>
+      <w:tr>
+        <w:tc>
+          <w:tcPr>
+            <w:tcW w:type="dxa" w:w="3456"/>
+            <w:shd w:val="clear" w:color="auto" w:fill="F4F7FB"/>
+          </w:tcPr>
+          <w:p>
+            <w:pPr>
+              <w:spacing w:after="40"/>
+            </w:pPr>
+            <w:r>
+              <w:rPr>
+                <w:b w:val="0"/>
+                <w:i w:val="0"/>
+                <w:sz w:val="20"/>
+              </w:rPr>
               <w:t xml:space="preserve">Administrator</w:t>
             </w:r>
           </w:p>
@@ -438,18 +477,19 @@
         <w:tc>
           <w:tcPr>
             <w:tcW w:type="dxa" w:w="5904"/>
-          </w:tcPr>
-          <w:p>
-            <w:pPr>
-              <w:spacing w:after="40"/>
-            </w:pPr>
-            <w:r>
-              <w:rPr>
-                <w:b w:val="0"/>
-                <w:i w:val="0"/>
-                <w:sz w:val="20"/>
-              </w:rPr>
-              <w:t xml:space="preserve">Part 13 (Administration) and Part 14 (Troubleshooting)</w:t>
+            <w:shd w:val="clear" w:color="auto" w:fill="F4F7FB"/>
+          </w:tcPr>
+          <w:p>
+            <w:pPr>
+              <w:spacing w:after="40"/>
+            </w:pPr>
+            <w:r>
+              <w:rPr>
+                <w:b w:val="0"/>
+                <w:i w:val="0"/>
+                <w:sz w:val="20"/>
+              </w:rPr>
+              <w:t xml:space="preserve">Part 14 (Administration) and Part 15 (Troubleshooting)</w:t>
             </w:r>
           </w:p>
         </w:tc>
@@ -544,7 +584,7 @@
         <w:pStyle w:val="Heading2"/>
       </w:pPr>
       <w:r>
-        <w:t>What is new in version 1.1</w:t>
+        <w:t>What is new in version 1.2</w:t>
       </w:r>
     </w:p>
     <w:p>
@@ -553,17 +593,10 @@
       </w:pPr>
       <w:r>
         <w:rPr>
-          <w:b/>
-          <w:i w:val="0"/>
-        </w:rPr>
-        <w:t xml:space="preserve">New Part 8, RFQs to quotes.</w:t>
-      </w:r>
-      <w:r>
-        <w:rPr>
           <w:b w:val="0"/>
           <w:i w:val="0"/>
         </w:rPr>
-        <w:t xml:space="preserve"> Read a customer’s request for quote, cost it with your own rules and approve it as an estimator.</w:t>
+        <w:t xml:space="preserve">New Part 12, Tax filing. Prepare a personal or business income tax return for the United States or Canada one question at a time and watch the refund or balance as you go.</w:t>
       </w:r>
     </w:p>
     <w:p>
@@ -572,17 +605,10 @@
       </w:pPr>
       <w:r>
         <w:rPr>
-          <w:b/>
-          <w:i w:val="0"/>
-        </w:rPr>
-        <w:t xml:space="preserve">New Part 9, Counsel.</w:t>
-      </w:r>
-      <w:r>
-        <w:rPr>
           <w:b w:val="0"/>
           <w:i w:val="0"/>
         </w:rPr>
-        <w:t xml:space="preserve"> Legal questions, contract review and drafting. It is an assistant, not a lawyer.</w:t>
+        <w:t xml:space="preserve">Provincial and state tax are included as estimates, along with the earned income credit and education credits. W-2 and T4 slips can be read from a photo.</w:t>
       </w:r>
     </w:p>
     <w:p>
@@ -591,17 +617,22 @@
       </w:pPr>
       <w:r>
         <w:rPr>
-          <w:b/>
-          <w:i w:val="0"/>
-        </w:rPr>
-        <w:t xml:space="preserve">New Part 11, AI bookkeeping.</w:t>
-      </w:r>
-      <w:r>
-        <w:rPr>
           <w:b w:val="0"/>
           <w:i w:val="0"/>
         </w:rPr>
-        <w:t xml:space="preserve"> Sort a bank or card statement into expenses for your approval.</w:t>
+        <w:t xml:space="preserve">Later parts are renumbered: routines are now Part 13, administration Part 14 and troubleshooting Part 15.</w:t>
+      </w:r>
+    </w:p>
+    <w:p>
+      <w:pPr>
+        <w:pStyle w:val="Heading2"/>
+      </w:pPr>
+      <w:r>
+        <w:rPr>
+          <w:b w:val="0"/>
+          <w:i w:val="0"/>
+        </w:rPr>
+        <w:t xml:space="preserve">What was new in version 1.1</w:t>
       </w:r>
     </w:p>
     <w:p>
@@ -610,10 +641,67 @@
       </w:pPr>
       <w:r>
         <w:rPr>
+          <w:b/>
+          <w:i w:val="0"/>
+        </w:rPr>
+        <w:t xml:space="preserve">New Part 8, RFQs to quotes.</w:t>
+      </w:r>
+      <w:r>
+        <w:rPr>
           <w:b w:val="0"/>
           <w:i w:val="0"/>
         </w:rPr>
-        <w:t xml:space="preserve">The left menu now has nine groups, and the routines in Part 12 include the new tabs.</w:t>
+        <w:t xml:space="preserve"> Read a customer’s request for quote, cost it with your own rules and approve it as an estimator.</w:t>
+      </w:r>
+    </w:p>
+    <w:p>
+      <w:pPr>
+        <w:pStyle w:val="ListBullet"/>
+      </w:pPr>
+      <w:r>
+        <w:rPr>
+          <w:b/>
+          <w:i w:val="0"/>
+        </w:rPr>
+        <w:t xml:space="preserve">New Part 9, Counsel.</w:t>
+      </w:r>
+      <w:r>
+        <w:rPr>
+          <w:b w:val="0"/>
+          <w:i w:val="0"/>
+        </w:rPr>
+        <w:t xml:space="preserve"> Legal questions, contract review and drafting. It is an assistant, not a lawyer.</w:t>
+      </w:r>
+    </w:p>
+    <w:p>
+      <w:pPr>
+        <w:pStyle w:val="ListBullet"/>
+      </w:pPr>
+      <w:r>
+        <w:rPr>
+          <w:b/>
+          <w:i w:val="0"/>
+        </w:rPr>
+        <w:t xml:space="preserve">New Part 11, AI bookkeeping.</w:t>
+      </w:r>
+      <w:r>
+        <w:rPr>
+          <w:b w:val="0"/>
+          <w:i w:val="0"/>
+        </w:rPr>
+        <w:t xml:space="preserve"> Sort a bank or card statement into expenses for your approval.</w:t>
+      </w:r>
+    </w:p>
+    <w:p>
+      <w:pPr>
+        <w:pStyle w:val="ListBullet"/>
+      </w:pPr>
+      <w:r>
+        <w:rPr>
+          <w:b w:val="0"/>
+          <w:i w:val="0"/>
+        </w:rPr>
+        <w:t xml:space="preserve">The left menu now has ten groups, and the routines in Part 13 include the new tabs.</w:t>
       </w:r>
     </w:p>
     <w:p>
@@ -1482,7 +1570,7 @@
                 <w:b w:val="0"/>
                 <w:i w:val="0"/>
               </w:rPr>
-              <w:t xml:space="preserve">Once your administrator has set up the scheduled run (Part 13), the agents run automatically every hour. You can also press </w:t>
+              <w:t xml:space="preserve">Once your administrator has set up the scheduled run (Part 14), the agents run automatically every hour. You can also press </w:t>
             </w:r>
             <w:r>
               <w:rPr>
@@ -2319,7 +2407,7 @@
           <w:b w:val="0"/>
           <w:i w:val="0"/>
         </w:rPr>
-        <w:t>On a desktop the menu is always visible. On a phone, open it with the menu button at the top left. Select a group name, or its arrow, to fold that group open or closed. The menu remembers what you chose on this device. It has nine groups:</w:t>
+        <w:t>On a desktop the menu is always visible. On a phone, open it with the menu button at the top left. Select a group name, or its arrow, to fold that group open or closed. The menu remembers what you chose on this device. It has ten groups:</w:t>
       </w:r>
     </w:p>
     <w:tbl>
@@ -2665,7 +2753,7 @@
                 <w:i w:val="0"/>
                 <w:sz w:val="20"/>
               </w:rPr>
-              <w:t>People &amp; money</w:t>
+              <w:t xml:space="preserve">Tax</w:t>
             </w:r>
           </w:p>
         </w:tc>
@@ -2684,7 +2772,7 @@
                 <w:i w:val="0"/>
                 <w:sz w:val="20"/>
               </w:rPr>
-              <w:t>Payroll · QuickBooks Capital</w:t>
+              <w:t xml:space="preserve">Tax filing</w:t>
             </w:r>
           </w:p>
         </w:tc>
@@ -2704,6 +2792,45 @@
                 <w:i w:val="0"/>
                 <w:sz w:val="20"/>
               </w:rPr>
+              <w:t>People &amp; money</w:t>
+            </w:r>
+          </w:p>
+        </w:tc>
+        <w:tc>
+          <w:tcPr>
+            <w:tcW w:type="dxa" w:w="6912"/>
+          </w:tcPr>
+          <w:p>
+            <w:pPr>
+              <w:spacing w:after="40"/>
+            </w:pPr>
+            <w:r>
+              <w:rPr>
+                <w:b w:val="0"/>
+                <w:i w:val="0"/>
+                <w:sz w:val="20"/>
+              </w:rPr>
+              <w:t>Payroll · QuickBooks Capital</w:t>
+            </w:r>
+          </w:p>
+        </w:tc>
+      </w:tr>
+      <w:tr>
+        <w:tc>
+          <w:tcPr>
+            <w:tcW w:type="dxa" w:w="2448"/>
+            <w:shd w:val="clear" w:color="auto" w:fill="F4F7FB"/>
+          </w:tcPr>
+          <w:p>
+            <w:pPr>
+              <w:spacing w:after="40"/>
+            </w:pPr>
+            <w:r>
+              <w:rPr>
+                <w:b w:val="0"/>
+                <w:i w:val="0"/>
+                <w:sz w:val="20"/>
+              </w:rPr>
               <w:t>App</w:t>
             </w:r>
           </w:p>
@@ -2711,6 +2838,7 @@
         <w:tc>
           <w:tcPr>
             <w:tcW w:type="dxa" w:w="6912"/>
+            <w:shd w:val="clear" w:color="auto" w:fill="F4F7FB"/>
           </w:tcPr>
           <w:p>
             <w:pPr>
@@ -8217,7 +8345,7 @@
           <w:b w:val="0"/>
           <w:i w:val="0"/>
         </w:rPr>
-        <w:t xml:space="preserve">With Claude switched on (Part 13), it reads the request text and any PDF or image drawings. Without it, plain rules pick out the parts, quantities, material, operations, due date and certifications. Either way, anything it cannot find is left blank for you to fill in. Other files, such as 3D models, are kept with the RFQ but are not read automatically, and the quote carries a note telling you to check them.</w:t>
+        <w:t xml:space="preserve">With Claude switched on (Part 14), it reads the request text and any PDF or image drawings. Without it, plain rules pick out the parts, quantities, material, operations, due date and certifications. Either way, anything it cannot find is left blank for you to fill in. Other files, such as 3D models, are kept with the RFQ but are not read automatically, and the quote carries a note telling you to check them.</w:t>
       </w:r>
     </w:p>
     <w:p>
@@ -10097,7 +10225,7 @@
                 <w:b w:val="0"/>
                 <w:i w:val="0"/>
               </w:rPr>
-              <w:t xml:space="preserve">If Counsel shows “switched off”, the administrator has not set an Anthropic key (see 13.1). The practice-area guide still works without it.</w:t>
+              <w:t xml:space="preserve">If Counsel shows “switched off”, the administrator has not set an Anthropic key (see 14.1). The practice-area guide still works without it.</w:t>
             </w:r>
           </w:p>
         </w:tc>
@@ -12587,15 +12715,2269 @@
         <w:pStyle w:val="Heading1"/>
       </w:pPr>
       <w:r>
-        <w:t>Part 12 · Standard routines</w:t>
-      </w:r>
+        <w:t>Part 12 · Tax filing</w:t>
+      </w:r>
+    </w:p>
+    <w:p>
+      <w:r>
+        <w:rPr>
+          <w:b w:val="0"/>
+          <w:i w:val="0"/>
+        </w:rPr>
+        <w:t xml:space="preserve">The </w:t>
+      </w:r>
+      <w:r>
+        <w:rPr>
+          <w:b/>
+          <w:i w:val="0"/>
+        </w:rPr>
+        <w:t xml:space="preserve">Tax filing</w:t>
+      </w:r>
+      <w:r>
+        <w:rPr>
+          <w:b w:val="0"/>
+          <w:i w:val="0"/>
+        </w:rPr>
+        <w:t xml:space="preserve"> tab, in its own </w:t>
+      </w:r>
+      <w:r>
+        <w:rPr>
+          <w:b/>
+          <w:i w:val="0"/>
+        </w:rPr>
+        <w:t xml:space="preserve">Tax</w:t>
+      </w:r>
+      <w:r>
+        <w:rPr>
+          <w:b w:val="0"/>
+          <w:i w:val="0"/>
+        </w:rPr>
+        <w:t xml:space="preserve"> group in the left menu, prepares an income tax return for one person at a time for the </w:t>
+      </w:r>
+      <w:r>
+        <w:rPr>
+          <w:b/>
+          <w:i w:val="0"/>
+        </w:rPr>
+        <w:t xml:space="preserve">United States</w:t>
+      </w:r>
+      <w:r>
+        <w:rPr>
+          <w:b w:val="0"/>
+          <w:i w:val="0"/>
+        </w:rPr>
+        <w:t xml:space="preserve"> (Form 1040) or </w:t>
+      </w:r>
+      <w:r>
+        <w:rPr>
+          <w:b/>
+          <w:i w:val="0"/>
+        </w:rPr>
+        <w:t xml:space="preserve">Canada</w:t>
+      </w:r>
+      <w:r>
+        <w:rPr>
+          <w:b w:val="0"/>
+          <w:i w:val="0"/>
+        </w:rPr>
+        <w:t xml:space="preserve"> (T1). You answer plain questions about your year, a panel shows your estimated refund or balance owing as each answer changes, and at the end you get the whole return line by line, with the form line each figure belongs on. Use the figures on the official forms or hand them to a preparer.</w:t>
+      </w:r>
+    </w:p>
+    <w:tbl>
+      <w:tblPr>
+        <w:tblW w:type="auto" w:w="0"/>
+        <w:jc w:val="center"/>
+        <w:tblLook w:firstColumn="1" w:firstRow="1" w:lastColumn="0" w:lastRow="0" w:noHBand="0" w:noVBand="1" w:val="04A0"/>
+      </w:tblPr>
+      <w:tblGrid>
+        <w:gridCol w:w="9360"/>
+      </w:tblGrid>
+      <w:tr>
+        <w:tc>
+          <w:tcPr>
+            <w:tcW w:type="dxa" w:w="9360"/>
+            <w:tcBorders>
+              <w:left w:val="single" w:sz="24" w:color="D97706"/>
+            </w:tcBorders>
+            <w:shd w:val="clear" w:color="auto" w:fill="FFF6E5"/>
+          </w:tcPr>
+          <w:p>
+            <w:pPr>
+              <w:spacing w:after="40"/>
+            </w:pPr>
+            <w:r>
+              <w:rPr>
+                <w:b/>
+                <w:color w:val="D97706"/>
+              </w:rPr>
+              <w:t xml:space="preserve">Caution  </w:t>
+            </w:r>
+            <w:r>
+              <w:rPr>
+                <w:b w:val="0"/>
+                <w:i w:val="0"/>
+              </w:rPr>
+              <w:t xml:space="preserve">The tab </w:t>
+            </w:r>
+            <w:r>
+              <w:rPr>
+                <w:b/>
+                <w:i w:val="0"/>
+              </w:rPr>
+              <w:t xml:space="preserve">prepares and estimates. It does not file anything</w:t>
+            </w:r>
+            <w:r>
+              <w:rPr>
+                <w:b w:val="0"/>
+                <w:i w:val="0"/>
+              </w:rPr>
+              <w:t xml:space="preserve"> with the IRS or the CRA, because electronic filing needs certified software and your own account. It also does not ask for Social Security or Social Insurance numbers.</w:t>
+            </w:r>
+          </w:p>
+        </w:tc>
+      </w:tr>
+    </w:tbl>
+    <w:p>
+      <w:pPr>
+        <w:spacing w:after="40"/>
+      </w:pPr>
     </w:p>
     <w:p>
       <w:pPr>
         <w:pStyle w:val="Heading2"/>
       </w:pPr>
       <w:r>
-        <w:t>12.1 Every morning (about 10 minutes)</w:t>
+        <w:t>12.1 Before you start</w:t>
+      </w:r>
+    </w:p>
+    <w:p>
+      <w:pPr>
+        <w:pStyle w:val="ListBullet"/>
+      </w:pPr>
+      <w:r>
+        <w:rPr>
+          <w:b w:val="0"/>
+          <w:i w:val="0"/>
+        </w:rPr>
+        <w:t xml:space="preserve">Gather your </w:t>
+      </w:r>
+      <w:r>
+        <w:rPr>
+          <w:b/>
+          <w:i w:val="0"/>
+        </w:rPr>
+        <w:t xml:space="preserve">slips</w:t>
+      </w:r>
+      <w:r>
+        <w:rPr>
+          <w:b w:val="0"/>
+          <w:i w:val="0"/>
+        </w:rPr>
+        <w:t xml:space="preserve">: W-2s and 1099s for a U.S. return, or T4s and T5s for a Canadian one.</w:t>
+      </w:r>
+    </w:p>
+    <w:p>
+      <w:pPr>
+        <w:pStyle w:val="ListBullet"/>
+      </w:pPr>
+      <w:r>
+        <w:rPr>
+          <w:b w:val="0"/>
+          <w:i w:val="0"/>
+        </w:rPr>
+        <w:t xml:space="preserve">For a Canadian return, have your last Notice of Assessment for your RRSP room.</w:t>
+      </w:r>
+    </w:p>
+    <w:p>
+      <w:pPr>
+        <w:pStyle w:val="ListBullet"/>
+      </w:pPr>
+      <w:r>
+        <w:rPr>
+          <w:b w:val="0"/>
+          <w:i w:val="0"/>
+        </w:rPr>
+        <w:t xml:space="preserve">Gather the figures for anything you want to deduct: mortgage interest, charity gifts, student loan interest (1098-E), tuition (1098-T or T2202), RRSP or FHSA receipts.</w:t>
+      </w:r>
+    </w:p>
+    <w:p>
+      <w:pPr>
+        <w:pStyle w:val="ListBullet"/>
+      </w:pPr>
+      <w:r>
+        <w:rPr>
+          <w:b w:val="0"/>
+          <w:i w:val="0"/>
+        </w:rPr>
+        <w:t xml:space="preserve">Decide whose return this is. Start a separate return for each person, such as a personal return and a partner’s.</w:t>
+      </w:r>
+    </w:p>
+    <w:p>
+      <w:pPr>
+        <w:pStyle w:val="Heading2"/>
+      </w:pPr>
+      <w:r>
+        <w:t>12.2 Start a return</w:t>
+      </w:r>
+    </w:p>
+    <w:p>
+      <w:pPr>
+        <w:pStyle w:val="ListNumber"/>
+        <w:numPr>
+          <w:ilvl w:val="0"/>
+          <w:numId w:val="30"/>
+        </w:numPr>
+      </w:pPr>
+      <w:r>
+        <w:rPr>
+          <w:b w:val="0"/>
+          <w:i w:val="0"/>
+        </w:rPr>
+        <w:t xml:space="preserve">Open </w:t>
+      </w:r>
+      <w:r>
+        <w:rPr>
+          <w:b/>
+          <w:i w:val="0"/>
+        </w:rPr>
+        <w:t xml:space="preserve">Tax filing</w:t>
+      </w:r>
+      <w:r>
+        <w:rPr>
+          <w:b w:val="0"/>
+          <w:i w:val="0"/>
+        </w:rPr>
+        <w:t xml:space="preserve"> in the </w:t>
+      </w:r>
+      <w:r>
+        <w:rPr>
+          <w:b/>
+          <w:i w:val="0"/>
+        </w:rPr>
+        <w:t xml:space="preserve">Tax</w:t>
+      </w:r>
+      <w:r>
+        <w:rPr>
+          <w:b w:val="0"/>
+          <w:i w:val="0"/>
+        </w:rPr>
+        <w:t xml:space="preserve"> group.</w:t>
+      </w:r>
+    </w:p>
+    <w:p>
+      <w:pPr>
+        <w:pStyle w:val="ListNumber"/>
+        <w:numPr>
+          <w:ilvl w:val="0"/>
+          <w:numId w:val="30"/>
+        </w:numPr>
+      </w:pPr>
+      <w:r>
+        <w:rPr>
+          <w:b w:val="0"/>
+          <w:i w:val="0"/>
+        </w:rPr>
+        <w:t xml:space="preserve">Press </w:t>
+      </w:r>
+      <w:r>
+        <w:rPr>
+          <w:b/>
+          <w:i w:val="0"/>
+        </w:rPr>
+        <w:t xml:space="preserve">Start a return</w:t>
+      </w:r>
+      <w:r>
+        <w:rPr>
+          <w:b w:val="0"/>
+          <w:i w:val="0"/>
+        </w:rPr>
+        <w:t xml:space="preserve">.</w:t>
+      </w:r>
+    </w:p>
+    <w:p>
+      <w:pPr>
+        <w:pStyle w:val="ListNumber"/>
+        <w:numPr>
+          <w:ilvl w:val="0"/>
+          <w:numId w:val="30"/>
+        </w:numPr>
+      </w:pPr>
+      <w:r>
+        <w:rPr>
+          <w:b w:val="0"/>
+          <w:i w:val="0"/>
+        </w:rPr>
+        <w:t xml:space="preserve">Choose </w:t>
+      </w:r>
+      <w:r>
+        <w:rPr>
+          <w:b/>
+          <w:i w:val="0"/>
+        </w:rPr>
+        <w:t xml:space="preserve">United States (Form 1040)</w:t>
+      </w:r>
+      <w:r>
+        <w:rPr>
+          <w:b w:val="0"/>
+          <w:i w:val="0"/>
+        </w:rPr>
+        <w:t xml:space="preserve"> or </w:t>
+      </w:r>
+      <w:r>
+        <w:rPr>
+          <w:b/>
+          <w:i w:val="0"/>
+        </w:rPr>
+        <w:t xml:space="preserve">Canada (T1)</w:t>
+      </w:r>
+      <w:r>
+        <w:rPr>
+          <w:b w:val="0"/>
+          <w:i w:val="0"/>
+        </w:rPr>
+        <w:t xml:space="preserve">, type the person’s name, and press </w:t>
+      </w:r>
+      <w:r>
+        <w:rPr>
+          <w:b/>
+          <w:i w:val="0"/>
+        </w:rPr>
+        <w:t xml:space="preserve">Start</w:t>
+      </w:r>
+      <w:r>
+        <w:rPr>
+          <w:b w:val="0"/>
+          <w:i w:val="0"/>
+        </w:rPr>
+        <w:t xml:space="preserve">.</w:t>
+      </w:r>
+    </w:p>
+    <w:p>
+      <w:pPr>
+        <w:pStyle w:val="ListNumber"/>
+        <w:numPr>
+          <w:ilvl w:val="0"/>
+          <w:numId w:val="30"/>
+        </w:numPr>
+      </w:pPr>
+      <w:r>
+        <w:rPr>
+          <w:b w:val="0"/>
+          <w:i w:val="0"/>
+        </w:rPr>
+        <w:t xml:space="preserve">Answer each page and press </w:t>
+      </w:r>
+      <w:r>
+        <w:rPr>
+          <w:b/>
+          <w:i w:val="0"/>
+        </w:rPr>
+        <w:t xml:space="preserve">Continue</w:t>
+      </w:r>
+      <w:r>
+        <w:rPr>
+          <w:b w:val="0"/>
+          <w:i w:val="0"/>
+        </w:rPr>
+        <w:t xml:space="preserve">. </w:t>
+      </w:r>
+      <w:r>
+        <w:rPr>
+          <w:b/>
+          <w:i w:val="0"/>
+        </w:rPr>
+        <w:t xml:space="preserve">Back</w:t>
+      </w:r>
+      <w:r>
+        <w:rPr>
+          <w:b w:val="0"/>
+          <w:i w:val="0"/>
+        </w:rPr>
+        <w:t xml:space="preserve"> and the step list on the left let you go to any page. Your answers save as you type, so you can close the tab and come back to the same return.</w:t>
+      </w:r>
+    </w:p>
+    <w:p>
+      <w:pPr>
+        <w:pStyle w:val="Heading2"/>
+      </w:pPr>
+      <w:r>
+        <w:t>12.3 The interview, page by page</w:t>
+      </w:r>
+    </w:p>
+    <w:tbl>
+      <w:tblPr>
+        <w:tblW w:type="auto" w:w="0"/>
+        <w:jc w:val="center"/>
+        <w:tblBorders>
+          <w:top w:val="single" w:sz="4" w:space="0" w:color="C9D1DC"/>
+          <w:left w:val="single" w:sz="4" w:space="0" w:color="C9D1DC"/>
+          <w:bottom w:val="single" w:sz="4" w:space="0" w:color="C9D1DC"/>
+          <w:right w:val="single" w:sz="4" w:space="0" w:color="C9D1DC"/>
+          <w:insideH w:val="single" w:sz="4" w:space="0" w:color="C9D1DC"/>
+          <w:insideV w:val="single" w:sz="4" w:space="0" w:color="C9D1DC"/>
+        </w:tblBorders>
+        <w:tblLook w:firstColumn="1" w:firstRow="1" w:lastColumn="0" w:lastRow="0" w:noHBand="0" w:noVBand="1" w:val="04A0"/>
+      </w:tblPr>
+      <w:tblGrid>
+        <w:gridCol w:w="1800"/>
+        <w:gridCol w:w="5300"/>
+        <w:gridCol w:w="2260"/>
+      </w:tblGrid>
+      <w:tr>
+        <w:trPr>
+          <w:tblHeader w:val="true"/>
+        </w:trPr>
+        <w:tc>
+          <w:tcPr>
+            <w:tcW w:type="dxa" w:w="1800"/>
+            <w:shd w:val="clear" w:color="auto" w:fill="0F2A4A"/>
+          </w:tcPr>
+          <w:p>
+            <w:r>
+              <w:rPr>
+                <w:b/>
+                <w:color w:val="FFFFFF"/>
+                <w:sz w:val="20"/>
+              </w:rPr>
+              <w:t>Page</w:t>
+            </w:r>
+          </w:p>
+        </w:tc>
+        <w:tc>
+          <w:tcPr>
+            <w:tcW w:type="dxa" w:w="5300"/>
+            <w:shd w:val="clear" w:color="auto" w:fill="0F2A4A"/>
+          </w:tcPr>
+          <w:p>
+            <w:r>
+              <w:rPr>
+                <w:b/>
+                <w:color w:val="FFFFFF"/>
+                <w:sz w:val="20"/>
+              </w:rPr>
+              <w:t>What to enter</w:t>
+            </w:r>
+          </w:p>
+        </w:tc>
+        <w:tc>
+          <w:tcPr>
+            <w:tcW w:type="dxa" w:w="2260"/>
+            <w:shd w:val="clear" w:color="auto" w:fill="0F2A4A"/>
+          </w:tcPr>
+          <w:p>
+            <w:r>
+              <w:rPr>
+                <w:b/>
+                <w:color w:val="FFFFFF"/>
+                <w:sz w:val="20"/>
+              </w:rPr>
+              <w:t>Where it comes from</w:t>
+            </w:r>
+          </w:p>
+        </w:tc>
+      </w:tr>
+      <w:tr>
+        <w:tc>
+          <w:tcPr>
+            <w:tcW w:type="dxa" w:w="1800"/>
+          </w:tcPr>
+          <w:p>
+            <w:pPr>
+              <w:spacing w:after="40"/>
+            </w:pPr>
+            <w:r>
+              <w:rPr>
+                <w:b/>
+                <w:i w:val="0"/>
+                <w:sz w:val="20"/>
+              </w:rPr>
+              <w:t xml:space="preserve">About you</w:t>
+            </w:r>
+          </w:p>
+        </w:tc>
+        <w:tc>
+          <w:tcPr>
+            <w:tcW w:type="dxa" w:w="5300"/>
+          </w:tcPr>
+          <w:p>
+            <w:pPr>
+              <w:spacing w:after="40"/>
+            </w:pPr>
+            <w:r>
+              <w:rPr>
+                <w:b w:val="0"/>
+                <w:i w:val="0"/>
+                <w:sz w:val="20"/>
+              </w:rPr>
+              <w:t xml:space="preserve">United States: filing status, anyone 65 or older or blind, children under 17, other dependents and children for the earned income credit. Canada: province or territory on December 31, whether you are 65 or older, spouse and spouse’s income.</w:t>
+            </w:r>
+          </w:p>
+        </w:tc>
+        <w:tc>
+          <w:tcPr>
+            <w:tcW w:type="dxa" w:w="2260"/>
+          </w:tcPr>
+          <w:p>
+            <w:pPr>
+              <w:spacing w:after="40"/>
+            </w:pPr>
+            <w:r>
+              <w:rPr>
+                <w:b w:val="0"/>
+                <w:i w:val="0"/>
+                <w:sz w:val="20"/>
+              </w:rPr>
+              <w:t xml:space="preserve">Your records</w:t>
+            </w:r>
+          </w:p>
+        </w:tc>
+      </w:tr>
+      <w:tr>
+        <w:tc>
+          <w:tcPr>
+            <w:tcW w:type="dxa" w:w="1800"/>
+            <w:shd w:val="clear" w:color="auto" w:fill="F4F7FB"/>
+          </w:tcPr>
+          <w:p>
+            <w:pPr>
+              <w:spacing w:after="40"/>
+            </w:pPr>
+            <w:r>
+              <w:rPr>
+                <w:b/>
+                <w:i w:val="0"/>
+                <w:sz w:val="20"/>
+              </w:rPr>
+              <w:t xml:space="preserve">Job income</w:t>
+            </w:r>
+          </w:p>
+        </w:tc>
+        <w:tc>
+          <w:tcPr>
+            <w:tcW w:type="dxa" w:w="5300"/>
+            <w:shd w:val="clear" w:color="auto" w:fill="F4F7FB"/>
+          </w:tcPr>
+          <w:p>
+            <w:pPr>
+              <w:spacing w:after="40"/>
+            </w:pPr>
+            <w:r>
+              <w:rPr>
+                <w:b w:val="0"/>
+                <w:i w:val="0"/>
+                <w:sz w:val="20"/>
+              </w:rPr>
+              <w:t xml:space="preserve">US: wages and tax withheld, all W-2s added together. Canada: employment income, tax deducted, CPP, EI and union dues, all T4s added together.</w:t>
+            </w:r>
+          </w:p>
+        </w:tc>
+        <w:tc>
+          <w:tcPr>
+            <w:tcW w:type="dxa" w:w="2260"/>
+            <w:shd w:val="clear" w:color="auto" w:fill="F4F7FB"/>
+          </w:tcPr>
+          <w:p>
+            <w:pPr>
+              <w:spacing w:after="40"/>
+            </w:pPr>
+            <w:r>
+              <w:rPr>
+                <w:b w:val="0"/>
+                <w:i w:val="0"/>
+                <w:sz w:val="20"/>
+              </w:rPr>
+              <w:t xml:space="preserve">W-2 boxes 1 and 2. T4 boxes 14, 22, 16, 18 and 44. Or upload the slip (12.4).</w:t>
+            </w:r>
+          </w:p>
+        </w:tc>
+      </w:tr>
+      <w:tr>
+        <w:tc>
+          <w:tcPr>
+            <w:tcW w:type="dxa" w:w="1800"/>
+          </w:tcPr>
+          <w:p>
+            <w:pPr>
+              <w:spacing w:after="40"/>
+            </w:pPr>
+            <w:r>
+              <w:rPr>
+                <w:b/>
+                <w:i w:val="0"/>
+                <w:sz w:val="20"/>
+              </w:rPr>
+              <w:t xml:space="preserve">Investments</w:t>
+            </w:r>
+          </w:p>
+        </w:tc>
+        <w:tc>
+          <w:tcPr>
+            <w:tcW w:type="dxa" w:w="5300"/>
+          </w:tcPr>
+          <w:p>
+            <w:pPr>
+              <w:spacing w:after="40"/>
+            </w:pPr>
+            <w:r>
+              <w:rPr>
+                <w:b w:val="0"/>
+                <w:i w:val="0"/>
+                <w:sz w:val="20"/>
+              </w:rPr>
+              <w:t xml:space="preserve">Interest, dividends, capital gains or losses and other income.</w:t>
+            </w:r>
+          </w:p>
+        </w:tc>
+        <w:tc>
+          <w:tcPr>
+            <w:tcW w:type="dxa" w:w="2260"/>
+          </w:tcPr>
+          <w:p>
+            <w:pPr>
+              <w:spacing w:after="40"/>
+            </w:pPr>
+            <w:r>
+              <w:rPr>
+                <w:b w:val="0"/>
+                <w:i w:val="0"/>
+                <w:sz w:val="20"/>
+              </w:rPr>
+              <w:t xml:space="preserve">1099-INT, 1099-DIV, 1099-B. T5, T3 and T5008.</w:t>
+            </w:r>
+          </w:p>
+        </w:tc>
+      </w:tr>
+      <w:tr>
+        <w:tc>
+          <w:tcPr>
+            <w:tcW w:type="dxa" w:w="1800"/>
+            <w:shd w:val="clear" w:color="auto" w:fill="F4F7FB"/>
+          </w:tcPr>
+          <w:p>
+            <w:pPr>
+              <w:spacing w:after="40"/>
+            </w:pPr>
+            <w:r>
+              <w:rPr>
+                <w:b/>
+                <w:i w:val="0"/>
+                <w:sz w:val="20"/>
+              </w:rPr>
+              <w:t xml:space="preserve">Self-employment</w:t>
+            </w:r>
+          </w:p>
+        </w:tc>
+        <w:tc>
+          <w:tcPr>
+            <w:tcW w:type="dxa" w:w="5300"/>
+            <w:shd w:val="clear" w:color="auto" w:fill="F4F7FB"/>
+          </w:tcPr>
+          <w:p>
+            <w:pPr>
+              <w:spacing w:after="40"/>
+            </w:pPr>
+            <w:r>
+              <w:rPr>
+                <w:b w:val="0"/>
+                <w:i w:val="0"/>
+                <w:sz w:val="20"/>
+              </w:rPr>
+              <w:t xml:space="preserve">Total business income and total business expenses for the year.</w:t>
+            </w:r>
+          </w:p>
+        </w:tc>
+        <w:tc>
+          <w:tcPr>
+            <w:tcW w:type="dxa" w:w="2260"/>
+            <w:shd w:val="clear" w:color="auto" w:fill="F4F7FB"/>
+          </w:tcPr>
+          <w:p>
+            <w:pPr>
+              <w:spacing w:after="40"/>
+            </w:pPr>
+            <w:r>
+              <w:rPr>
+                <w:b w:val="0"/>
+                <w:i w:val="0"/>
+                <w:sz w:val="20"/>
+              </w:rPr>
+              <w:t xml:space="preserve">Your books. The Insights and Banking tabs help.</w:t>
+            </w:r>
+          </w:p>
+        </w:tc>
+      </w:tr>
+      <w:tr>
+        <w:tc>
+          <w:tcPr>
+            <w:tcW w:type="dxa" w:w="1800"/>
+          </w:tcPr>
+          <w:p>
+            <w:pPr>
+              <w:spacing w:after="40"/>
+            </w:pPr>
+            <w:r>
+              <w:rPr>
+                <w:b/>
+                <w:i w:val="0"/>
+                <w:sz w:val="20"/>
+              </w:rPr>
+              <w:t xml:space="preserve">Deductions and credits</w:t>
+            </w:r>
+          </w:p>
+        </w:tc>
+        <w:tc>
+          <w:tcPr>
+            <w:tcW w:type="dxa" w:w="5300"/>
+          </w:tcPr>
+          <w:p>
+            <w:pPr>
+              <w:spacing w:after="40"/>
+            </w:pPr>
+            <w:r>
+              <w:rPr>
+                <w:b w:val="0"/>
+                <w:i w:val="0"/>
+                <w:sz w:val="20"/>
+              </w:rPr>
+              <w:t xml:space="preserve">US: student loan interest, education expenses, itemized deductions and other adjustments. Canada: RRSP and FHSA, child care, tuition, donations.</w:t>
+            </w:r>
+          </w:p>
+        </w:tc>
+        <w:tc>
+          <w:tcPr>
+            <w:tcW w:type="dxa" w:w="2260"/>
+          </w:tcPr>
+          <w:p>
+            <w:pPr>
+              <w:spacing w:after="40"/>
+            </w:pPr>
+            <w:r>
+              <w:rPr>
+                <w:b w:val="0"/>
+                <w:i w:val="0"/>
+                <w:sz w:val="20"/>
+              </w:rPr>
+              <w:t xml:space="preserve">Receipts, 1098-E, 1098-T, T2202</w:t>
+            </w:r>
+          </w:p>
+        </w:tc>
+      </w:tr>
+      <w:tr>
+        <w:tc>
+          <w:tcPr>
+            <w:tcW w:type="dxa" w:w="1800"/>
+            <w:shd w:val="clear" w:color="auto" w:fill="F4F7FB"/>
+          </w:tcPr>
+          <w:p>
+            <w:pPr>
+              <w:spacing w:after="40"/>
+            </w:pPr>
+            <w:r>
+              <w:rPr>
+                <w:b/>
+                <w:i w:val="0"/>
+                <w:sz w:val="20"/>
+              </w:rPr>
+              <w:t xml:space="preserve">Payments</w:t>
+            </w:r>
+          </w:p>
+        </w:tc>
+        <w:tc>
+          <w:tcPr>
+            <w:tcW w:type="dxa" w:w="5300"/>
+            <w:shd w:val="clear" w:color="auto" w:fill="F4F7FB"/>
+          </w:tcPr>
+          <w:p>
+            <w:pPr>
+              <w:spacing w:after="40"/>
+            </w:pPr>
+            <w:r>
+              <w:rPr>
+                <w:b w:val="0"/>
+                <w:i w:val="0"/>
+                <w:sz w:val="20"/>
+              </w:rPr>
+              <w:t xml:space="preserve">Tax you already paid: other withholding, estimated tax payments or instalments.</w:t>
+            </w:r>
+          </w:p>
+        </w:tc>
+        <w:tc>
+          <w:tcPr>
+            <w:tcW w:type="dxa" w:w="2260"/>
+            <w:shd w:val="clear" w:color="auto" w:fill="F4F7FB"/>
+          </w:tcPr>
+          <w:p>
+            <w:pPr>
+              <w:spacing w:after="40"/>
+            </w:pPr>
+            <w:r>
+              <w:rPr>
+                <w:b w:val="0"/>
+                <w:i w:val="0"/>
+                <w:sz w:val="20"/>
+              </w:rPr>
+              <w:t xml:space="preserve">Bank records and last year’s return</w:t>
+            </w:r>
+          </w:p>
+        </w:tc>
+      </w:tr>
+      <w:tr>
+        <w:tc>
+          <w:tcPr>
+            <w:tcW w:type="dxa" w:w="1800"/>
+          </w:tcPr>
+          <w:p>
+            <w:pPr>
+              <w:spacing w:after="40"/>
+            </w:pPr>
+            <w:r>
+              <w:rPr>
+                <w:b/>
+                <w:i w:val="0"/>
+                <w:sz w:val="20"/>
+              </w:rPr>
+              <w:t xml:space="preserve">Your state (US)</w:t>
+            </w:r>
+          </w:p>
+        </w:tc>
+        <w:tc>
+          <w:tcPr>
+            <w:tcW w:type="dxa" w:w="5300"/>
+          </w:tcPr>
+          <w:p>
+            <w:pPr>
+              <w:spacing w:after="40"/>
+            </w:pPr>
+            <w:r>
+              <w:rPr>
+                <w:b w:val="0"/>
+                <w:i w:val="0"/>
+                <w:sz w:val="20"/>
+              </w:rPr>
+              <w:t xml:space="preserve">The state you lived in on December 31, and state tax withheld or paid.</w:t>
+            </w:r>
+          </w:p>
+        </w:tc>
+        <w:tc>
+          <w:tcPr>
+            <w:tcW w:type="dxa" w:w="2260"/>
+          </w:tcPr>
+          <w:p>
+            <w:pPr>
+              <w:spacing w:after="40"/>
+            </w:pPr>
+            <w:r>
+              <w:rPr>
+                <w:b w:val="0"/>
+                <w:i w:val="0"/>
+                <w:sz w:val="20"/>
+              </w:rPr>
+              <w:t xml:space="preserve">W-2 box 17</w:t>
+            </w:r>
+          </w:p>
+        </w:tc>
+      </w:tr>
+    </w:tbl>
+    <w:p>
+      <w:pPr>
+        <w:spacing w:after="40"/>
+      </w:pPr>
+    </w:p>
+    <w:tbl>
+      <w:tblPr>
+        <w:tblW w:type="auto" w:w="0"/>
+        <w:jc w:val="center"/>
+        <w:tblLook w:firstColumn="1" w:firstRow="1" w:lastColumn="0" w:lastRow="0" w:noHBand="0" w:noVBand="1" w:val="04A0"/>
+      </w:tblPr>
+      <w:tblGrid>
+        <w:gridCol w:w="9360"/>
+      </w:tblGrid>
+      <w:tr>
+        <w:tc>
+          <w:tcPr>
+            <w:tcW w:type="dxa" w:w="9360"/>
+            <w:tcBorders>
+              <w:left w:val="single" w:sz="24" w:color="1D4ED8"/>
+            </w:tcBorders>
+            <w:shd w:val="clear" w:color="auto" w:fill="EAF1FF"/>
+          </w:tcPr>
+          <w:p>
+            <w:pPr>
+              <w:spacing w:after="40"/>
+            </w:pPr>
+            <w:r>
+              <w:rPr>
+                <w:b/>
+                <w:color w:val="1D4ED8"/>
+              </w:rPr>
+              <w:t xml:space="preserve">Tip  </w:t>
+            </w:r>
+            <w:r>
+              <w:rPr>
+                <w:b w:val="0"/>
+                <w:i w:val="0"/>
+              </w:rPr>
+              <w:t xml:space="preserve">Use a </w:t>
+            </w:r>
+            <w:r>
+              <w:rPr>
+                <w:b/>
+                <w:i w:val="0"/>
+              </w:rPr>
+              <w:t xml:space="preserve">minus sign</w:t>
+            </w:r>
+            <w:r>
+              <w:rPr>
+                <w:b w:val="0"/>
+                <w:i w:val="0"/>
+              </w:rPr>
+              <w:t xml:space="preserve"> for a loss, for example a capital loss. Leave a box empty if it does not apply. You never have to enter a zero.</w:t>
+            </w:r>
+          </w:p>
+        </w:tc>
+      </w:tr>
+    </w:tbl>
+    <w:p>
+      <w:pPr>
+        <w:spacing w:after="40"/>
+      </w:pPr>
+    </w:p>
+    <w:p>
+      <w:pPr>
+        <w:pStyle w:val="Heading2"/>
+      </w:pPr>
+      <w:r>
+        <w:t>12.4 Upload a W-2 or T4</w:t>
+      </w:r>
+    </w:p>
+    <w:p>
+      <w:r>
+        <w:rPr>
+          <w:b w:val="0"/>
+          <w:i w:val="0"/>
+        </w:rPr>
+        <w:t xml:space="preserve">On the job-income page, </w:t>
+      </w:r>
+      <w:r>
+        <w:rPr>
+          <w:b/>
+          <w:i w:val="0"/>
+        </w:rPr>
+        <w:t xml:space="preserve">Upload W-2</w:t>
+      </w:r>
+      <w:r>
+        <w:rPr>
+          <w:b w:val="0"/>
+          <w:i w:val="0"/>
+        </w:rPr>
+        <w:t xml:space="preserve"> (United States) or </w:t>
+      </w:r>
+      <w:r>
+        <w:rPr>
+          <w:b/>
+          <w:i w:val="0"/>
+        </w:rPr>
+        <w:t xml:space="preserve">Upload T4</w:t>
+      </w:r>
+      <w:r>
+        <w:rPr>
+          <w:b w:val="0"/>
+          <w:i w:val="0"/>
+        </w:rPr>
+        <w:t xml:space="preserve"> (Canada) reads the boxes from a photo or PDF so you do not type them.</w:t>
+      </w:r>
+    </w:p>
+    <w:p>
+      <w:pPr>
+        <w:pStyle w:val="ListNumber"/>
+        <w:numPr>
+          <w:ilvl w:val="0"/>
+          <w:numId w:val="31"/>
+        </w:numPr>
+      </w:pPr>
+      <w:r>
+        <w:rPr>
+          <w:b w:val="0"/>
+          <w:i w:val="0"/>
+        </w:rPr>
+        <w:t xml:space="preserve">Press </w:t>
+      </w:r>
+      <w:r>
+        <w:rPr>
+          <w:b/>
+          <w:i w:val="0"/>
+        </w:rPr>
+        <w:t xml:space="preserve">Upload W-2</w:t>
+      </w:r>
+      <w:r>
+        <w:rPr>
+          <w:b w:val="0"/>
+          <w:i w:val="0"/>
+        </w:rPr>
+        <w:t xml:space="preserve"> or </w:t>
+      </w:r>
+      <w:r>
+        <w:rPr>
+          <w:b/>
+          <w:i w:val="0"/>
+        </w:rPr>
+        <w:t xml:space="preserve">Upload T4</w:t>
+      </w:r>
+      <w:r>
+        <w:rPr>
+          <w:b w:val="0"/>
+          <w:i w:val="0"/>
+        </w:rPr>
+        <w:t xml:space="preserve"> and choose a PNG, JPG or PDF up to 4 MB. A straight-on, well-lit photo works best.</w:t>
+      </w:r>
+    </w:p>
+    <w:p>
+      <w:pPr>
+        <w:pStyle w:val="ListNumber"/>
+        <w:numPr>
+          <w:ilvl w:val="0"/>
+          <w:numId w:val="31"/>
+        </w:numPr>
+      </w:pPr>
+      <w:r>
+        <w:rPr>
+          <w:b w:val="0"/>
+          <w:i w:val="0"/>
+        </w:rPr>
+        <w:t xml:space="preserve">Check the amounts under </w:t>
+      </w:r>
+      <w:r>
+        <w:rPr>
+          <w:b/>
+          <w:i w:val="0"/>
+        </w:rPr>
+        <w:t xml:space="preserve">Check what we read</w:t>
+      </w:r>
+      <w:r>
+        <w:rPr>
+          <w:b w:val="0"/>
+          <w:i w:val="0"/>
+        </w:rPr>
+        <w:t xml:space="preserve">. You can correct any number. A </w:t>
+      </w:r>
+      <w:r>
+        <w:rPr>
+          <w:b/>
+          <w:i w:val="0"/>
+        </w:rPr>
+        <w:t xml:space="preserve">Check</w:t>
+      </w:r>
+      <w:r>
+        <w:rPr>
+          <w:b w:val="0"/>
+          <w:i w:val="0"/>
+        </w:rPr>
+        <w:t xml:space="preserve"> warning means something looks wrong, for example tax withheld larger than wages.</w:t>
+      </w:r>
+    </w:p>
+    <w:p>
+      <w:pPr>
+        <w:pStyle w:val="ListNumber"/>
+        <w:numPr>
+          <w:ilvl w:val="0"/>
+          <w:numId w:val="31"/>
+        </w:numPr>
+      </w:pPr>
+      <w:r>
+        <w:rPr>
+          <w:b w:val="0"/>
+          <w:i w:val="0"/>
+        </w:rPr>
+        <w:t xml:space="preserve">Press </w:t>
+      </w:r>
+      <w:r>
+        <w:rPr>
+          <w:b/>
+          <w:i w:val="0"/>
+        </w:rPr>
+        <w:t xml:space="preserve">Add to my return</w:t>
+      </w:r>
+      <w:r>
+        <w:rPr>
+          <w:b w:val="0"/>
+          <w:i w:val="0"/>
+        </w:rPr>
+        <w:t xml:space="preserve">. The amounts are </w:t>
+      </w:r>
+      <w:r>
+        <w:rPr>
+          <w:b/>
+          <w:i w:val="0"/>
+        </w:rPr>
+        <w:t xml:space="preserve">added</w:t>
+      </w:r>
+      <w:r>
+        <w:rPr>
+          <w:b w:val="0"/>
+          <w:i w:val="0"/>
+        </w:rPr>
+        <w:t xml:space="preserve"> to what is already entered.</w:t>
+      </w:r>
+    </w:p>
+    <w:p>
+      <w:pPr>
+        <w:pStyle w:val="ListNumber"/>
+        <w:numPr>
+          <w:ilvl w:val="0"/>
+          <w:numId w:val="31"/>
+        </w:numPr>
+      </w:pPr>
+      <w:r>
+        <w:rPr>
+          <w:b w:val="0"/>
+          <w:i w:val="0"/>
+        </w:rPr>
+        <w:t xml:space="preserve">Had more than one job? Press </w:t>
+      </w:r>
+      <w:r>
+        <w:rPr>
+          <w:b/>
+          <w:i w:val="0"/>
+        </w:rPr>
+        <w:t xml:space="preserve">Upload another W-2</w:t>
+      </w:r>
+      <w:r>
+        <w:rPr>
+          <w:b w:val="0"/>
+          <w:i w:val="0"/>
+        </w:rPr>
+        <w:t xml:space="preserve"> (or T4). Each slip adds to the totals.</w:t>
+      </w:r>
+    </w:p>
+    <w:tbl>
+      <w:tblPr>
+        <w:tblW w:type="auto" w:w="0"/>
+        <w:jc w:val="center"/>
+        <w:tblLook w:firstColumn="1" w:firstRow="1" w:lastColumn="0" w:lastRow="0" w:noHBand="0" w:noVBand="1" w:val="04A0"/>
+      </w:tblPr>
+      <w:tblGrid>
+        <w:gridCol w:w="9360"/>
+      </w:tblGrid>
+      <w:tr>
+        <w:tc>
+          <w:tcPr>
+            <w:tcW w:type="dxa" w:w="9360"/>
+            <w:tcBorders>
+              <w:left w:val="single" w:sz="24" w:color="D97706"/>
+            </w:tcBorders>
+            <w:shd w:val="clear" w:color="auto" w:fill="FFF6E5"/>
+          </w:tcPr>
+          <w:p>
+            <w:pPr>
+              <w:spacing w:after="40"/>
+            </w:pPr>
+            <w:r>
+              <w:rPr>
+                <w:b/>
+                <w:color w:val="D97706"/>
+              </w:rPr>
+              <w:t xml:space="preserve">Caution  </w:t>
+            </w:r>
+            <w:r>
+              <w:rPr>
+                <w:b w:val="0"/>
+                <w:i w:val="0"/>
+              </w:rPr>
+              <w:t xml:space="preserve">Claude reads the slip, so </w:t>
+            </w:r>
+            <w:r>
+              <w:rPr>
+                <w:b/>
+                <w:i w:val="0"/>
+              </w:rPr>
+              <w:t xml:space="preserve">always compare the numbers with the paper slip</w:t>
+            </w:r>
+            <w:r>
+              <w:rPr>
+                <w:b w:val="0"/>
+                <w:i w:val="0"/>
+              </w:rPr>
+              <w:t xml:space="preserve"> before you add them. The file is sent to Claude to be read and is not stored. This needs the Anthropic key to be set (Part 14, 14.1). Without it, type the boxes in.</w:t>
+            </w:r>
+          </w:p>
+        </w:tc>
+      </w:tr>
+    </w:tbl>
+    <w:p>
+      <w:pPr>
+        <w:spacing w:after="40"/>
+      </w:pPr>
+    </w:p>
+    <w:p>
+      <w:pPr>
+        <w:pStyle w:val="Heading2"/>
+      </w:pPr>
+      <w:r>
+        <w:t>12.5 The refund meter</w:t>
+      </w:r>
+    </w:p>
+    <w:p>
+      <w:r>
+        <w:rPr>
+          <w:b w:val="0"/>
+          <w:i w:val="0"/>
+        </w:rPr>
+        <w:t xml:space="preserve">The panel on the right updates as you type. It shows your </w:t>
+      </w:r>
+      <w:r>
+        <w:rPr>
+          <w:b/>
+          <w:i w:val="0"/>
+        </w:rPr>
+        <w:t xml:space="preserve">estimated refund</w:t>
+      </w:r>
+      <w:r>
+        <w:rPr>
+          <w:b w:val="0"/>
+          <w:i w:val="0"/>
+        </w:rPr>
+        <w:t xml:space="preserve"> (green) or </w:t>
+      </w:r>
+      <w:r>
+        <w:rPr>
+          <w:b/>
+          <w:i w:val="0"/>
+        </w:rPr>
+        <w:t xml:space="preserve">amount owing</w:t>
+      </w:r>
+      <w:r>
+        <w:rPr>
+          <w:b w:val="0"/>
+          <w:i w:val="0"/>
+        </w:rPr>
+        <w:t xml:space="preserve"> (red), then total income, taxable income, total tax, what you have already paid, your </w:t>
+      </w:r>
+      <w:r>
+        <w:rPr>
+          <w:b/>
+          <w:i w:val="0"/>
+        </w:rPr>
+        <w:t xml:space="preserve">average rate</w:t>
+      </w:r>
+      <w:r>
+        <w:rPr>
+          <w:b w:val="0"/>
+          <w:i w:val="0"/>
+        </w:rPr>
+        <w:t xml:space="preserve"> and the rate on your </w:t>
+      </w:r>
+      <w:r>
+        <w:rPr>
+          <w:b/>
+          <w:i w:val="0"/>
+        </w:rPr>
+        <w:t xml:space="preserve">next dollar</w:t>
+      </w:r>
+      <w:r>
+        <w:rPr>
+          <w:b w:val="0"/>
+          <w:i w:val="0"/>
+        </w:rPr>
+        <w:t xml:space="preserve"> of income. The next-dollar rate is the rate you would pay on an extra dollar of income, so it tells you what a deduction or a contribution is worth.</w:t>
+      </w:r>
+    </w:p>
+    <w:p>
+      <w:pPr>
+        <w:pStyle w:val="Heading2"/>
+      </w:pPr>
+      <w:r>
+        <w:t>12.6 Review</w:t>
+      </w:r>
+    </w:p>
+    <w:p>
+      <w:r>
+        <w:rPr>
+          <w:b w:val="0"/>
+          <w:i w:val="0"/>
+        </w:rPr>
+        <w:t xml:space="preserve">The </w:t>
+      </w:r>
+      <w:r>
+        <w:rPr>
+          <w:b/>
+          <w:i w:val="0"/>
+        </w:rPr>
+        <w:t xml:space="preserve">Review</w:t>
+      </w:r>
+      <w:r>
+        <w:rPr>
+          <w:b w:val="0"/>
+          <w:i w:val="0"/>
+        </w:rPr>
+        <w:t xml:space="preserve"> page checks your answers and lists what to look at. A </w:t>
+      </w:r>
+      <w:r>
+        <w:rPr>
+          <w:b/>
+          <w:i w:val="0"/>
+        </w:rPr>
+        <w:t xml:space="preserve">Check</w:t>
+      </w:r>
+      <w:r>
+        <w:rPr>
+          <w:b w:val="0"/>
+          <w:i w:val="0"/>
+        </w:rPr>
+        <w:t xml:space="preserve"> is worth fixing before you file. A </w:t>
+      </w:r>
+      <w:r>
+        <w:rPr>
+          <w:b/>
+          <w:i w:val="0"/>
+        </w:rPr>
+        <w:t xml:space="preserve">Tip</w:t>
+      </w:r>
+      <w:r>
+        <w:rPr>
+          <w:b w:val="0"/>
+          <w:i w:val="0"/>
+        </w:rPr>
+        <w:t xml:space="preserve"> is a way to save tax, such as an RRSP contribution, paying estimated tax next year or changing your paycheque withholding. A </w:t>
+      </w:r>
+      <w:r>
+        <w:rPr>
+          <w:b/>
+          <w:i w:val="0"/>
+        </w:rPr>
+        <w:t xml:space="preserve">Note</w:t>
+      </w:r>
+      <w:r>
+        <w:rPr>
+          <w:b w:val="0"/>
+          <w:i w:val="0"/>
+        </w:rPr>
+        <w:t xml:space="preserve"> explains a result, such as a deduction limit. The same page lists </w:t>
+      </w:r>
+      <w:r>
+        <w:rPr>
+          <w:b/>
+          <w:i w:val="0"/>
+        </w:rPr>
+        <w:t xml:space="preserve">Not included in this version</w:t>
+      </w:r>
+      <w:r>
+        <w:rPr>
+          <w:b w:val="0"/>
+          <w:i w:val="0"/>
+        </w:rPr>
+        <w:t xml:space="preserve">, so you can see what you must work out some other way.</w:t>
+      </w:r>
+    </w:p>
+    <w:p>
+      <w:pPr>
+        <w:pStyle w:val="Heading2"/>
+      </w:pPr>
+      <w:r>
+        <w:t>12.7 Your return</w:t>
+      </w:r>
+    </w:p>
+    <w:p>
+      <w:r>
+        <w:rPr>
+          <w:b/>
+          <w:i w:val="0"/>
+        </w:rPr>
+        <w:t xml:space="preserve">See my return</w:t>
+      </w:r>
+      <w:r>
+        <w:rPr>
+          <w:b w:val="0"/>
+          <w:i w:val="0"/>
+        </w:rPr>
+        <w:t xml:space="preserve"> shows every line with the form it belongs on. Use </w:t>
+      </w:r>
+      <w:r>
+        <w:rPr>
+          <w:b/>
+          <w:i w:val="0"/>
+        </w:rPr>
+        <w:t xml:space="preserve">Print or save as PDF</w:t>
+      </w:r>
+      <w:r>
+        <w:rPr>
+          <w:b w:val="0"/>
+          <w:i w:val="0"/>
+        </w:rPr>
+        <w:t xml:space="preserve"> to keep a copy or give it to a preparer, and </w:t>
+      </w:r>
+      <w:r>
+        <w:rPr>
+          <w:b/>
+          <w:i w:val="0"/>
+        </w:rPr>
+        <w:t xml:space="preserve">Mark ready to file</w:t>
+      </w:r>
+      <w:r>
+        <w:rPr>
+          <w:b w:val="0"/>
+          <w:i w:val="0"/>
+        </w:rPr>
+        <w:t xml:space="preserve"> when you have checked it. You can return it to a draft at any time. Keep your slips and receipts for six years.</w:t>
+      </w:r>
+    </w:p>
+    <w:p>
+      <w:pPr>
+        <w:pStyle w:val="Heading2"/>
+      </w:pPr>
+      <w:r>
+        <w:t>12.8 What is and is not covered</w:t>
+      </w:r>
+    </w:p>
+    <w:tbl>
+      <w:tblPr>
+        <w:tblW w:type="auto" w:w="0"/>
+        <w:jc w:val="center"/>
+        <w:tblBorders>
+          <w:top w:val="single" w:sz="4" w:space="0" w:color="C9D1DC"/>
+          <w:left w:val="single" w:sz="4" w:space="0" w:color="C9D1DC"/>
+          <w:bottom w:val="single" w:sz="4" w:space="0" w:color="C9D1DC"/>
+          <w:right w:val="single" w:sz="4" w:space="0" w:color="C9D1DC"/>
+          <w:insideH w:val="single" w:sz="4" w:space="0" w:color="C9D1DC"/>
+          <w:insideV w:val="single" w:sz="4" w:space="0" w:color="C9D1DC"/>
+        </w:tblBorders>
+        <w:tblLook w:firstColumn="1" w:firstRow="1" w:lastColumn="0" w:lastRow="0" w:noHBand="0" w:noVBand="1" w:val="04A0"/>
+      </w:tblPr>
+      <w:tblGrid>
+        <w:gridCol w:w="1800"/>
+        <w:gridCol w:w="4100"/>
+        <w:gridCol w:w="3460"/>
+      </w:tblGrid>
+      <w:tr>
+        <w:trPr>
+          <w:tblHeader w:val="true"/>
+        </w:trPr>
+        <w:tc>
+          <w:tcPr>
+            <w:tcW w:type="dxa" w:w="1800"/>
+            <w:shd w:val="clear" w:color="auto" w:fill="0F2A4A"/>
+          </w:tcPr>
+          <w:p>
+            <w:r>
+              <w:rPr>
+                <w:b/>
+                <w:color w:val="FFFFFF"/>
+                <w:sz w:val="20"/>
+              </w:rPr>
+              <w:t>Area</w:t>
+            </w:r>
+          </w:p>
+        </w:tc>
+        <w:tc>
+          <w:tcPr>
+            <w:tcW w:type="dxa" w:w="4100"/>
+            <w:shd w:val="clear" w:color="auto" w:fill="0F2A4A"/>
+          </w:tcPr>
+          <w:p>
+            <w:r>
+              <w:rPr>
+                <w:b/>
+                <w:color w:val="FFFFFF"/>
+                <w:sz w:val="20"/>
+              </w:rPr>
+              <w:t>Covered</w:t>
+            </w:r>
+          </w:p>
+        </w:tc>
+        <w:tc>
+          <w:tcPr>
+            <w:tcW w:type="dxa" w:w="3460"/>
+            <w:shd w:val="clear" w:color="auto" w:fill="0F2A4A"/>
+          </w:tcPr>
+          <w:p>
+            <w:r>
+              <w:rPr>
+                <w:b/>
+                <w:color w:val="FFFFFF"/>
+                <w:sz w:val="20"/>
+              </w:rPr>
+              <w:t>Not covered</w:t>
+            </w:r>
+          </w:p>
+        </w:tc>
+      </w:tr>
+      <w:tr>
+        <w:tc>
+          <w:tcPr>
+            <w:tcW w:type="dxa" w:w="1800"/>
+          </w:tcPr>
+          <w:p>
+            <w:pPr>
+              <w:spacing w:after="40"/>
+            </w:pPr>
+            <w:r>
+              <w:rPr>
+                <w:b/>
+                <w:i w:val="0"/>
+                <w:sz w:val="20"/>
+              </w:rPr>
+              <w:t xml:space="preserve">United States federal</w:t>
+            </w:r>
+          </w:p>
+        </w:tc>
+        <w:tc>
+          <w:tcPr>
+            <w:tcW w:type="dxa" w:w="4100"/>
+          </w:tcPr>
+          <w:p>
+            <w:pPr>
+              <w:spacing w:after="40"/>
+            </w:pPr>
+            <w:r>
+              <w:rPr>
+                <w:b w:val="0"/>
+                <w:i w:val="0"/>
+                <w:sz w:val="20"/>
+              </w:rPr>
+              <w:t xml:space="preserve">Wages, interest, dividends and capital gains at the right rates, self-employment (Schedule C and SE), standard or itemized deduction, senior deduction, the qualified business income deduction in the simple case, child tax credit, </w:t>
+            </w:r>
+            <w:r>
+              <w:rPr>
+                <w:b/>
+                <w:i w:val="0"/>
+                <w:sz w:val="20"/>
+              </w:rPr>
+              <w:t xml:space="preserve">earned income credit</w:t>
+            </w:r>
+            <w:r>
+              <w:rPr>
+                <w:b w:val="0"/>
+                <w:i w:val="0"/>
+                <w:sz w:val="20"/>
+              </w:rPr>
+              <w:t xml:space="preserve">, </w:t>
+            </w:r>
+            <w:r>
+              <w:rPr>
+                <w:b/>
+                <w:i w:val="0"/>
+                <w:sz w:val="20"/>
+              </w:rPr>
+              <w:t xml:space="preserve">education credits</w:t>
+            </w:r>
+            <w:r>
+              <w:rPr>
+                <w:b w:val="0"/>
+                <w:i w:val="0"/>
+                <w:sz w:val="20"/>
+              </w:rPr>
+              <w:t xml:space="preserve"> (American opportunity and lifetime learning), student loan interest, additional Medicare tax, net investment income tax.</w:t>
+            </w:r>
+          </w:p>
+        </w:tc>
+        <w:tc>
+          <w:tcPr>
+            <w:tcW w:type="dxa" w:w="3460"/>
+          </w:tcPr>
+          <w:p>
+            <w:pPr>
+              <w:spacing w:after="40"/>
+            </w:pPr>
+            <w:r>
+              <w:rPr>
+                <w:b w:val="0"/>
+                <w:i w:val="0"/>
+                <w:sz w:val="20"/>
+              </w:rPr>
+              <w:t xml:space="preserve">Retirement-saver credit, dependent care credit, energy credits, alternative minimum tax, underpayment penalty, the new tips, overtime and car-loan-interest deductions, the qualified business income deduction at high incomes.</w:t>
+            </w:r>
+          </w:p>
+        </w:tc>
+      </w:tr>
+      <w:tr>
+        <w:tc>
+          <w:tcPr>
+            <w:tcW w:type="dxa" w:w="1800"/>
+            <w:shd w:val="clear" w:color="auto" w:fill="F4F7FB"/>
+          </w:tcPr>
+          <w:p>
+            <w:pPr>
+              <w:spacing w:after="40"/>
+            </w:pPr>
+            <w:r>
+              <w:rPr>
+                <w:b/>
+                <w:i w:val="0"/>
+                <w:sz w:val="20"/>
+              </w:rPr>
+              <w:t xml:space="preserve">United States state</w:t>
+            </w:r>
+          </w:p>
+        </w:tc>
+        <w:tc>
+          <w:tcPr>
+            <w:tcW w:type="dxa" w:w="4100"/>
+            <w:shd w:val="clear" w:color="auto" w:fill="F4F7FB"/>
+          </w:tcPr>
+          <w:p>
+            <w:pPr>
+              <w:spacing w:after="40"/>
+            </w:pPr>
+            <w:r>
+              <w:rPr>
+                <w:b w:val="0"/>
+                <w:i w:val="0"/>
+                <w:sz w:val="20"/>
+              </w:rPr>
+              <w:t xml:space="preserve">An </w:t>
+            </w:r>
+            <w:r>
+              <w:rPr>
+                <w:b/>
+                <w:i w:val="0"/>
+                <w:sz w:val="20"/>
+              </w:rPr>
+              <w:t xml:space="preserve">estimate</w:t>
+            </w:r>
+            <w:r>
+              <w:rPr>
+                <w:b w:val="0"/>
+                <w:i w:val="0"/>
+                <w:sz w:val="20"/>
+              </w:rPr>
+              <w:t xml:space="preserve"> for every state and DC from published 2025 rates, standard deduction and exemptions.</w:t>
+            </w:r>
+          </w:p>
+        </w:tc>
+        <w:tc>
+          <w:tcPr>
+            <w:tcW w:type="dxa" w:w="3460"/>
+            <w:shd w:val="clear" w:color="auto" w:fill="F4F7FB"/>
+          </w:tcPr>
+          <w:p>
+            <w:pPr>
+              <w:spacing w:after="40"/>
+            </w:pPr>
+            <w:r>
+              <w:rPr>
+                <w:b w:val="0"/>
+                <w:i w:val="0"/>
+                <w:sz w:val="20"/>
+              </w:rPr>
+              <w:t xml:space="preserve">State-specific credits and adjustments, local taxes, and rate changes made after January 1, 2025. Washington’s capital gains tax is not estimated. Check your state return.</w:t>
+            </w:r>
+          </w:p>
+        </w:tc>
+      </w:tr>
+      <w:tr>
+        <w:tc>
+          <w:tcPr>
+            <w:tcW w:type="dxa" w:w="1800"/>
+          </w:tcPr>
+          <w:p>
+            <w:pPr>
+              <w:spacing w:after="40"/>
+            </w:pPr>
+            <w:r>
+              <w:rPr>
+                <w:b/>
+                <w:i w:val="0"/>
+                <w:sz w:val="20"/>
+              </w:rPr>
+              <w:t xml:space="preserve">Canada federal</w:t>
+            </w:r>
+          </w:p>
+        </w:tc>
+        <w:tc>
+          <w:tcPr>
+            <w:tcW w:type="dxa" w:w="4100"/>
+          </w:tcPr>
+          <w:p>
+            <w:pPr>
+              <w:spacing w:after="40"/>
+            </w:pPr>
+            <w:r>
+              <w:rPr>
+                <w:b w:val="0"/>
+                <w:i w:val="0"/>
+                <w:sz w:val="20"/>
+              </w:rPr>
+              <w:t xml:space="preserve">Employment, self-employment (both halves of CPP), investments and dividends, capital gains, RRSP, FHSA, child care, basic personal, age, spouse, tuition, donation, CPP and EI credits.</w:t>
+            </w:r>
+          </w:p>
+        </w:tc>
+        <w:tc>
+          <w:tcPr>
+            <w:tcW w:type="dxa" w:w="3460"/>
+          </w:tcPr>
+          <w:p>
+            <w:pPr>
+              <w:spacing w:after="40"/>
+            </w:pPr>
+            <w:r>
+              <w:rPr>
+                <w:b w:val="0"/>
+                <w:i w:val="0"/>
+                <w:sz w:val="20"/>
+              </w:rPr>
+              <w:t xml:space="preserve">Medical expenses, disability amount, moving expenses, pension income amount, Canada Workers Benefit and the GST/HST credit.</w:t>
+            </w:r>
+          </w:p>
+        </w:tc>
+      </w:tr>
+      <w:tr>
+        <w:tc>
+          <w:tcPr>
+            <w:tcW w:type="dxa" w:w="1800"/>
+            <w:shd w:val="clear" w:color="auto" w:fill="F4F7FB"/>
+          </w:tcPr>
+          <w:p>
+            <w:pPr>
+              <w:spacing w:after="40"/>
+            </w:pPr>
+            <w:r>
+              <w:rPr>
+                <w:b/>
+                <w:i w:val="0"/>
+                <w:sz w:val="20"/>
+              </w:rPr>
+              <w:t xml:space="preserve">Canada provincial</w:t>
+            </w:r>
+          </w:p>
+        </w:tc>
+        <w:tc>
+          <w:tcPr>
+            <w:tcW w:type="dxa" w:w="4100"/>
+            <w:shd w:val="clear" w:color="auto" w:fill="F4F7FB"/>
+          </w:tcPr>
+          <w:p>
+            <w:pPr>
+              <w:spacing w:after="40"/>
+            </w:pPr>
+            <w:r>
+              <w:rPr>
+                <w:b w:val="0"/>
+                <w:i w:val="0"/>
+                <w:sz w:val="20"/>
+              </w:rPr>
+              <w:t xml:space="preserve">Every province and territory </w:t>
+            </w:r>
+            <w:r>
+              <w:rPr>
+                <w:b/>
+                <w:i w:val="0"/>
+                <w:sz w:val="20"/>
+              </w:rPr>
+              <w:t xml:space="preserve">except Quebec</w:t>
+            </w:r>
+            <w:r>
+              <w:rPr>
+                <w:b w:val="0"/>
+                <w:i w:val="0"/>
+                <w:sz w:val="20"/>
+              </w:rPr>
+              <w:t xml:space="preserve">: brackets, basic personal amount, CPP and EI credits, and Ontario’s surtax and Health Premium.</w:t>
+            </w:r>
+          </w:p>
+        </w:tc>
+        <w:tc>
+          <w:tcPr>
+            <w:tcW w:type="dxa" w:w="3460"/>
+            <w:shd w:val="clear" w:color="auto" w:fill="F4F7FB"/>
+          </w:tcPr>
+          <w:p>
+            <w:pPr>
+              <w:spacing w:after="40"/>
+            </w:pPr>
+            <w:r>
+              <w:rPr>
+                <w:b w:val="0"/>
+                <w:i w:val="0"/>
+                <w:sz w:val="20"/>
+              </w:rPr>
+              <w:t xml:space="preserve">Other provincial credits, low-income reductions and Alberta’s supplemental credit, so provincial tax can be a little high. Quebec has its own return (TP-1).</w:t>
+            </w:r>
+          </w:p>
+        </w:tc>
+      </w:tr>
+    </w:tbl>
+    <w:p>
+      <w:pPr>
+        <w:spacing w:after="40"/>
+      </w:pPr>
+    </w:p>
+    <w:tbl>
+      <w:tblPr>
+        <w:tblW w:type="auto" w:w="0"/>
+        <w:jc w:val="center"/>
+        <w:tblLook w:firstColumn="1" w:firstRow="1" w:lastColumn="0" w:lastRow="0" w:noHBand="0" w:noVBand="1" w:val="04A0"/>
+      </w:tblPr>
+      <w:tblGrid>
+        <w:gridCol w:w="9360"/>
+      </w:tblGrid>
+      <w:tr>
+        <w:tc>
+          <w:tcPr>
+            <w:tcW w:type="dxa" w:w="9360"/>
+            <w:tcBorders>
+              <w:left w:val="single" w:sz="24" w:color="15803D"/>
+            </w:tcBorders>
+            <w:shd w:val="clear" w:color="auto" w:fill="EAF7EE"/>
+          </w:tcPr>
+          <w:p>
+            <w:pPr>
+              <w:spacing w:after="40"/>
+            </w:pPr>
+            <w:r>
+              <w:rPr>
+                <w:b/>
+                <w:color w:val="15803D"/>
+              </w:rPr>
+              <w:t xml:space="preserve">Rule of thumb  </w:t>
+            </w:r>
+            <w:r>
+              <w:rPr>
+                <w:b w:val="0"/>
+                <w:i w:val="0"/>
+              </w:rPr>
+              <w:t xml:space="preserve">If an item in the Not covered column applies to you, treat the result as an estimate and have a preparer finish the return.</w:t>
+            </w:r>
+          </w:p>
+        </w:tc>
+      </w:tr>
+    </w:tbl>
+    <w:p>
+      <w:pPr>
+        <w:spacing w:after="40"/>
+      </w:pPr>
+    </w:p>
+    <w:p>
+      <w:pPr>
+        <w:pStyle w:val="Heading2"/>
+      </w:pPr>
+      <w:r>
+        <w:t>12.9 Filing the return</w:t>
+      </w:r>
+    </w:p>
+    <w:p>
+      <w:pPr>
+        <w:pStyle w:val="ListBullet"/>
+      </w:pPr>
+      <w:r>
+        <w:rPr>
+          <w:b/>
+          <w:i w:val="0"/>
+        </w:rPr>
+        <w:t xml:space="preserve">United States:</w:t>
+      </w:r>
+      <w:r>
+        <w:rPr>
+          <w:b w:val="0"/>
+          <w:i w:val="0"/>
+        </w:rPr>
+        <w:t xml:space="preserve"> enter the figures in tax software the IRS has approved or give them to a preparer. Many people qualify for the IRS’s free filing options. Your state has its own return.</w:t>
+      </w:r>
+    </w:p>
+    <w:p>
+      <w:pPr>
+        <w:pStyle w:val="ListBullet"/>
+      </w:pPr>
+      <w:r>
+        <w:rPr>
+          <w:b/>
+          <w:i w:val="0"/>
+        </w:rPr>
+        <w:t xml:space="preserve">Canada:</w:t>
+      </w:r>
+      <w:r>
+        <w:rPr>
+          <w:b w:val="0"/>
+          <w:i w:val="0"/>
+        </w:rPr>
+        <w:t xml:space="preserve"> enter the figures in CRA-certified NETFILE software or give them to a preparer. The due date is normally April 30, and June 15 if you or your spouse are self-employed. Any balance owing is still due April 30.</w:t>
+      </w:r>
+    </w:p>
+    <w:p>
+      <w:pPr>
+        <w:pStyle w:val="ListBullet"/>
+      </w:pPr>
+      <w:r>
+        <w:rPr>
+          <w:b w:val="0"/>
+          <w:i w:val="0"/>
+        </w:rPr>
+        <w:t xml:space="preserve">Check the due date for your tax year. Late returns and late payments can carry penalties and interest.</w:t>
+      </w:r>
+    </w:p>
+    <w:tbl>
+      <w:tblPr>
+        <w:tblW w:type="auto" w:w="0"/>
+        <w:jc w:val="center"/>
+        <w:tblLook w:firstColumn="1" w:firstRow="1" w:lastColumn="0" w:lastRow="0" w:noHBand="0" w:noVBand="1" w:val="04A0"/>
+      </w:tblPr>
+      <w:tblGrid>
+        <w:gridCol w:w="9360"/>
+      </w:tblGrid>
+      <w:tr>
+        <w:tc>
+          <w:tcPr>
+            <w:tcW w:type="dxa" w:w="9360"/>
+            <w:tcBorders>
+              <w:left w:val="single" w:sz="24" w:color="D97706"/>
+            </w:tcBorders>
+            <w:shd w:val="clear" w:color="auto" w:fill="FFF6E5"/>
+          </w:tcPr>
+          <w:p>
+            <w:pPr>
+              <w:spacing w:after="40"/>
+            </w:pPr>
+            <w:r>
+              <w:rPr>
+                <w:b/>
+                <w:color w:val="D97706"/>
+              </w:rPr>
+              <w:t xml:space="preserve">Caution  </w:t>
+            </w:r>
+            <w:r>
+              <w:rPr>
+                <w:b w:val="0"/>
+                <w:i w:val="0"/>
+              </w:rPr>
+              <w:t xml:space="preserve">The tax tables for each year are checked against the IRS and CRA published figures before they are loaded. For a year not yet loaded the tab says so. State figures are the least exact part: always compare them with your state’s own return.</w:t>
+            </w:r>
+          </w:p>
+        </w:tc>
+      </w:tr>
+    </w:tbl>
+    <w:p>
+      <w:pPr>
+        <w:spacing w:after="40"/>
+      </w:pPr>
+    </w:p>
+    <w:p>
+      <w:pPr>
+        <w:pStyle w:val="Heading2"/>
+      </w:pPr>
+      <w:r>
+        <w:t>12.10 If something goes wrong</w:t>
+      </w:r>
+    </w:p>
+    <w:tbl>
+      <w:tblPr>
+        <w:tblW w:type="auto" w:w="0"/>
+        <w:jc w:val="center"/>
+        <w:tblBorders>
+          <w:top w:val="single" w:sz="4" w:space="0" w:color="C9D1DC"/>
+          <w:left w:val="single" w:sz="4" w:space="0" w:color="C9D1DC"/>
+          <w:bottom w:val="single" w:sz="4" w:space="0" w:color="C9D1DC"/>
+          <w:right w:val="single" w:sz="4" w:space="0" w:color="C9D1DC"/>
+          <w:insideH w:val="single" w:sz="4" w:space="0" w:color="C9D1DC"/>
+          <w:insideV w:val="single" w:sz="4" w:space="0" w:color="C9D1DC"/>
+        </w:tblBorders>
+        <w:tblLook w:firstColumn="1" w:firstRow="1" w:lastColumn="0" w:lastRow="0" w:noHBand="0" w:noVBand="1" w:val="04A0"/>
+      </w:tblPr>
+      <w:tblGrid>
+        <w:gridCol w:w="3200"/>
+        <w:gridCol w:w="6160"/>
+      </w:tblGrid>
+      <w:tr>
+        <w:trPr>
+          <w:tblHeader w:val="true"/>
+        </w:trPr>
+        <w:tc>
+          <w:tcPr>
+            <w:tcW w:type="dxa" w:w="3200"/>
+            <w:shd w:val="clear" w:color="auto" w:fill="0F2A4A"/>
+          </w:tcPr>
+          <w:p>
+            <w:r>
+              <w:rPr>
+                <w:b/>
+                <w:color w:val="FFFFFF"/>
+                <w:sz w:val="20"/>
+              </w:rPr>
+              <w:t>What you see</w:t>
+            </w:r>
+          </w:p>
+        </w:tc>
+        <w:tc>
+          <w:tcPr>
+            <w:tcW w:type="dxa" w:w="6160"/>
+            <w:shd w:val="clear" w:color="auto" w:fill="0F2A4A"/>
+          </w:tcPr>
+          <w:p>
+            <w:r>
+              <w:rPr>
+                <w:b/>
+                <w:color w:val="FFFFFF"/>
+                <w:sz w:val="20"/>
+              </w:rPr>
+              <w:t>What to do</w:t>
+            </w:r>
+          </w:p>
+        </w:tc>
+      </w:tr>
+      <w:tr>
+        <w:tc>
+          <w:tcPr>
+            <w:tcW w:type="dxa" w:w="3200"/>
+          </w:tcPr>
+          <w:p>
+            <w:pPr>
+              <w:spacing w:after="40"/>
+            </w:pPr>
+            <w:r>
+              <w:rPr>
+                <w:b/>
+                <w:i w:val="0"/>
+                <w:sz w:val="20"/>
+              </w:rPr>
+              <w:t xml:space="preserve">Tax filing shows an error when it opens</w:t>
+            </w:r>
+          </w:p>
+        </w:tc>
+        <w:tc>
+          <w:tcPr>
+            <w:tcW w:type="dxa" w:w="6160"/>
+          </w:tcPr>
+          <w:p>
+            <w:pPr>
+              <w:spacing w:after="40"/>
+            </w:pPr>
+            <w:r>
+              <w:rPr>
+                <w:b w:val="0"/>
+                <w:i w:val="0"/>
+                <w:sz w:val="20"/>
+              </w:rPr>
+              <w:t xml:space="preserve">Ask your administrator to run Run database migrations (14.3). The tab needs a table that an older database does not have.</w:t>
+            </w:r>
+          </w:p>
+        </w:tc>
+      </w:tr>
+      <w:tr>
+        <w:tc>
+          <w:tcPr>
+            <w:tcW w:type="dxa" w:w="3200"/>
+            <w:shd w:val="clear" w:color="auto" w:fill="F4F7FB"/>
+          </w:tcPr>
+          <w:p>
+            <w:pPr>
+              <w:spacing w:after="40"/>
+            </w:pPr>
+            <w:r>
+              <w:rPr>
+                <w:b/>
+                <w:i w:val="0"/>
+                <w:sz w:val="20"/>
+              </w:rPr>
+              <w:t xml:space="preserve">Upload W-2 or Upload T4 says Claude is off</w:t>
+            </w:r>
+          </w:p>
+        </w:tc>
+        <w:tc>
+          <w:tcPr>
+            <w:tcW w:type="dxa" w:w="6160"/>
+            <w:shd w:val="clear" w:color="auto" w:fill="F4F7FB"/>
+          </w:tcPr>
+          <w:p>
+            <w:pPr>
+              <w:spacing w:after="40"/>
+            </w:pPr>
+            <w:r>
+              <w:rPr>
+                <w:b w:val="0"/>
+                <w:i w:val="0"/>
+                <w:sz w:val="20"/>
+              </w:rPr>
+              <w:t xml:space="preserve">Ask your administrator to set ANTHROPIC_API_KEY (14.1). Meanwhile type the boxes in.</w:t>
+            </w:r>
+          </w:p>
+        </w:tc>
+      </w:tr>
+      <w:tr>
+        <w:tc>
+          <w:tcPr>
+            <w:tcW w:type="dxa" w:w="3200"/>
+          </w:tcPr>
+          <w:p>
+            <w:pPr>
+              <w:spacing w:after="40"/>
+            </w:pPr>
+            <w:r>
+              <w:rPr>
+                <w:b/>
+                <w:i w:val="0"/>
+                <w:sz w:val="20"/>
+              </w:rPr>
+              <w:t xml:space="preserve">The state tax line is missing</w:t>
+            </w:r>
+          </w:p>
+        </w:tc>
+        <w:tc>
+          <w:tcPr>
+            <w:tcW w:type="dxa" w:w="6160"/>
+          </w:tcPr>
+          <w:p>
+            <w:pPr>
+              <w:spacing w:after="40"/>
+            </w:pPr>
+            <w:r>
+              <w:rPr>
+                <w:b w:val="0"/>
+                <w:i w:val="0"/>
+                <w:sz w:val="20"/>
+              </w:rPr>
+              <w:t xml:space="preserve">Choose your state on the </w:t>
+            </w:r>
+            <w:r>
+              <w:rPr>
+                <w:b/>
+                <w:i w:val="0"/>
+                <w:sz w:val="20"/>
+              </w:rPr>
+              <w:t xml:space="preserve">Your state</w:t>
+            </w:r>
+            <w:r>
+              <w:rPr>
+                <w:b w:val="0"/>
+                <w:i w:val="0"/>
+                <w:sz w:val="20"/>
+              </w:rPr>
+              <w:t xml:space="preserve"> page. Washington is not estimated.</w:t>
+            </w:r>
+          </w:p>
+        </w:tc>
+      </w:tr>
+      <w:tr>
+        <w:tc>
+          <w:tcPr>
+            <w:tcW w:type="dxa" w:w="3200"/>
+            <w:shd w:val="clear" w:color="auto" w:fill="F4F7FB"/>
+          </w:tcPr>
+          <w:p>
+            <w:pPr>
+              <w:spacing w:after="40"/>
+            </w:pPr>
+            <w:r>
+              <w:rPr>
+                <w:b/>
+                <w:i w:val="0"/>
+                <w:sz w:val="20"/>
+              </w:rPr>
+              <w:t xml:space="preserve">A Canadian return says “federal only”</w:t>
+            </w:r>
+          </w:p>
+        </w:tc>
+        <w:tc>
+          <w:tcPr>
+            <w:tcW w:type="dxa" w:w="6160"/>
+            <w:shd w:val="clear" w:color="auto" w:fill="F4F7FB"/>
+          </w:tcPr>
+          <w:p>
+            <w:pPr>
+              <w:spacing w:after="40"/>
+            </w:pPr>
+            <w:r>
+              <w:rPr>
+                <w:b w:val="0"/>
+                <w:i w:val="0"/>
+                <w:sz w:val="20"/>
+              </w:rPr>
+              <w:t xml:space="preserve">Choose your province on the </w:t>
+            </w:r>
+            <w:r>
+              <w:rPr>
+                <w:b/>
+                <w:i w:val="0"/>
+                <w:sz w:val="20"/>
+              </w:rPr>
+              <w:t xml:space="preserve">About you</w:t>
+            </w:r>
+            <w:r>
+              <w:rPr>
+                <w:b w:val="0"/>
+                <w:i w:val="0"/>
+                <w:sz w:val="20"/>
+              </w:rPr>
+              <w:t xml:space="preserve"> page. Quebec is federal only.</w:t>
+            </w:r>
+          </w:p>
+        </w:tc>
+      </w:tr>
+      <w:tr>
+        <w:tc>
+          <w:tcPr>
+            <w:tcW w:type="dxa" w:w="3200"/>
+          </w:tcPr>
+          <w:p>
+            <w:pPr>
+              <w:spacing w:after="40"/>
+            </w:pPr>
+            <w:r>
+              <w:rPr>
+                <w:b/>
+                <w:i w:val="0"/>
+                <w:sz w:val="20"/>
+              </w:rPr>
+              <w:t xml:space="preserve">The refund looks too high or too low</w:t>
+            </w:r>
+          </w:p>
+        </w:tc>
+        <w:tc>
+          <w:tcPr>
+            <w:tcW w:type="dxa" w:w="6160"/>
+          </w:tcPr>
+          <w:p>
+            <w:pPr>
+              <w:spacing w:after="40"/>
+            </w:pPr>
+            <w:r>
+              <w:rPr>
+                <w:b w:val="0"/>
+                <w:i w:val="0"/>
+                <w:sz w:val="20"/>
+              </w:rPr>
+              <w:t xml:space="preserve">Open </w:t>
+            </w:r>
+            <w:r>
+              <w:rPr>
+                <w:b/>
+                <w:i w:val="0"/>
+                <w:sz w:val="20"/>
+              </w:rPr>
+              <w:t xml:space="preserve">Review</w:t>
+            </w:r>
+            <w:r>
+              <w:rPr>
+                <w:b w:val="0"/>
+                <w:i w:val="0"/>
+                <w:sz w:val="20"/>
+              </w:rPr>
+              <w:t xml:space="preserve"> for warnings, then check each page against your slips. A box left empty counts as zero.</w:t>
+            </w:r>
+          </w:p>
+        </w:tc>
+      </w:tr>
+    </w:tbl>
+    <w:p>
+      <w:pPr>
+        <w:spacing w:after="40"/>
+      </w:pPr>
+    </w:p>
+    <w:p>
+      <w:r>
+        <w:br w:type="page"/>
+      </w:r>
+    </w:p>
+    <w:p>
+      <w:pPr>
+        <w:pStyle w:val="Heading1"/>
+      </w:pPr>
+      <w:r>
+        <w:t>Part 13 · Standard routines</w:t>
+      </w:r>
+    </w:p>
+    <w:p>
+      <w:pPr>
+        <w:pStyle w:val="Heading2"/>
+      </w:pPr>
+      <w:r>
+        <w:t>13.1 Every morning (about 10 minutes)</w:t>
       </w:r>
     </w:p>
     <w:p>
@@ -12811,7 +15193,7 @@
         <w:pStyle w:val="Heading2"/>
       </w:pPr>
       <w:r>
-        <w:t>12.2 During the day</w:t>
+        <w:t>13.2 During the day</w:t>
       </w:r>
     </w:p>
     <w:p>
@@ -12855,7 +15237,7 @@
         <w:pStyle w:val="Heading2"/>
       </w:pPr>
       <w:r>
-        <w:t>12.3 Every Friday (about 30 minutes)</w:t>
+        <w:t>13.3 Every Friday (about 30 minutes)</w:t>
       </w:r>
     </w:p>
     <w:p>
@@ -12987,7 +15369,7 @@
         <w:pStyle w:val="Heading2"/>
       </w:pPr>
       <w:r>
-        <w:t>12.4 Month end</w:t>
+        <w:t>13.4 Month end</w:t>
       </w:r>
     </w:p>
     <w:p>
@@ -13175,7 +15557,7 @@
         <w:pStyle w:val="Heading2"/>
       </w:pPr>
       <w:r>
-        <w:t>12.5 Compliance deadlines to know</w:t>
+        <w:t>13.5 Compliance deadlines to know</w:t>
       </w:r>
     </w:p>
     <w:tbl>
@@ -13426,7 +15808,7 @@
         <w:pStyle w:val="Heading1"/>
       </w:pPr>
       <w:r>
-        <w:t>Part 13 · Administration</w:t>
+        <w:t>Part 14 · Administration</w:t>
       </w:r>
     </w:p>
     <w:p>
@@ -13443,7 +15825,7 @@
         <w:pStyle w:val="Heading2"/>
       </w:pPr>
       <w:r>
-        <w:t>13.1 Settings that switch features on</w:t>
+        <w:t>14.1 Settings that switch features on</w:t>
       </w:r>
     </w:p>
     <w:tbl>
@@ -13690,7 +16072,7 @@
                 <w:i w:val="0"/>
                 <w:sz w:val="20"/>
               </w:rPr>
-              <w:t xml:space="preserve">Claude reading orders, invoices, RFQs and drawings, suggesting accounts in AI bookkeeping, and Counsel</w:t>
+              <w:t xml:space="preserve">Claude reading orders, invoices, RFQs and drawings, suggesting accounts in AI bookkeeping, and Counsel, and reading W-2 and T4 slips and PDF or photo statements</w:t>
             </w:r>
           </w:p>
         </w:tc>
@@ -14172,7 +16554,7 @@
         <w:pStyle w:val="Heading2"/>
       </w:pPr>
       <w:r>
-        <w:t>13.2 Changing the passphrase</w:t>
+        <w:t>14.2 Changing the passphrase</w:t>
       </w:r>
     </w:p>
     <w:p>
@@ -14245,7 +16627,7 @@
         <w:pStyle w:val="Heading2"/>
       </w:pPr>
       <w:r>
-        <w:t>13.3 Database updates</w:t>
+        <w:t>14.3 Database updates</w:t>
       </w:r>
     </w:p>
     <w:p>
@@ -14300,7 +16682,7 @@
         <w:pStyle w:val="Heading2"/>
       </w:pPr>
       <w:r>
-        <w:t>13.4 Loading the tariff and screening lists</w:t>
+        <w:t>14.4 Loading the tariff and screening lists</w:t>
       </w:r>
     </w:p>
     <w:p>
@@ -14359,7 +16741,7 @@
         <w:pStyle w:val="Heading2"/>
       </w:pPr>
       <w:r>
-        <w:t>13.5 The health check</w:t>
+        <w:t>14.5 The health check</w:t>
       </w:r>
     </w:p>
     <w:p>
@@ -14388,7 +16770,7 @@
         <w:pStyle w:val="Heading1"/>
       </w:pPr>
       <w:r>
-        <w:t>Part 14 · Troubleshooting</w:t>
+        <w:t>Part 15 · Troubleshooting</w:t>
       </w:r>
     </w:p>
     <w:tbl>
@@ -14530,7 +16912,7 @@
                 <w:i w:val="0"/>
                 <w:sz w:val="20"/>
               </w:rPr>
-              <w:t xml:space="preserve"> (13.3)</w:t>
+              <w:t xml:space="preserve"> (14.3)</w:t>
             </w:r>
           </w:p>
         </w:tc>
@@ -15556,7 +17938,7 @@
                 <w:i w:val="0"/>
                 <w:sz w:val="20"/>
               </w:rPr>
-              <w:t xml:space="preserve">Administrator: set ANTHROPIC_API_KEY (13.1)</w:t>
+              <w:t xml:space="preserve">Administrator: set ANTHROPIC_API_KEY (14.1)</w:t>
             </w:r>
           </w:p>
         </w:tc>
@@ -15671,7 +18053,7 @@
                 <w:i w:val="0"/>
                 <w:sz w:val="20"/>
               </w:rPr>
-              <w:t xml:space="preserve">Administrator: set both in Netlify and run a new production deploy (13.1, 13.2)</w:t>
+              <w:t xml:space="preserve">Administrator: set both in Netlify and run a new production deploy (14.1, 14.2)</w:t>
             </w:r>
           </w:p>
         </w:tc>
@@ -19299,6 +21681,18 @@
     </w:lvlOverride>
   </w:num>
   <w:num w:numId="29">
+    <w:abstractNumId w:val="7"/>
+    <w:lvlOverride w:ilvl="0">
+      <w:startOverride w:val="1"/>
+    </w:lvlOverride>
+  </w:num>
+  <w:num w:numId="30">
+    <w:abstractNumId w:val="7"/>
+    <w:lvlOverride w:ilvl="0">
+      <w:startOverride w:val="1"/>
+    </w:lvlOverride>
+  </w:num>
+  <w:num w:numId="31">
     <w:abstractNumId w:val="7"/>
     <w:lvlOverride w:ilvl="0">
       <w:startOverride w:val="1"/>

</xml_diff>

<commit_message>
Tax filing: provincial and state tax, earned income and education credits, Training guide Part 12 (#80)
Claude-Session: https://claude.ai/code/session_01CEBT7Vo5qSapA8phj8RKSd

Co-authored-by: Claude <noreply@anthropic.com>
</commit_message>
<xml_diff>
--- a/docs/GloblexAI-Office-ERP-Operations-and-Training-Guide.docx
+++ b/docs/GloblexAI-Office-ERP-Operations-and-Training-Guide.docx
@@ -91,7 +91,7 @@
           <w:color w:val="555F6D"/>
           <w:sz w:val="20"/>
         </w:rPr>
-        <w:t>Version 1.1 · October 2026</w:t>
+        <w:t>Version 1.2 · October 2026</w:t>
       </w:r>
     </w:p>
     <w:p>
@@ -124,7 +124,7 @@
           <w:b w:val="0"/>
           <w:i w:val="0"/>
         </w:rPr>
-        <w:t xml:space="preserve">This guide takes you from your first sign-in to running a normal day in the application. Read Parts 1 to 3 once. Use Parts 4 to 11 as a reference for the area you work in, and Part 12 for the daily, weekly and month-end routines.</w:t>
+        <w:t xml:space="preserve">This guide takes you from your first sign-in to running a normal day in the application. Read Parts 1 to 3 once. Use Parts 4 to 12 as a reference for the area you work in, and Part 13 for the daily, weekly and month-end routines.</w:t>
       </w:r>
     </w:p>
     <w:tbl>
@@ -371,7 +371,7 @@
                 <w:i w:val="0"/>
                 <w:sz w:val="20"/>
               </w:rPr>
-              <w:t xml:space="preserve">Part 10 (Accounting tabs), Part 11 (AI bookkeeping) and Part 12 (routines)</w:t>
+              <w:t xml:space="preserve">Part 10 (Accounting tabs), Part 11 (AI bookkeeping) and Part 13 (routines)</w:t>
             </w:r>
           </w:p>
         </w:tc>
@@ -411,7 +411,7 @@
                 <w:i w:val="0"/>
                 <w:sz w:val="20"/>
               </w:rPr>
-              <w:t xml:space="preserve">Part 9 (Counsel) and Part 12 (routines)</w:t>
+              <w:t xml:space="preserve">Part 9 (Counsel) and Part 13 (routines)</w:t>
             </w:r>
           </w:p>
         </w:tc>
@@ -431,6 +431,45 @@
                 <w:i w:val="0"/>
                 <w:sz w:val="20"/>
               </w:rPr>
+              <w:t xml:space="preserve">Anyone preparing a tax return</w:t>
+            </w:r>
+          </w:p>
+        </w:tc>
+        <w:tc>
+          <w:tcPr>
+            <w:tcW w:type="dxa" w:w="5904"/>
+          </w:tcPr>
+          <w:p>
+            <w:pPr>
+              <w:spacing w:after="40"/>
+            </w:pPr>
+            <w:r>
+              <w:rPr>
+                <w:b w:val="0"/>
+                <w:i w:val="0"/>
+                <w:sz w:val="20"/>
+              </w:rPr>
+              <w:t xml:space="preserve">Part 12 (Tax filing)</w:t>
+            </w:r>
+          </w:p>
+        </w:tc>
+      </w:tr>
+      <w:tr>
+        <w:tc>
+          <w:tcPr>
+            <w:tcW w:type="dxa" w:w="3456"/>
+            <w:shd w:val="clear" w:color="auto" w:fill="F4F7FB"/>
+          </w:tcPr>
+          <w:p>
+            <w:pPr>
+              <w:spacing w:after="40"/>
+            </w:pPr>
+            <w:r>
+              <w:rPr>
+                <w:b w:val="0"/>
+                <w:i w:val="0"/>
+                <w:sz w:val="20"/>
+              </w:rPr>
               <w:t xml:space="preserve">Administrator</w:t>
             </w:r>
           </w:p>
@@ -438,18 +477,19 @@
         <w:tc>
           <w:tcPr>
             <w:tcW w:type="dxa" w:w="5904"/>
-          </w:tcPr>
-          <w:p>
-            <w:pPr>
-              <w:spacing w:after="40"/>
-            </w:pPr>
-            <w:r>
-              <w:rPr>
-                <w:b w:val="0"/>
-                <w:i w:val="0"/>
-                <w:sz w:val="20"/>
-              </w:rPr>
-              <w:t xml:space="preserve">Part 13 (Administration) and Part 14 (Troubleshooting)</w:t>
+            <w:shd w:val="clear" w:color="auto" w:fill="F4F7FB"/>
+          </w:tcPr>
+          <w:p>
+            <w:pPr>
+              <w:spacing w:after="40"/>
+            </w:pPr>
+            <w:r>
+              <w:rPr>
+                <w:b w:val="0"/>
+                <w:i w:val="0"/>
+                <w:sz w:val="20"/>
+              </w:rPr>
+              <w:t xml:space="preserve">Part 14 (Administration) and Part 15 (Troubleshooting)</w:t>
             </w:r>
           </w:p>
         </w:tc>
@@ -544,7 +584,7 @@
         <w:pStyle w:val="Heading2"/>
       </w:pPr>
       <w:r>
-        <w:t>What is new in version 1.1</w:t>
+        <w:t>What is new in version 1.2</w:t>
       </w:r>
     </w:p>
     <w:p>
@@ -553,17 +593,10 @@
       </w:pPr>
       <w:r>
         <w:rPr>
-          <w:b/>
-          <w:i w:val="0"/>
-        </w:rPr>
-        <w:t xml:space="preserve">New Part 8, RFQs to quotes.</w:t>
-      </w:r>
-      <w:r>
-        <w:rPr>
           <w:b w:val="0"/>
           <w:i w:val="0"/>
         </w:rPr>
-        <w:t xml:space="preserve"> Read a customer’s request for quote, cost it with your own rules and approve it as an estimator.</w:t>
+        <w:t xml:space="preserve">New Part 12, Tax filing. Prepare a personal or business income tax return for the United States or Canada one question at a time and watch the refund or balance as you go.</w:t>
       </w:r>
     </w:p>
     <w:p>
@@ -572,17 +605,10 @@
       </w:pPr>
       <w:r>
         <w:rPr>
-          <w:b/>
-          <w:i w:val="0"/>
-        </w:rPr>
-        <w:t xml:space="preserve">New Part 9, Counsel.</w:t>
-      </w:r>
-      <w:r>
-        <w:rPr>
           <w:b w:val="0"/>
           <w:i w:val="0"/>
         </w:rPr>
-        <w:t xml:space="preserve"> Legal questions, contract review and drafting. It is an assistant, not a lawyer.</w:t>
+        <w:t xml:space="preserve">Provincial and state tax are included as estimates, along with the earned income credit and education credits. W-2 and T4 slips can be read from a photo.</w:t>
       </w:r>
     </w:p>
     <w:p>
@@ -591,17 +617,22 @@
       </w:pPr>
       <w:r>
         <w:rPr>
-          <w:b/>
-          <w:i w:val="0"/>
-        </w:rPr>
-        <w:t xml:space="preserve">New Part 11, AI bookkeeping.</w:t>
-      </w:r>
-      <w:r>
-        <w:rPr>
           <w:b w:val="0"/>
           <w:i w:val="0"/>
         </w:rPr>
-        <w:t xml:space="preserve"> Sort a bank or card statement into expenses for your approval.</w:t>
+        <w:t xml:space="preserve">Later parts are renumbered: routines are now Part 13, administration Part 14 and troubleshooting Part 15.</w:t>
+      </w:r>
+    </w:p>
+    <w:p>
+      <w:pPr>
+        <w:pStyle w:val="Heading2"/>
+      </w:pPr>
+      <w:r>
+        <w:rPr>
+          <w:b w:val="0"/>
+          <w:i w:val="0"/>
+        </w:rPr>
+        <w:t xml:space="preserve">What was new in version 1.1</w:t>
       </w:r>
     </w:p>
     <w:p>
@@ -610,10 +641,67 @@
       </w:pPr>
       <w:r>
         <w:rPr>
+          <w:b/>
+          <w:i w:val="0"/>
+        </w:rPr>
+        <w:t xml:space="preserve">New Part 8, RFQs to quotes.</w:t>
+      </w:r>
+      <w:r>
+        <w:rPr>
           <w:b w:val="0"/>
           <w:i w:val="0"/>
         </w:rPr>
-        <w:t xml:space="preserve">The left menu now has nine groups, and the routines in Part 12 include the new tabs.</w:t>
+        <w:t xml:space="preserve"> Read a customer’s request for quote, cost it with your own rules and approve it as an estimator.</w:t>
+      </w:r>
+    </w:p>
+    <w:p>
+      <w:pPr>
+        <w:pStyle w:val="ListBullet"/>
+      </w:pPr>
+      <w:r>
+        <w:rPr>
+          <w:b/>
+          <w:i w:val="0"/>
+        </w:rPr>
+        <w:t xml:space="preserve">New Part 9, Counsel.</w:t>
+      </w:r>
+      <w:r>
+        <w:rPr>
+          <w:b w:val="0"/>
+          <w:i w:val="0"/>
+        </w:rPr>
+        <w:t xml:space="preserve"> Legal questions, contract review and drafting. It is an assistant, not a lawyer.</w:t>
+      </w:r>
+    </w:p>
+    <w:p>
+      <w:pPr>
+        <w:pStyle w:val="ListBullet"/>
+      </w:pPr>
+      <w:r>
+        <w:rPr>
+          <w:b/>
+          <w:i w:val="0"/>
+        </w:rPr>
+        <w:t xml:space="preserve">New Part 11, AI bookkeeping.</w:t>
+      </w:r>
+      <w:r>
+        <w:rPr>
+          <w:b w:val="0"/>
+          <w:i w:val="0"/>
+        </w:rPr>
+        <w:t xml:space="preserve"> Sort a bank or card statement into expenses for your approval.</w:t>
+      </w:r>
+    </w:p>
+    <w:p>
+      <w:pPr>
+        <w:pStyle w:val="ListBullet"/>
+      </w:pPr>
+      <w:r>
+        <w:rPr>
+          <w:b w:val="0"/>
+          <w:i w:val="0"/>
+        </w:rPr>
+        <w:t xml:space="preserve">The left menu now has ten groups, and the routines in Part 13 include the new tabs.</w:t>
       </w:r>
     </w:p>
     <w:p>
@@ -1482,7 +1570,7 @@
                 <w:b w:val="0"/>
                 <w:i w:val="0"/>
               </w:rPr>
-              <w:t xml:space="preserve">Once your administrator has set up the scheduled run (Part 13), the agents run automatically every hour. You can also press </w:t>
+              <w:t xml:space="preserve">Once your administrator has set up the scheduled run (Part 14), the agents run automatically every hour. You can also press </w:t>
             </w:r>
             <w:r>
               <w:rPr>
@@ -2319,7 +2407,7 @@
           <w:b w:val="0"/>
           <w:i w:val="0"/>
         </w:rPr>
-        <w:t>On a desktop the menu is always visible. On a phone, open it with the menu button at the top left. Select a group name, or its arrow, to fold that group open or closed. The menu remembers what you chose on this device. It has nine groups:</w:t>
+        <w:t>On a desktop the menu is always visible. On a phone, open it with the menu button at the top left. Select a group name, or its arrow, to fold that group open or closed. The menu remembers what you chose on this device. It has ten groups:</w:t>
       </w:r>
     </w:p>
     <w:tbl>
@@ -2665,7 +2753,7 @@
                 <w:i w:val="0"/>
                 <w:sz w:val="20"/>
               </w:rPr>
-              <w:t>People &amp; money</w:t>
+              <w:t xml:space="preserve">Tax</w:t>
             </w:r>
           </w:p>
         </w:tc>
@@ -2684,7 +2772,7 @@
                 <w:i w:val="0"/>
                 <w:sz w:val="20"/>
               </w:rPr>
-              <w:t>Payroll · QuickBooks Capital</w:t>
+              <w:t xml:space="preserve">Tax filing</w:t>
             </w:r>
           </w:p>
         </w:tc>
@@ -2704,6 +2792,45 @@
                 <w:i w:val="0"/>
                 <w:sz w:val="20"/>
               </w:rPr>
+              <w:t>People &amp; money</w:t>
+            </w:r>
+          </w:p>
+        </w:tc>
+        <w:tc>
+          <w:tcPr>
+            <w:tcW w:type="dxa" w:w="6912"/>
+          </w:tcPr>
+          <w:p>
+            <w:pPr>
+              <w:spacing w:after="40"/>
+            </w:pPr>
+            <w:r>
+              <w:rPr>
+                <w:b w:val="0"/>
+                <w:i w:val="0"/>
+                <w:sz w:val="20"/>
+              </w:rPr>
+              <w:t>Payroll · QuickBooks Capital</w:t>
+            </w:r>
+          </w:p>
+        </w:tc>
+      </w:tr>
+      <w:tr>
+        <w:tc>
+          <w:tcPr>
+            <w:tcW w:type="dxa" w:w="2448"/>
+            <w:shd w:val="clear" w:color="auto" w:fill="F4F7FB"/>
+          </w:tcPr>
+          <w:p>
+            <w:pPr>
+              <w:spacing w:after="40"/>
+            </w:pPr>
+            <w:r>
+              <w:rPr>
+                <w:b w:val="0"/>
+                <w:i w:val="0"/>
+                <w:sz w:val="20"/>
+              </w:rPr>
               <w:t>App</w:t>
             </w:r>
           </w:p>
@@ -2711,6 +2838,7 @@
         <w:tc>
           <w:tcPr>
             <w:tcW w:type="dxa" w:w="6912"/>
+            <w:shd w:val="clear" w:color="auto" w:fill="F4F7FB"/>
           </w:tcPr>
           <w:p>
             <w:pPr>
@@ -8217,7 +8345,7 @@
           <w:b w:val="0"/>
           <w:i w:val="0"/>
         </w:rPr>
-        <w:t xml:space="preserve">With Claude switched on (Part 13), it reads the request text and any PDF or image drawings. Without it, plain rules pick out the parts, quantities, material, operations, due date and certifications. Either way, anything it cannot find is left blank for you to fill in. Other files, such as 3D models, are kept with the RFQ but are not read automatically, and the quote carries a note telling you to check them.</w:t>
+        <w:t xml:space="preserve">With Claude switched on (Part 14), it reads the request text and any PDF or image drawings. Without it, plain rules pick out the parts, quantities, material, operations, due date and certifications. Either way, anything it cannot find is left blank for you to fill in. Other files, such as 3D models, are kept with the RFQ but are not read automatically, and the quote carries a note telling you to check them.</w:t>
       </w:r>
     </w:p>
     <w:p>
@@ -10097,7 +10225,7 @@
                 <w:b w:val="0"/>
                 <w:i w:val="0"/>
               </w:rPr>
-              <w:t xml:space="preserve">If Counsel shows “switched off”, the administrator has not set an Anthropic key (see 13.1). The practice-area guide still works without it.</w:t>
+              <w:t xml:space="preserve">If Counsel shows “switched off”, the administrator has not set an Anthropic key (see 14.1). The practice-area guide still works without it.</w:t>
             </w:r>
           </w:p>
         </w:tc>
@@ -12587,15 +12715,2269 @@
         <w:pStyle w:val="Heading1"/>
       </w:pPr>
       <w:r>
-        <w:t>Part 12 · Standard routines</w:t>
-      </w:r>
+        <w:t>Part 12 · Tax filing</w:t>
+      </w:r>
+    </w:p>
+    <w:p>
+      <w:r>
+        <w:rPr>
+          <w:b w:val="0"/>
+          <w:i w:val="0"/>
+        </w:rPr>
+        <w:t xml:space="preserve">The </w:t>
+      </w:r>
+      <w:r>
+        <w:rPr>
+          <w:b/>
+          <w:i w:val="0"/>
+        </w:rPr>
+        <w:t xml:space="preserve">Tax filing</w:t>
+      </w:r>
+      <w:r>
+        <w:rPr>
+          <w:b w:val="0"/>
+          <w:i w:val="0"/>
+        </w:rPr>
+        <w:t xml:space="preserve"> tab, in its own </w:t>
+      </w:r>
+      <w:r>
+        <w:rPr>
+          <w:b/>
+          <w:i w:val="0"/>
+        </w:rPr>
+        <w:t xml:space="preserve">Tax</w:t>
+      </w:r>
+      <w:r>
+        <w:rPr>
+          <w:b w:val="0"/>
+          <w:i w:val="0"/>
+        </w:rPr>
+        <w:t xml:space="preserve"> group in the left menu, prepares an income tax return for one person at a time for the </w:t>
+      </w:r>
+      <w:r>
+        <w:rPr>
+          <w:b/>
+          <w:i w:val="0"/>
+        </w:rPr>
+        <w:t xml:space="preserve">United States</w:t>
+      </w:r>
+      <w:r>
+        <w:rPr>
+          <w:b w:val="0"/>
+          <w:i w:val="0"/>
+        </w:rPr>
+        <w:t xml:space="preserve"> (Form 1040) or </w:t>
+      </w:r>
+      <w:r>
+        <w:rPr>
+          <w:b/>
+          <w:i w:val="0"/>
+        </w:rPr>
+        <w:t xml:space="preserve">Canada</w:t>
+      </w:r>
+      <w:r>
+        <w:rPr>
+          <w:b w:val="0"/>
+          <w:i w:val="0"/>
+        </w:rPr>
+        <w:t xml:space="preserve"> (T1). You answer plain questions about your year, a panel shows your estimated refund or balance owing as each answer changes, and at the end you get the whole return line by line, with the form line each figure belongs on. Use the figures on the official forms or hand them to a preparer.</w:t>
+      </w:r>
+    </w:p>
+    <w:tbl>
+      <w:tblPr>
+        <w:tblW w:type="auto" w:w="0"/>
+        <w:jc w:val="center"/>
+        <w:tblLook w:firstColumn="1" w:firstRow="1" w:lastColumn="0" w:lastRow="0" w:noHBand="0" w:noVBand="1" w:val="04A0"/>
+      </w:tblPr>
+      <w:tblGrid>
+        <w:gridCol w:w="9360"/>
+      </w:tblGrid>
+      <w:tr>
+        <w:tc>
+          <w:tcPr>
+            <w:tcW w:type="dxa" w:w="9360"/>
+            <w:tcBorders>
+              <w:left w:val="single" w:sz="24" w:color="D97706"/>
+            </w:tcBorders>
+            <w:shd w:val="clear" w:color="auto" w:fill="FFF6E5"/>
+          </w:tcPr>
+          <w:p>
+            <w:pPr>
+              <w:spacing w:after="40"/>
+            </w:pPr>
+            <w:r>
+              <w:rPr>
+                <w:b/>
+                <w:color w:val="D97706"/>
+              </w:rPr>
+              <w:t xml:space="preserve">Caution  </w:t>
+            </w:r>
+            <w:r>
+              <w:rPr>
+                <w:b w:val="0"/>
+                <w:i w:val="0"/>
+              </w:rPr>
+              <w:t xml:space="preserve">The tab </w:t>
+            </w:r>
+            <w:r>
+              <w:rPr>
+                <w:b/>
+                <w:i w:val="0"/>
+              </w:rPr>
+              <w:t xml:space="preserve">prepares and estimates. It does not file anything</w:t>
+            </w:r>
+            <w:r>
+              <w:rPr>
+                <w:b w:val="0"/>
+                <w:i w:val="0"/>
+              </w:rPr>
+              <w:t xml:space="preserve"> with the IRS or the CRA, because electronic filing needs certified software and your own account. It also does not ask for Social Security or Social Insurance numbers.</w:t>
+            </w:r>
+          </w:p>
+        </w:tc>
+      </w:tr>
+    </w:tbl>
+    <w:p>
+      <w:pPr>
+        <w:spacing w:after="40"/>
+      </w:pPr>
     </w:p>
     <w:p>
       <w:pPr>
         <w:pStyle w:val="Heading2"/>
       </w:pPr>
       <w:r>
-        <w:t>12.1 Every morning (about 10 minutes)</w:t>
+        <w:t>12.1 Before you start</w:t>
+      </w:r>
+    </w:p>
+    <w:p>
+      <w:pPr>
+        <w:pStyle w:val="ListBullet"/>
+      </w:pPr>
+      <w:r>
+        <w:rPr>
+          <w:b w:val="0"/>
+          <w:i w:val="0"/>
+        </w:rPr>
+        <w:t xml:space="preserve">Gather your </w:t>
+      </w:r>
+      <w:r>
+        <w:rPr>
+          <w:b/>
+          <w:i w:val="0"/>
+        </w:rPr>
+        <w:t xml:space="preserve">slips</w:t>
+      </w:r>
+      <w:r>
+        <w:rPr>
+          <w:b w:val="0"/>
+          <w:i w:val="0"/>
+        </w:rPr>
+        <w:t xml:space="preserve">: W-2s and 1099s for a U.S. return, or T4s and T5s for a Canadian one.</w:t>
+      </w:r>
+    </w:p>
+    <w:p>
+      <w:pPr>
+        <w:pStyle w:val="ListBullet"/>
+      </w:pPr>
+      <w:r>
+        <w:rPr>
+          <w:b w:val="0"/>
+          <w:i w:val="0"/>
+        </w:rPr>
+        <w:t xml:space="preserve">For a Canadian return, have your last Notice of Assessment for your RRSP room.</w:t>
+      </w:r>
+    </w:p>
+    <w:p>
+      <w:pPr>
+        <w:pStyle w:val="ListBullet"/>
+      </w:pPr>
+      <w:r>
+        <w:rPr>
+          <w:b w:val="0"/>
+          <w:i w:val="0"/>
+        </w:rPr>
+        <w:t xml:space="preserve">Gather the figures for anything you want to deduct: mortgage interest, charity gifts, student loan interest (1098-E), tuition (1098-T or T2202), RRSP or FHSA receipts.</w:t>
+      </w:r>
+    </w:p>
+    <w:p>
+      <w:pPr>
+        <w:pStyle w:val="ListBullet"/>
+      </w:pPr>
+      <w:r>
+        <w:rPr>
+          <w:b w:val="0"/>
+          <w:i w:val="0"/>
+        </w:rPr>
+        <w:t xml:space="preserve">Decide whose return this is. Start a separate return for each person, such as a personal return and a partner’s.</w:t>
+      </w:r>
+    </w:p>
+    <w:p>
+      <w:pPr>
+        <w:pStyle w:val="Heading2"/>
+      </w:pPr>
+      <w:r>
+        <w:t>12.2 Start a return</w:t>
+      </w:r>
+    </w:p>
+    <w:p>
+      <w:pPr>
+        <w:pStyle w:val="ListNumber"/>
+        <w:numPr>
+          <w:ilvl w:val="0"/>
+          <w:numId w:val="30"/>
+        </w:numPr>
+      </w:pPr>
+      <w:r>
+        <w:rPr>
+          <w:b w:val="0"/>
+          <w:i w:val="0"/>
+        </w:rPr>
+        <w:t xml:space="preserve">Open </w:t>
+      </w:r>
+      <w:r>
+        <w:rPr>
+          <w:b/>
+          <w:i w:val="0"/>
+        </w:rPr>
+        <w:t xml:space="preserve">Tax filing</w:t>
+      </w:r>
+      <w:r>
+        <w:rPr>
+          <w:b w:val="0"/>
+          <w:i w:val="0"/>
+        </w:rPr>
+        <w:t xml:space="preserve"> in the </w:t>
+      </w:r>
+      <w:r>
+        <w:rPr>
+          <w:b/>
+          <w:i w:val="0"/>
+        </w:rPr>
+        <w:t xml:space="preserve">Tax</w:t>
+      </w:r>
+      <w:r>
+        <w:rPr>
+          <w:b w:val="0"/>
+          <w:i w:val="0"/>
+        </w:rPr>
+        <w:t xml:space="preserve"> group.</w:t>
+      </w:r>
+    </w:p>
+    <w:p>
+      <w:pPr>
+        <w:pStyle w:val="ListNumber"/>
+        <w:numPr>
+          <w:ilvl w:val="0"/>
+          <w:numId w:val="30"/>
+        </w:numPr>
+      </w:pPr>
+      <w:r>
+        <w:rPr>
+          <w:b w:val="0"/>
+          <w:i w:val="0"/>
+        </w:rPr>
+        <w:t xml:space="preserve">Press </w:t>
+      </w:r>
+      <w:r>
+        <w:rPr>
+          <w:b/>
+          <w:i w:val="0"/>
+        </w:rPr>
+        <w:t xml:space="preserve">Start a return</w:t>
+      </w:r>
+      <w:r>
+        <w:rPr>
+          <w:b w:val="0"/>
+          <w:i w:val="0"/>
+        </w:rPr>
+        <w:t xml:space="preserve">.</w:t>
+      </w:r>
+    </w:p>
+    <w:p>
+      <w:pPr>
+        <w:pStyle w:val="ListNumber"/>
+        <w:numPr>
+          <w:ilvl w:val="0"/>
+          <w:numId w:val="30"/>
+        </w:numPr>
+      </w:pPr>
+      <w:r>
+        <w:rPr>
+          <w:b w:val="0"/>
+          <w:i w:val="0"/>
+        </w:rPr>
+        <w:t xml:space="preserve">Choose </w:t>
+      </w:r>
+      <w:r>
+        <w:rPr>
+          <w:b/>
+          <w:i w:val="0"/>
+        </w:rPr>
+        <w:t xml:space="preserve">United States (Form 1040)</w:t>
+      </w:r>
+      <w:r>
+        <w:rPr>
+          <w:b w:val="0"/>
+          <w:i w:val="0"/>
+        </w:rPr>
+        <w:t xml:space="preserve"> or </w:t>
+      </w:r>
+      <w:r>
+        <w:rPr>
+          <w:b/>
+          <w:i w:val="0"/>
+        </w:rPr>
+        <w:t xml:space="preserve">Canada (T1)</w:t>
+      </w:r>
+      <w:r>
+        <w:rPr>
+          <w:b w:val="0"/>
+          <w:i w:val="0"/>
+        </w:rPr>
+        <w:t xml:space="preserve">, type the person’s name, and press </w:t>
+      </w:r>
+      <w:r>
+        <w:rPr>
+          <w:b/>
+          <w:i w:val="0"/>
+        </w:rPr>
+        <w:t xml:space="preserve">Start</w:t>
+      </w:r>
+      <w:r>
+        <w:rPr>
+          <w:b w:val="0"/>
+          <w:i w:val="0"/>
+        </w:rPr>
+        <w:t xml:space="preserve">.</w:t>
+      </w:r>
+    </w:p>
+    <w:p>
+      <w:pPr>
+        <w:pStyle w:val="ListNumber"/>
+        <w:numPr>
+          <w:ilvl w:val="0"/>
+          <w:numId w:val="30"/>
+        </w:numPr>
+      </w:pPr>
+      <w:r>
+        <w:rPr>
+          <w:b w:val="0"/>
+          <w:i w:val="0"/>
+        </w:rPr>
+        <w:t xml:space="preserve">Answer each page and press </w:t>
+      </w:r>
+      <w:r>
+        <w:rPr>
+          <w:b/>
+          <w:i w:val="0"/>
+        </w:rPr>
+        <w:t xml:space="preserve">Continue</w:t>
+      </w:r>
+      <w:r>
+        <w:rPr>
+          <w:b w:val="0"/>
+          <w:i w:val="0"/>
+        </w:rPr>
+        <w:t xml:space="preserve">. </w:t>
+      </w:r>
+      <w:r>
+        <w:rPr>
+          <w:b/>
+          <w:i w:val="0"/>
+        </w:rPr>
+        <w:t xml:space="preserve">Back</w:t>
+      </w:r>
+      <w:r>
+        <w:rPr>
+          <w:b w:val="0"/>
+          <w:i w:val="0"/>
+        </w:rPr>
+        <w:t xml:space="preserve"> and the step list on the left let you go to any page. Your answers save as you type, so you can close the tab and come back to the same return.</w:t>
+      </w:r>
+    </w:p>
+    <w:p>
+      <w:pPr>
+        <w:pStyle w:val="Heading2"/>
+      </w:pPr>
+      <w:r>
+        <w:t>12.3 The interview, page by page</w:t>
+      </w:r>
+    </w:p>
+    <w:tbl>
+      <w:tblPr>
+        <w:tblW w:type="auto" w:w="0"/>
+        <w:jc w:val="center"/>
+        <w:tblBorders>
+          <w:top w:val="single" w:sz="4" w:space="0" w:color="C9D1DC"/>
+          <w:left w:val="single" w:sz="4" w:space="0" w:color="C9D1DC"/>
+          <w:bottom w:val="single" w:sz="4" w:space="0" w:color="C9D1DC"/>
+          <w:right w:val="single" w:sz="4" w:space="0" w:color="C9D1DC"/>
+          <w:insideH w:val="single" w:sz="4" w:space="0" w:color="C9D1DC"/>
+          <w:insideV w:val="single" w:sz="4" w:space="0" w:color="C9D1DC"/>
+        </w:tblBorders>
+        <w:tblLook w:firstColumn="1" w:firstRow="1" w:lastColumn="0" w:lastRow="0" w:noHBand="0" w:noVBand="1" w:val="04A0"/>
+      </w:tblPr>
+      <w:tblGrid>
+        <w:gridCol w:w="1800"/>
+        <w:gridCol w:w="5300"/>
+        <w:gridCol w:w="2260"/>
+      </w:tblGrid>
+      <w:tr>
+        <w:trPr>
+          <w:tblHeader w:val="true"/>
+        </w:trPr>
+        <w:tc>
+          <w:tcPr>
+            <w:tcW w:type="dxa" w:w="1800"/>
+            <w:shd w:val="clear" w:color="auto" w:fill="0F2A4A"/>
+          </w:tcPr>
+          <w:p>
+            <w:r>
+              <w:rPr>
+                <w:b/>
+                <w:color w:val="FFFFFF"/>
+                <w:sz w:val="20"/>
+              </w:rPr>
+              <w:t>Page</w:t>
+            </w:r>
+          </w:p>
+        </w:tc>
+        <w:tc>
+          <w:tcPr>
+            <w:tcW w:type="dxa" w:w="5300"/>
+            <w:shd w:val="clear" w:color="auto" w:fill="0F2A4A"/>
+          </w:tcPr>
+          <w:p>
+            <w:r>
+              <w:rPr>
+                <w:b/>
+                <w:color w:val="FFFFFF"/>
+                <w:sz w:val="20"/>
+              </w:rPr>
+              <w:t>What to enter</w:t>
+            </w:r>
+          </w:p>
+        </w:tc>
+        <w:tc>
+          <w:tcPr>
+            <w:tcW w:type="dxa" w:w="2260"/>
+            <w:shd w:val="clear" w:color="auto" w:fill="0F2A4A"/>
+          </w:tcPr>
+          <w:p>
+            <w:r>
+              <w:rPr>
+                <w:b/>
+                <w:color w:val="FFFFFF"/>
+                <w:sz w:val="20"/>
+              </w:rPr>
+              <w:t>Where it comes from</w:t>
+            </w:r>
+          </w:p>
+        </w:tc>
+      </w:tr>
+      <w:tr>
+        <w:tc>
+          <w:tcPr>
+            <w:tcW w:type="dxa" w:w="1800"/>
+          </w:tcPr>
+          <w:p>
+            <w:pPr>
+              <w:spacing w:after="40"/>
+            </w:pPr>
+            <w:r>
+              <w:rPr>
+                <w:b/>
+                <w:i w:val="0"/>
+                <w:sz w:val="20"/>
+              </w:rPr>
+              <w:t xml:space="preserve">About you</w:t>
+            </w:r>
+          </w:p>
+        </w:tc>
+        <w:tc>
+          <w:tcPr>
+            <w:tcW w:type="dxa" w:w="5300"/>
+          </w:tcPr>
+          <w:p>
+            <w:pPr>
+              <w:spacing w:after="40"/>
+            </w:pPr>
+            <w:r>
+              <w:rPr>
+                <w:b w:val="0"/>
+                <w:i w:val="0"/>
+                <w:sz w:val="20"/>
+              </w:rPr>
+              <w:t xml:space="preserve">United States: filing status, anyone 65 or older or blind, children under 17, other dependents and children for the earned income credit. Canada: province or territory on December 31, whether you are 65 or older, spouse and spouse’s income.</w:t>
+            </w:r>
+          </w:p>
+        </w:tc>
+        <w:tc>
+          <w:tcPr>
+            <w:tcW w:type="dxa" w:w="2260"/>
+          </w:tcPr>
+          <w:p>
+            <w:pPr>
+              <w:spacing w:after="40"/>
+            </w:pPr>
+            <w:r>
+              <w:rPr>
+                <w:b w:val="0"/>
+                <w:i w:val="0"/>
+                <w:sz w:val="20"/>
+              </w:rPr>
+              <w:t xml:space="preserve">Your records</w:t>
+            </w:r>
+          </w:p>
+        </w:tc>
+      </w:tr>
+      <w:tr>
+        <w:tc>
+          <w:tcPr>
+            <w:tcW w:type="dxa" w:w="1800"/>
+            <w:shd w:val="clear" w:color="auto" w:fill="F4F7FB"/>
+          </w:tcPr>
+          <w:p>
+            <w:pPr>
+              <w:spacing w:after="40"/>
+            </w:pPr>
+            <w:r>
+              <w:rPr>
+                <w:b/>
+                <w:i w:val="0"/>
+                <w:sz w:val="20"/>
+              </w:rPr>
+              <w:t xml:space="preserve">Job income</w:t>
+            </w:r>
+          </w:p>
+        </w:tc>
+        <w:tc>
+          <w:tcPr>
+            <w:tcW w:type="dxa" w:w="5300"/>
+            <w:shd w:val="clear" w:color="auto" w:fill="F4F7FB"/>
+          </w:tcPr>
+          <w:p>
+            <w:pPr>
+              <w:spacing w:after="40"/>
+            </w:pPr>
+            <w:r>
+              <w:rPr>
+                <w:b w:val="0"/>
+                <w:i w:val="0"/>
+                <w:sz w:val="20"/>
+              </w:rPr>
+              <w:t xml:space="preserve">US: wages and tax withheld, all W-2s added together. Canada: employment income, tax deducted, CPP, EI and union dues, all T4s added together.</w:t>
+            </w:r>
+          </w:p>
+        </w:tc>
+        <w:tc>
+          <w:tcPr>
+            <w:tcW w:type="dxa" w:w="2260"/>
+            <w:shd w:val="clear" w:color="auto" w:fill="F4F7FB"/>
+          </w:tcPr>
+          <w:p>
+            <w:pPr>
+              <w:spacing w:after="40"/>
+            </w:pPr>
+            <w:r>
+              <w:rPr>
+                <w:b w:val="0"/>
+                <w:i w:val="0"/>
+                <w:sz w:val="20"/>
+              </w:rPr>
+              <w:t xml:space="preserve">W-2 boxes 1 and 2. T4 boxes 14, 22, 16, 18 and 44. Or upload the slip (12.4).</w:t>
+            </w:r>
+          </w:p>
+        </w:tc>
+      </w:tr>
+      <w:tr>
+        <w:tc>
+          <w:tcPr>
+            <w:tcW w:type="dxa" w:w="1800"/>
+          </w:tcPr>
+          <w:p>
+            <w:pPr>
+              <w:spacing w:after="40"/>
+            </w:pPr>
+            <w:r>
+              <w:rPr>
+                <w:b/>
+                <w:i w:val="0"/>
+                <w:sz w:val="20"/>
+              </w:rPr>
+              <w:t xml:space="preserve">Investments</w:t>
+            </w:r>
+          </w:p>
+        </w:tc>
+        <w:tc>
+          <w:tcPr>
+            <w:tcW w:type="dxa" w:w="5300"/>
+          </w:tcPr>
+          <w:p>
+            <w:pPr>
+              <w:spacing w:after="40"/>
+            </w:pPr>
+            <w:r>
+              <w:rPr>
+                <w:b w:val="0"/>
+                <w:i w:val="0"/>
+                <w:sz w:val="20"/>
+              </w:rPr>
+              <w:t xml:space="preserve">Interest, dividends, capital gains or losses and other income.</w:t>
+            </w:r>
+          </w:p>
+        </w:tc>
+        <w:tc>
+          <w:tcPr>
+            <w:tcW w:type="dxa" w:w="2260"/>
+          </w:tcPr>
+          <w:p>
+            <w:pPr>
+              <w:spacing w:after="40"/>
+            </w:pPr>
+            <w:r>
+              <w:rPr>
+                <w:b w:val="0"/>
+                <w:i w:val="0"/>
+                <w:sz w:val="20"/>
+              </w:rPr>
+              <w:t xml:space="preserve">1099-INT, 1099-DIV, 1099-B. T5, T3 and T5008.</w:t>
+            </w:r>
+          </w:p>
+        </w:tc>
+      </w:tr>
+      <w:tr>
+        <w:tc>
+          <w:tcPr>
+            <w:tcW w:type="dxa" w:w="1800"/>
+            <w:shd w:val="clear" w:color="auto" w:fill="F4F7FB"/>
+          </w:tcPr>
+          <w:p>
+            <w:pPr>
+              <w:spacing w:after="40"/>
+            </w:pPr>
+            <w:r>
+              <w:rPr>
+                <w:b/>
+                <w:i w:val="0"/>
+                <w:sz w:val="20"/>
+              </w:rPr>
+              <w:t xml:space="preserve">Self-employment</w:t>
+            </w:r>
+          </w:p>
+        </w:tc>
+        <w:tc>
+          <w:tcPr>
+            <w:tcW w:type="dxa" w:w="5300"/>
+            <w:shd w:val="clear" w:color="auto" w:fill="F4F7FB"/>
+          </w:tcPr>
+          <w:p>
+            <w:pPr>
+              <w:spacing w:after="40"/>
+            </w:pPr>
+            <w:r>
+              <w:rPr>
+                <w:b w:val="0"/>
+                <w:i w:val="0"/>
+                <w:sz w:val="20"/>
+              </w:rPr>
+              <w:t xml:space="preserve">Total business income and total business expenses for the year.</w:t>
+            </w:r>
+          </w:p>
+        </w:tc>
+        <w:tc>
+          <w:tcPr>
+            <w:tcW w:type="dxa" w:w="2260"/>
+            <w:shd w:val="clear" w:color="auto" w:fill="F4F7FB"/>
+          </w:tcPr>
+          <w:p>
+            <w:pPr>
+              <w:spacing w:after="40"/>
+            </w:pPr>
+            <w:r>
+              <w:rPr>
+                <w:b w:val="0"/>
+                <w:i w:val="0"/>
+                <w:sz w:val="20"/>
+              </w:rPr>
+              <w:t xml:space="preserve">Your books. The Insights and Banking tabs help.</w:t>
+            </w:r>
+          </w:p>
+        </w:tc>
+      </w:tr>
+      <w:tr>
+        <w:tc>
+          <w:tcPr>
+            <w:tcW w:type="dxa" w:w="1800"/>
+          </w:tcPr>
+          <w:p>
+            <w:pPr>
+              <w:spacing w:after="40"/>
+            </w:pPr>
+            <w:r>
+              <w:rPr>
+                <w:b/>
+                <w:i w:val="0"/>
+                <w:sz w:val="20"/>
+              </w:rPr>
+              <w:t xml:space="preserve">Deductions and credits</w:t>
+            </w:r>
+          </w:p>
+        </w:tc>
+        <w:tc>
+          <w:tcPr>
+            <w:tcW w:type="dxa" w:w="5300"/>
+          </w:tcPr>
+          <w:p>
+            <w:pPr>
+              <w:spacing w:after="40"/>
+            </w:pPr>
+            <w:r>
+              <w:rPr>
+                <w:b w:val="0"/>
+                <w:i w:val="0"/>
+                <w:sz w:val="20"/>
+              </w:rPr>
+              <w:t xml:space="preserve">US: student loan interest, education expenses, itemized deductions and other adjustments. Canada: RRSP and FHSA, child care, tuition, donations.</w:t>
+            </w:r>
+          </w:p>
+        </w:tc>
+        <w:tc>
+          <w:tcPr>
+            <w:tcW w:type="dxa" w:w="2260"/>
+          </w:tcPr>
+          <w:p>
+            <w:pPr>
+              <w:spacing w:after="40"/>
+            </w:pPr>
+            <w:r>
+              <w:rPr>
+                <w:b w:val="0"/>
+                <w:i w:val="0"/>
+                <w:sz w:val="20"/>
+              </w:rPr>
+              <w:t xml:space="preserve">Receipts, 1098-E, 1098-T, T2202</w:t>
+            </w:r>
+          </w:p>
+        </w:tc>
+      </w:tr>
+      <w:tr>
+        <w:tc>
+          <w:tcPr>
+            <w:tcW w:type="dxa" w:w="1800"/>
+            <w:shd w:val="clear" w:color="auto" w:fill="F4F7FB"/>
+          </w:tcPr>
+          <w:p>
+            <w:pPr>
+              <w:spacing w:after="40"/>
+            </w:pPr>
+            <w:r>
+              <w:rPr>
+                <w:b/>
+                <w:i w:val="0"/>
+                <w:sz w:val="20"/>
+              </w:rPr>
+              <w:t xml:space="preserve">Payments</w:t>
+            </w:r>
+          </w:p>
+        </w:tc>
+        <w:tc>
+          <w:tcPr>
+            <w:tcW w:type="dxa" w:w="5300"/>
+            <w:shd w:val="clear" w:color="auto" w:fill="F4F7FB"/>
+          </w:tcPr>
+          <w:p>
+            <w:pPr>
+              <w:spacing w:after="40"/>
+            </w:pPr>
+            <w:r>
+              <w:rPr>
+                <w:b w:val="0"/>
+                <w:i w:val="0"/>
+                <w:sz w:val="20"/>
+              </w:rPr>
+              <w:t xml:space="preserve">Tax you already paid: other withholding, estimated tax payments or instalments.</w:t>
+            </w:r>
+          </w:p>
+        </w:tc>
+        <w:tc>
+          <w:tcPr>
+            <w:tcW w:type="dxa" w:w="2260"/>
+            <w:shd w:val="clear" w:color="auto" w:fill="F4F7FB"/>
+          </w:tcPr>
+          <w:p>
+            <w:pPr>
+              <w:spacing w:after="40"/>
+            </w:pPr>
+            <w:r>
+              <w:rPr>
+                <w:b w:val="0"/>
+                <w:i w:val="0"/>
+                <w:sz w:val="20"/>
+              </w:rPr>
+              <w:t xml:space="preserve">Bank records and last year’s return</w:t>
+            </w:r>
+          </w:p>
+        </w:tc>
+      </w:tr>
+      <w:tr>
+        <w:tc>
+          <w:tcPr>
+            <w:tcW w:type="dxa" w:w="1800"/>
+          </w:tcPr>
+          <w:p>
+            <w:pPr>
+              <w:spacing w:after="40"/>
+            </w:pPr>
+            <w:r>
+              <w:rPr>
+                <w:b/>
+                <w:i w:val="0"/>
+                <w:sz w:val="20"/>
+              </w:rPr>
+              <w:t xml:space="preserve">Your state (US)</w:t>
+            </w:r>
+          </w:p>
+        </w:tc>
+        <w:tc>
+          <w:tcPr>
+            <w:tcW w:type="dxa" w:w="5300"/>
+          </w:tcPr>
+          <w:p>
+            <w:pPr>
+              <w:spacing w:after="40"/>
+            </w:pPr>
+            <w:r>
+              <w:rPr>
+                <w:b w:val="0"/>
+                <w:i w:val="0"/>
+                <w:sz w:val="20"/>
+              </w:rPr>
+              <w:t xml:space="preserve">The state you lived in on December 31, and state tax withheld or paid.</w:t>
+            </w:r>
+          </w:p>
+        </w:tc>
+        <w:tc>
+          <w:tcPr>
+            <w:tcW w:type="dxa" w:w="2260"/>
+          </w:tcPr>
+          <w:p>
+            <w:pPr>
+              <w:spacing w:after="40"/>
+            </w:pPr>
+            <w:r>
+              <w:rPr>
+                <w:b w:val="0"/>
+                <w:i w:val="0"/>
+                <w:sz w:val="20"/>
+              </w:rPr>
+              <w:t xml:space="preserve">W-2 box 17</w:t>
+            </w:r>
+          </w:p>
+        </w:tc>
+      </w:tr>
+    </w:tbl>
+    <w:p>
+      <w:pPr>
+        <w:spacing w:after="40"/>
+      </w:pPr>
+    </w:p>
+    <w:tbl>
+      <w:tblPr>
+        <w:tblW w:type="auto" w:w="0"/>
+        <w:jc w:val="center"/>
+        <w:tblLook w:firstColumn="1" w:firstRow="1" w:lastColumn="0" w:lastRow="0" w:noHBand="0" w:noVBand="1" w:val="04A0"/>
+      </w:tblPr>
+      <w:tblGrid>
+        <w:gridCol w:w="9360"/>
+      </w:tblGrid>
+      <w:tr>
+        <w:tc>
+          <w:tcPr>
+            <w:tcW w:type="dxa" w:w="9360"/>
+            <w:tcBorders>
+              <w:left w:val="single" w:sz="24" w:color="1D4ED8"/>
+            </w:tcBorders>
+            <w:shd w:val="clear" w:color="auto" w:fill="EAF1FF"/>
+          </w:tcPr>
+          <w:p>
+            <w:pPr>
+              <w:spacing w:after="40"/>
+            </w:pPr>
+            <w:r>
+              <w:rPr>
+                <w:b/>
+                <w:color w:val="1D4ED8"/>
+              </w:rPr>
+              <w:t xml:space="preserve">Tip  </w:t>
+            </w:r>
+            <w:r>
+              <w:rPr>
+                <w:b w:val="0"/>
+                <w:i w:val="0"/>
+              </w:rPr>
+              <w:t xml:space="preserve">Use a </w:t>
+            </w:r>
+            <w:r>
+              <w:rPr>
+                <w:b/>
+                <w:i w:val="0"/>
+              </w:rPr>
+              <w:t xml:space="preserve">minus sign</w:t>
+            </w:r>
+            <w:r>
+              <w:rPr>
+                <w:b w:val="0"/>
+                <w:i w:val="0"/>
+              </w:rPr>
+              <w:t xml:space="preserve"> for a loss, for example a capital loss. Leave a box empty if it does not apply. You never have to enter a zero.</w:t>
+            </w:r>
+          </w:p>
+        </w:tc>
+      </w:tr>
+    </w:tbl>
+    <w:p>
+      <w:pPr>
+        <w:spacing w:after="40"/>
+      </w:pPr>
+    </w:p>
+    <w:p>
+      <w:pPr>
+        <w:pStyle w:val="Heading2"/>
+      </w:pPr>
+      <w:r>
+        <w:t>12.4 Upload a W-2 or T4</w:t>
+      </w:r>
+    </w:p>
+    <w:p>
+      <w:r>
+        <w:rPr>
+          <w:b w:val="0"/>
+          <w:i w:val="0"/>
+        </w:rPr>
+        <w:t xml:space="preserve">On the job-income page, </w:t>
+      </w:r>
+      <w:r>
+        <w:rPr>
+          <w:b/>
+          <w:i w:val="0"/>
+        </w:rPr>
+        <w:t xml:space="preserve">Upload W-2</w:t>
+      </w:r>
+      <w:r>
+        <w:rPr>
+          <w:b w:val="0"/>
+          <w:i w:val="0"/>
+        </w:rPr>
+        <w:t xml:space="preserve"> (United States) or </w:t>
+      </w:r>
+      <w:r>
+        <w:rPr>
+          <w:b/>
+          <w:i w:val="0"/>
+        </w:rPr>
+        <w:t xml:space="preserve">Upload T4</w:t>
+      </w:r>
+      <w:r>
+        <w:rPr>
+          <w:b w:val="0"/>
+          <w:i w:val="0"/>
+        </w:rPr>
+        <w:t xml:space="preserve"> (Canada) reads the boxes from a photo or PDF so you do not type them.</w:t>
+      </w:r>
+    </w:p>
+    <w:p>
+      <w:pPr>
+        <w:pStyle w:val="ListNumber"/>
+        <w:numPr>
+          <w:ilvl w:val="0"/>
+          <w:numId w:val="31"/>
+        </w:numPr>
+      </w:pPr>
+      <w:r>
+        <w:rPr>
+          <w:b w:val="0"/>
+          <w:i w:val="0"/>
+        </w:rPr>
+        <w:t xml:space="preserve">Press </w:t>
+      </w:r>
+      <w:r>
+        <w:rPr>
+          <w:b/>
+          <w:i w:val="0"/>
+        </w:rPr>
+        <w:t xml:space="preserve">Upload W-2</w:t>
+      </w:r>
+      <w:r>
+        <w:rPr>
+          <w:b w:val="0"/>
+          <w:i w:val="0"/>
+        </w:rPr>
+        <w:t xml:space="preserve"> or </w:t>
+      </w:r>
+      <w:r>
+        <w:rPr>
+          <w:b/>
+          <w:i w:val="0"/>
+        </w:rPr>
+        <w:t xml:space="preserve">Upload T4</w:t>
+      </w:r>
+      <w:r>
+        <w:rPr>
+          <w:b w:val="0"/>
+          <w:i w:val="0"/>
+        </w:rPr>
+        <w:t xml:space="preserve"> and choose a PNG, JPG or PDF up to 4 MB. A straight-on, well-lit photo works best.</w:t>
+      </w:r>
+    </w:p>
+    <w:p>
+      <w:pPr>
+        <w:pStyle w:val="ListNumber"/>
+        <w:numPr>
+          <w:ilvl w:val="0"/>
+          <w:numId w:val="31"/>
+        </w:numPr>
+      </w:pPr>
+      <w:r>
+        <w:rPr>
+          <w:b w:val="0"/>
+          <w:i w:val="0"/>
+        </w:rPr>
+        <w:t xml:space="preserve">Check the amounts under </w:t>
+      </w:r>
+      <w:r>
+        <w:rPr>
+          <w:b/>
+          <w:i w:val="0"/>
+        </w:rPr>
+        <w:t xml:space="preserve">Check what we read</w:t>
+      </w:r>
+      <w:r>
+        <w:rPr>
+          <w:b w:val="0"/>
+          <w:i w:val="0"/>
+        </w:rPr>
+        <w:t xml:space="preserve">. You can correct any number. A </w:t>
+      </w:r>
+      <w:r>
+        <w:rPr>
+          <w:b/>
+          <w:i w:val="0"/>
+        </w:rPr>
+        <w:t xml:space="preserve">Check</w:t>
+      </w:r>
+      <w:r>
+        <w:rPr>
+          <w:b w:val="0"/>
+          <w:i w:val="0"/>
+        </w:rPr>
+        <w:t xml:space="preserve"> warning means something looks wrong, for example tax withheld larger than wages.</w:t>
+      </w:r>
+    </w:p>
+    <w:p>
+      <w:pPr>
+        <w:pStyle w:val="ListNumber"/>
+        <w:numPr>
+          <w:ilvl w:val="0"/>
+          <w:numId w:val="31"/>
+        </w:numPr>
+      </w:pPr>
+      <w:r>
+        <w:rPr>
+          <w:b w:val="0"/>
+          <w:i w:val="0"/>
+        </w:rPr>
+        <w:t xml:space="preserve">Press </w:t>
+      </w:r>
+      <w:r>
+        <w:rPr>
+          <w:b/>
+          <w:i w:val="0"/>
+        </w:rPr>
+        <w:t xml:space="preserve">Add to my return</w:t>
+      </w:r>
+      <w:r>
+        <w:rPr>
+          <w:b w:val="0"/>
+          <w:i w:val="0"/>
+        </w:rPr>
+        <w:t xml:space="preserve">. The amounts are </w:t>
+      </w:r>
+      <w:r>
+        <w:rPr>
+          <w:b/>
+          <w:i w:val="0"/>
+        </w:rPr>
+        <w:t xml:space="preserve">added</w:t>
+      </w:r>
+      <w:r>
+        <w:rPr>
+          <w:b w:val="0"/>
+          <w:i w:val="0"/>
+        </w:rPr>
+        <w:t xml:space="preserve"> to what is already entered.</w:t>
+      </w:r>
+    </w:p>
+    <w:p>
+      <w:pPr>
+        <w:pStyle w:val="ListNumber"/>
+        <w:numPr>
+          <w:ilvl w:val="0"/>
+          <w:numId w:val="31"/>
+        </w:numPr>
+      </w:pPr>
+      <w:r>
+        <w:rPr>
+          <w:b w:val="0"/>
+          <w:i w:val="0"/>
+        </w:rPr>
+        <w:t xml:space="preserve">Had more than one job? Press </w:t>
+      </w:r>
+      <w:r>
+        <w:rPr>
+          <w:b/>
+          <w:i w:val="0"/>
+        </w:rPr>
+        <w:t xml:space="preserve">Upload another W-2</w:t>
+      </w:r>
+      <w:r>
+        <w:rPr>
+          <w:b w:val="0"/>
+          <w:i w:val="0"/>
+        </w:rPr>
+        <w:t xml:space="preserve"> (or T4). Each slip adds to the totals.</w:t>
+      </w:r>
+    </w:p>
+    <w:tbl>
+      <w:tblPr>
+        <w:tblW w:type="auto" w:w="0"/>
+        <w:jc w:val="center"/>
+        <w:tblLook w:firstColumn="1" w:firstRow="1" w:lastColumn="0" w:lastRow="0" w:noHBand="0" w:noVBand="1" w:val="04A0"/>
+      </w:tblPr>
+      <w:tblGrid>
+        <w:gridCol w:w="9360"/>
+      </w:tblGrid>
+      <w:tr>
+        <w:tc>
+          <w:tcPr>
+            <w:tcW w:type="dxa" w:w="9360"/>
+            <w:tcBorders>
+              <w:left w:val="single" w:sz="24" w:color="D97706"/>
+            </w:tcBorders>
+            <w:shd w:val="clear" w:color="auto" w:fill="FFF6E5"/>
+          </w:tcPr>
+          <w:p>
+            <w:pPr>
+              <w:spacing w:after="40"/>
+            </w:pPr>
+            <w:r>
+              <w:rPr>
+                <w:b/>
+                <w:color w:val="D97706"/>
+              </w:rPr>
+              <w:t xml:space="preserve">Caution  </w:t>
+            </w:r>
+            <w:r>
+              <w:rPr>
+                <w:b w:val="0"/>
+                <w:i w:val="0"/>
+              </w:rPr>
+              <w:t xml:space="preserve">Claude reads the slip, so </w:t>
+            </w:r>
+            <w:r>
+              <w:rPr>
+                <w:b/>
+                <w:i w:val="0"/>
+              </w:rPr>
+              <w:t xml:space="preserve">always compare the numbers with the paper slip</w:t>
+            </w:r>
+            <w:r>
+              <w:rPr>
+                <w:b w:val="0"/>
+                <w:i w:val="0"/>
+              </w:rPr>
+              <w:t xml:space="preserve"> before you add them. The file is sent to Claude to be read and is not stored. This needs the Anthropic key to be set (Part 14, 14.1). Without it, type the boxes in.</w:t>
+            </w:r>
+          </w:p>
+        </w:tc>
+      </w:tr>
+    </w:tbl>
+    <w:p>
+      <w:pPr>
+        <w:spacing w:after="40"/>
+      </w:pPr>
+    </w:p>
+    <w:p>
+      <w:pPr>
+        <w:pStyle w:val="Heading2"/>
+      </w:pPr>
+      <w:r>
+        <w:t>12.5 The refund meter</w:t>
+      </w:r>
+    </w:p>
+    <w:p>
+      <w:r>
+        <w:rPr>
+          <w:b w:val="0"/>
+          <w:i w:val="0"/>
+        </w:rPr>
+        <w:t xml:space="preserve">The panel on the right updates as you type. It shows your </w:t>
+      </w:r>
+      <w:r>
+        <w:rPr>
+          <w:b/>
+          <w:i w:val="0"/>
+        </w:rPr>
+        <w:t xml:space="preserve">estimated refund</w:t>
+      </w:r>
+      <w:r>
+        <w:rPr>
+          <w:b w:val="0"/>
+          <w:i w:val="0"/>
+        </w:rPr>
+        <w:t xml:space="preserve"> (green) or </w:t>
+      </w:r>
+      <w:r>
+        <w:rPr>
+          <w:b/>
+          <w:i w:val="0"/>
+        </w:rPr>
+        <w:t xml:space="preserve">amount owing</w:t>
+      </w:r>
+      <w:r>
+        <w:rPr>
+          <w:b w:val="0"/>
+          <w:i w:val="0"/>
+        </w:rPr>
+        <w:t xml:space="preserve"> (red), then total income, taxable income, total tax, what you have already paid, your </w:t>
+      </w:r>
+      <w:r>
+        <w:rPr>
+          <w:b/>
+          <w:i w:val="0"/>
+        </w:rPr>
+        <w:t xml:space="preserve">average rate</w:t>
+      </w:r>
+      <w:r>
+        <w:rPr>
+          <w:b w:val="0"/>
+          <w:i w:val="0"/>
+        </w:rPr>
+        <w:t xml:space="preserve"> and the rate on your </w:t>
+      </w:r>
+      <w:r>
+        <w:rPr>
+          <w:b/>
+          <w:i w:val="0"/>
+        </w:rPr>
+        <w:t xml:space="preserve">next dollar</w:t>
+      </w:r>
+      <w:r>
+        <w:rPr>
+          <w:b w:val="0"/>
+          <w:i w:val="0"/>
+        </w:rPr>
+        <w:t xml:space="preserve"> of income. The next-dollar rate is the rate you would pay on an extra dollar of income, so it tells you what a deduction or a contribution is worth.</w:t>
+      </w:r>
+    </w:p>
+    <w:p>
+      <w:pPr>
+        <w:pStyle w:val="Heading2"/>
+      </w:pPr>
+      <w:r>
+        <w:t>12.6 Review</w:t>
+      </w:r>
+    </w:p>
+    <w:p>
+      <w:r>
+        <w:rPr>
+          <w:b w:val="0"/>
+          <w:i w:val="0"/>
+        </w:rPr>
+        <w:t xml:space="preserve">The </w:t>
+      </w:r>
+      <w:r>
+        <w:rPr>
+          <w:b/>
+          <w:i w:val="0"/>
+        </w:rPr>
+        <w:t xml:space="preserve">Review</w:t>
+      </w:r>
+      <w:r>
+        <w:rPr>
+          <w:b w:val="0"/>
+          <w:i w:val="0"/>
+        </w:rPr>
+        <w:t xml:space="preserve"> page checks your answers and lists what to look at. A </w:t>
+      </w:r>
+      <w:r>
+        <w:rPr>
+          <w:b/>
+          <w:i w:val="0"/>
+        </w:rPr>
+        <w:t xml:space="preserve">Check</w:t>
+      </w:r>
+      <w:r>
+        <w:rPr>
+          <w:b w:val="0"/>
+          <w:i w:val="0"/>
+        </w:rPr>
+        <w:t xml:space="preserve"> is worth fixing before you file. A </w:t>
+      </w:r>
+      <w:r>
+        <w:rPr>
+          <w:b/>
+          <w:i w:val="0"/>
+        </w:rPr>
+        <w:t xml:space="preserve">Tip</w:t>
+      </w:r>
+      <w:r>
+        <w:rPr>
+          <w:b w:val="0"/>
+          <w:i w:val="0"/>
+        </w:rPr>
+        <w:t xml:space="preserve"> is a way to save tax, such as an RRSP contribution, paying estimated tax next year or changing your paycheque withholding. A </w:t>
+      </w:r>
+      <w:r>
+        <w:rPr>
+          <w:b/>
+          <w:i w:val="0"/>
+        </w:rPr>
+        <w:t xml:space="preserve">Note</w:t>
+      </w:r>
+      <w:r>
+        <w:rPr>
+          <w:b w:val="0"/>
+          <w:i w:val="0"/>
+        </w:rPr>
+        <w:t xml:space="preserve"> explains a result, such as a deduction limit. The same page lists </w:t>
+      </w:r>
+      <w:r>
+        <w:rPr>
+          <w:b/>
+          <w:i w:val="0"/>
+        </w:rPr>
+        <w:t xml:space="preserve">Not included in this version</w:t>
+      </w:r>
+      <w:r>
+        <w:rPr>
+          <w:b w:val="0"/>
+          <w:i w:val="0"/>
+        </w:rPr>
+        <w:t xml:space="preserve">, so you can see what you must work out some other way.</w:t>
+      </w:r>
+    </w:p>
+    <w:p>
+      <w:pPr>
+        <w:pStyle w:val="Heading2"/>
+      </w:pPr>
+      <w:r>
+        <w:t>12.7 Your return</w:t>
+      </w:r>
+    </w:p>
+    <w:p>
+      <w:r>
+        <w:rPr>
+          <w:b/>
+          <w:i w:val="0"/>
+        </w:rPr>
+        <w:t xml:space="preserve">See my return</w:t>
+      </w:r>
+      <w:r>
+        <w:rPr>
+          <w:b w:val="0"/>
+          <w:i w:val="0"/>
+        </w:rPr>
+        <w:t xml:space="preserve"> shows every line with the form it belongs on. Use </w:t>
+      </w:r>
+      <w:r>
+        <w:rPr>
+          <w:b/>
+          <w:i w:val="0"/>
+        </w:rPr>
+        <w:t xml:space="preserve">Print or save as PDF</w:t>
+      </w:r>
+      <w:r>
+        <w:rPr>
+          <w:b w:val="0"/>
+          <w:i w:val="0"/>
+        </w:rPr>
+        <w:t xml:space="preserve"> to keep a copy or give it to a preparer, and </w:t>
+      </w:r>
+      <w:r>
+        <w:rPr>
+          <w:b/>
+          <w:i w:val="0"/>
+        </w:rPr>
+        <w:t xml:space="preserve">Mark ready to file</w:t>
+      </w:r>
+      <w:r>
+        <w:rPr>
+          <w:b w:val="0"/>
+          <w:i w:val="0"/>
+        </w:rPr>
+        <w:t xml:space="preserve"> when you have checked it. You can return it to a draft at any time. Keep your slips and receipts for six years.</w:t>
+      </w:r>
+    </w:p>
+    <w:p>
+      <w:pPr>
+        <w:pStyle w:val="Heading2"/>
+      </w:pPr>
+      <w:r>
+        <w:t>12.8 What is and is not covered</w:t>
+      </w:r>
+    </w:p>
+    <w:tbl>
+      <w:tblPr>
+        <w:tblW w:type="auto" w:w="0"/>
+        <w:jc w:val="center"/>
+        <w:tblBorders>
+          <w:top w:val="single" w:sz="4" w:space="0" w:color="C9D1DC"/>
+          <w:left w:val="single" w:sz="4" w:space="0" w:color="C9D1DC"/>
+          <w:bottom w:val="single" w:sz="4" w:space="0" w:color="C9D1DC"/>
+          <w:right w:val="single" w:sz="4" w:space="0" w:color="C9D1DC"/>
+          <w:insideH w:val="single" w:sz="4" w:space="0" w:color="C9D1DC"/>
+          <w:insideV w:val="single" w:sz="4" w:space="0" w:color="C9D1DC"/>
+        </w:tblBorders>
+        <w:tblLook w:firstColumn="1" w:firstRow="1" w:lastColumn="0" w:lastRow="0" w:noHBand="0" w:noVBand="1" w:val="04A0"/>
+      </w:tblPr>
+      <w:tblGrid>
+        <w:gridCol w:w="1800"/>
+        <w:gridCol w:w="4100"/>
+        <w:gridCol w:w="3460"/>
+      </w:tblGrid>
+      <w:tr>
+        <w:trPr>
+          <w:tblHeader w:val="true"/>
+        </w:trPr>
+        <w:tc>
+          <w:tcPr>
+            <w:tcW w:type="dxa" w:w="1800"/>
+            <w:shd w:val="clear" w:color="auto" w:fill="0F2A4A"/>
+          </w:tcPr>
+          <w:p>
+            <w:r>
+              <w:rPr>
+                <w:b/>
+                <w:color w:val="FFFFFF"/>
+                <w:sz w:val="20"/>
+              </w:rPr>
+              <w:t>Area</w:t>
+            </w:r>
+          </w:p>
+        </w:tc>
+        <w:tc>
+          <w:tcPr>
+            <w:tcW w:type="dxa" w:w="4100"/>
+            <w:shd w:val="clear" w:color="auto" w:fill="0F2A4A"/>
+          </w:tcPr>
+          <w:p>
+            <w:r>
+              <w:rPr>
+                <w:b/>
+                <w:color w:val="FFFFFF"/>
+                <w:sz w:val="20"/>
+              </w:rPr>
+              <w:t>Covered</w:t>
+            </w:r>
+          </w:p>
+        </w:tc>
+        <w:tc>
+          <w:tcPr>
+            <w:tcW w:type="dxa" w:w="3460"/>
+            <w:shd w:val="clear" w:color="auto" w:fill="0F2A4A"/>
+          </w:tcPr>
+          <w:p>
+            <w:r>
+              <w:rPr>
+                <w:b/>
+                <w:color w:val="FFFFFF"/>
+                <w:sz w:val="20"/>
+              </w:rPr>
+              <w:t>Not covered</w:t>
+            </w:r>
+          </w:p>
+        </w:tc>
+      </w:tr>
+      <w:tr>
+        <w:tc>
+          <w:tcPr>
+            <w:tcW w:type="dxa" w:w="1800"/>
+          </w:tcPr>
+          <w:p>
+            <w:pPr>
+              <w:spacing w:after="40"/>
+            </w:pPr>
+            <w:r>
+              <w:rPr>
+                <w:b/>
+                <w:i w:val="0"/>
+                <w:sz w:val="20"/>
+              </w:rPr>
+              <w:t xml:space="preserve">United States federal</w:t>
+            </w:r>
+          </w:p>
+        </w:tc>
+        <w:tc>
+          <w:tcPr>
+            <w:tcW w:type="dxa" w:w="4100"/>
+          </w:tcPr>
+          <w:p>
+            <w:pPr>
+              <w:spacing w:after="40"/>
+            </w:pPr>
+            <w:r>
+              <w:rPr>
+                <w:b w:val="0"/>
+                <w:i w:val="0"/>
+                <w:sz w:val="20"/>
+              </w:rPr>
+              <w:t xml:space="preserve">Wages, interest, dividends and capital gains at the right rates, self-employment (Schedule C and SE), standard or itemized deduction, senior deduction, the qualified business income deduction in the simple case, child tax credit, </w:t>
+            </w:r>
+            <w:r>
+              <w:rPr>
+                <w:b/>
+                <w:i w:val="0"/>
+                <w:sz w:val="20"/>
+              </w:rPr>
+              <w:t xml:space="preserve">earned income credit</w:t>
+            </w:r>
+            <w:r>
+              <w:rPr>
+                <w:b w:val="0"/>
+                <w:i w:val="0"/>
+                <w:sz w:val="20"/>
+              </w:rPr>
+              <w:t xml:space="preserve">, </w:t>
+            </w:r>
+            <w:r>
+              <w:rPr>
+                <w:b/>
+                <w:i w:val="0"/>
+                <w:sz w:val="20"/>
+              </w:rPr>
+              <w:t xml:space="preserve">education credits</w:t>
+            </w:r>
+            <w:r>
+              <w:rPr>
+                <w:b w:val="0"/>
+                <w:i w:val="0"/>
+                <w:sz w:val="20"/>
+              </w:rPr>
+              <w:t xml:space="preserve"> (American opportunity and lifetime learning), student loan interest, additional Medicare tax, net investment income tax.</w:t>
+            </w:r>
+          </w:p>
+        </w:tc>
+        <w:tc>
+          <w:tcPr>
+            <w:tcW w:type="dxa" w:w="3460"/>
+          </w:tcPr>
+          <w:p>
+            <w:pPr>
+              <w:spacing w:after="40"/>
+            </w:pPr>
+            <w:r>
+              <w:rPr>
+                <w:b w:val="0"/>
+                <w:i w:val="0"/>
+                <w:sz w:val="20"/>
+              </w:rPr>
+              <w:t xml:space="preserve">Retirement-saver credit, dependent care credit, energy credits, alternative minimum tax, underpayment penalty, the new tips, overtime and car-loan-interest deductions, the qualified business income deduction at high incomes.</w:t>
+            </w:r>
+          </w:p>
+        </w:tc>
+      </w:tr>
+      <w:tr>
+        <w:tc>
+          <w:tcPr>
+            <w:tcW w:type="dxa" w:w="1800"/>
+            <w:shd w:val="clear" w:color="auto" w:fill="F4F7FB"/>
+          </w:tcPr>
+          <w:p>
+            <w:pPr>
+              <w:spacing w:after="40"/>
+            </w:pPr>
+            <w:r>
+              <w:rPr>
+                <w:b/>
+                <w:i w:val="0"/>
+                <w:sz w:val="20"/>
+              </w:rPr>
+              <w:t xml:space="preserve">United States state</w:t>
+            </w:r>
+          </w:p>
+        </w:tc>
+        <w:tc>
+          <w:tcPr>
+            <w:tcW w:type="dxa" w:w="4100"/>
+            <w:shd w:val="clear" w:color="auto" w:fill="F4F7FB"/>
+          </w:tcPr>
+          <w:p>
+            <w:pPr>
+              <w:spacing w:after="40"/>
+            </w:pPr>
+            <w:r>
+              <w:rPr>
+                <w:b w:val="0"/>
+                <w:i w:val="0"/>
+                <w:sz w:val="20"/>
+              </w:rPr>
+              <w:t xml:space="preserve">An </w:t>
+            </w:r>
+            <w:r>
+              <w:rPr>
+                <w:b/>
+                <w:i w:val="0"/>
+                <w:sz w:val="20"/>
+              </w:rPr>
+              <w:t xml:space="preserve">estimate</w:t>
+            </w:r>
+            <w:r>
+              <w:rPr>
+                <w:b w:val="0"/>
+                <w:i w:val="0"/>
+                <w:sz w:val="20"/>
+              </w:rPr>
+              <w:t xml:space="preserve"> for every state and DC from published 2025 rates, standard deduction and exemptions.</w:t>
+            </w:r>
+          </w:p>
+        </w:tc>
+        <w:tc>
+          <w:tcPr>
+            <w:tcW w:type="dxa" w:w="3460"/>
+            <w:shd w:val="clear" w:color="auto" w:fill="F4F7FB"/>
+          </w:tcPr>
+          <w:p>
+            <w:pPr>
+              <w:spacing w:after="40"/>
+            </w:pPr>
+            <w:r>
+              <w:rPr>
+                <w:b w:val="0"/>
+                <w:i w:val="0"/>
+                <w:sz w:val="20"/>
+              </w:rPr>
+              <w:t xml:space="preserve">State-specific credits and adjustments, local taxes, and rate changes made after January 1, 2025. Washington’s capital gains tax is not estimated. Check your state return.</w:t>
+            </w:r>
+          </w:p>
+        </w:tc>
+      </w:tr>
+      <w:tr>
+        <w:tc>
+          <w:tcPr>
+            <w:tcW w:type="dxa" w:w="1800"/>
+          </w:tcPr>
+          <w:p>
+            <w:pPr>
+              <w:spacing w:after="40"/>
+            </w:pPr>
+            <w:r>
+              <w:rPr>
+                <w:b/>
+                <w:i w:val="0"/>
+                <w:sz w:val="20"/>
+              </w:rPr>
+              <w:t xml:space="preserve">Canada federal</w:t>
+            </w:r>
+          </w:p>
+        </w:tc>
+        <w:tc>
+          <w:tcPr>
+            <w:tcW w:type="dxa" w:w="4100"/>
+          </w:tcPr>
+          <w:p>
+            <w:pPr>
+              <w:spacing w:after="40"/>
+            </w:pPr>
+            <w:r>
+              <w:rPr>
+                <w:b w:val="0"/>
+                <w:i w:val="0"/>
+                <w:sz w:val="20"/>
+              </w:rPr>
+              <w:t xml:space="preserve">Employment, self-employment (both halves of CPP), investments and dividends, capital gains, RRSP, FHSA, child care, basic personal, age, spouse, tuition, donation, CPP and EI credits.</w:t>
+            </w:r>
+          </w:p>
+        </w:tc>
+        <w:tc>
+          <w:tcPr>
+            <w:tcW w:type="dxa" w:w="3460"/>
+          </w:tcPr>
+          <w:p>
+            <w:pPr>
+              <w:spacing w:after="40"/>
+            </w:pPr>
+            <w:r>
+              <w:rPr>
+                <w:b w:val="0"/>
+                <w:i w:val="0"/>
+                <w:sz w:val="20"/>
+              </w:rPr>
+              <w:t xml:space="preserve">Medical expenses, disability amount, moving expenses, pension income amount, Canada Workers Benefit and the GST/HST credit.</w:t>
+            </w:r>
+          </w:p>
+        </w:tc>
+      </w:tr>
+      <w:tr>
+        <w:tc>
+          <w:tcPr>
+            <w:tcW w:type="dxa" w:w="1800"/>
+            <w:shd w:val="clear" w:color="auto" w:fill="F4F7FB"/>
+          </w:tcPr>
+          <w:p>
+            <w:pPr>
+              <w:spacing w:after="40"/>
+            </w:pPr>
+            <w:r>
+              <w:rPr>
+                <w:b/>
+                <w:i w:val="0"/>
+                <w:sz w:val="20"/>
+              </w:rPr>
+              <w:t xml:space="preserve">Canada provincial</w:t>
+            </w:r>
+          </w:p>
+        </w:tc>
+        <w:tc>
+          <w:tcPr>
+            <w:tcW w:type="dxa" w:w="4100"/>
+            <w:shd w:val="clear" w:color="auto" w:fill="F4F7FB"/>
+          </w:tcPr>
+          <w:p>
+            <w:pPr>
+              <w:spacing w:after="40"/>
+            </w:pPr>
+            <w:r>
+              <w:rPr>
+                <w:b w:val="0"/>
+                <w:i w:val="0"/>
+                <w:sz w:val="20"/>
+              </w:rPr>
+              <w:t xml:space="preserve">Every province and territory </w:t>
+            </w:r>
+            <w:r>
+              <w:rPr>
+                <w:b/>
+                <w:i w:val="0"/>
+                <w:sz w:val="20"/>
+              </w:rPr>
+              <w:t xml:space="preserve">except Quebec</w:t>
+            </w:r>
+            <w:r>
+              <w:rPr>
+                <w:b w:val="0"/>
+                <w:i w:val="0"/>
+                <w:sz w:val="20"/>
+              </w:rPr>
+              <w:t xml:space="preserve">: brackets, basic personal amount, CPP and EI credits, and Ontario’s surtax and Health Premium.</w:t>
+            </w:r>
+          </w:p>
+        </w:tc>
+        <w:tc>
+          <w:tcPr>
+            <w:tcW w:type="dxa" w:w="3460"/>
+            <w:shd w:val="clear" w:color="auto" w:fill="F4F7FB"/>
+          </w:tcPr>
+          <w:p>
+            <w:pPr>
+              <w:spacing w:after="40"/>
+            </w:pPr>
+            <w:r>
+              <w:rPr>
+                <w:b w:val="0"/>
+                <w:i w:val="0"/>
+                <w:sz w:val="20"/>
+              </w:rPr>
+              <w:t xml:space="preserve">Other provincial credits, low-income reductions and Alberta’s supplemental credit, so provincial tax can be a little high. Quebec has its own return (TP-1).</w:t>
+            </w:r>
+          </w:p>
+        </w:tc>
+      </w:tr>
+    </w:tbl>
+    <w:p>
+      <w:pPr>
+        <w:spacing w:after="40"/>
+      </w:pPr>
+    </w:p>
+    <w:tbl>
+      <w:tblPr>
+        <w:tblW w:type="auto" w:w="0"/>
+        <w:jc w:val="center"/>
+        <w:tblLook w:firstColumn="1" w:firstRow="1" w:lastColumn="0" w:lastRow="0" w:noHBand="0" w:noVBand="1" w:val="04A0"/>
+      </w:tblPr>
+      <w:tblGrid>
+        <w:gridCol w:w="9360"/>
+      </w:tblGrid>
+      <w:tr>
+        <w:tc>
+          <w:tcPr>
+            <w:tcW w:type="dxa" w:w="9360"/>
+            <w:tcBorders>
+              <w:left w:val="single" w:sz="24" w:color="15803D"/>
+            </w:tcBorders>
+            <w:shd w:val="clear" w:color="auto" w:fill="EAF7EE"/>
+          </w:tcPr>
+          <w:p>
+            <w:pPr>
+              <w:spacing w:after="40"/>
+            </w:pPr>
+            <w:r>
+              <w:rPr>
+                <w:b/>
+                <w:color w:val="15803D"/>
+              </w:rPr>
+              <w:t xml:space="preserve">Rule of thumb  </w:t>
+            </w:r>
+            <w:r>
+              <w:rPr>
+                <w:b w:val="0"/>
+                <w:i w:val="0"/>
+              </w:rPr>
+              <w:t xml:space="preserve">If an item in the Not covered column applies to you, treat the result as an estimate and have a preparer finish the return.</w:t>
+            </w:r>
+          </w:p>
+        </w:tc>
+      </w:tr>
+    </w:tbl>
+    <w:p>
+      <w:pPr>
+        <w:spacing w:after="40"/>
+      </w:pPr>
+    </w:p>
+    <w:p>
+      <w:pPr>
+        <w:pStyle w:val="Heading2"/>
+      </w:pPr>
+      <w:r>
+        <w:t>12.9 Filing the return</w:t>
+      </w:r>
+    </w:p>
+    <w:p>
+      <w:pPr>
+        <w:pStyle w:val="ListBullet"/>
+      </w:pPr>
+      <w:r>
+        <w:rPr>
+          <w:b/>
+          <w:i w:val="0"/>
+        </w:rPr>
+        <w:t xml:space="preserve">United States:</w:t>
+      </w:r>
+      <w:r>
+        <w:rPr>
+          <w:b w:val="0"/>
+          <w:i w:val="0"/>
+        </w:rPr>
+        <w:t xml:space="preserve"> enter the figures in tax software the IRS has approved or give them to a preparer. Many people qualify for the IRS’s free filing options. Your state has its own return.</w:t>
+      </w:r>
+    </w:p>
+    <w:p>
+      <w:pPr>
+        <w:pStyle w:val="ListBullet"/>
+      </w:pPr>
+      <w:r>
+        <w:rPr>
+          <w:b/>
+          <w:i w:val="0"/>
+        </w:rPr>
+        <w:t xml:space="preserve">Canada:</w:t>
+      </w:r>
+      <w:r>
+        <w:rPr>
+          <w:b w:val="0"/>
+          <w:i w:val="0"/>
+        </w:rPr>
+        <w:t xml:space="preserve"> enter the figures in CRA-certified NETFILE software or give them to a preparer. The due date is normally April 30, and June 15 if you or your spouse are self-employed. Any balance owing is still due April 30.</w:t>
+      </w:r>
+    </w:p>
+    <w:p>
+      <w:pPr>
+        <w:pStyle w:val="ListBullet"/>
+      </w:pPr>
+      <w:r>
+        <w:rPr>
+          <w:b w:val="0"/>
+          <w:i w:val="0"/>
+        </w:rPr>
+        <w:t xml:space="preserve">Check the due date for your tax year. Late returns and late payments can carry penalties and interest.</w:t>
+      </w:r>
+    </w:p>
+    <w:tbl>
+      <w:tblPr>
+        <w:tblW w:type="auto" w:w="0"/>
+        <w:jc w:val="center"/>
+        <w:tblLook w:firstColumn="1" w:firstRow="1" w:lastColumn="0" w:lastRow="0" w:noHBand="0" w:noVBand="1" w:val="04A0"/>
+      </w:tblPr>
+      <w:tblGrid>
+        <w:gridCol w:w="9360"/>
+      </w:tblGrid>
+      <w:tr>
+        <w:tc>
+          <w:tcPr>
+            <w:tcW w:type="dxa" w:w="9360"/>
+            <w:tcBorders>
+              <w:left w:val="single" w:sz="24" w:color="D97706"/>
+            </w:tcBorders>
+            <w:shd w:val="clear" w:color="auto" w:fill="FFF6E5"/>
+          </w:tcPr>
+          <w:p>
+            <w:pPr>
+              <w:spacing w:after="40"/>
+            </w:pPr>
+            <w:r>
+              <w:rPr>
+                <w:b/>
+                <w:color w:val="D97706"/>
+              </w:rPr>
+              <w:t xml:space="preserve">Caution  </w:t>
+            </w:r>
+            <w:r>
+              <w:rPr>
+                <w:b w:val="0"/>
+                <w:i w:val="0"/>
+              </w:rPr>
+              <w:t xml:space="preserve">The tax tables for each year are checked against the IRS and CRA published figures before they are loaded. For a year not yet loaded the tab says so. State figures are the least exact part: always compare them with your state’s own return.</w:t>
+            </w:r>
+          </w:p>
+        </w:tc>
+      </w:tr>
+    </w:tbl>
+    <w:p>
+      <w:pPr>
+        <w:spacing w:after="40"/>
+      </w:pPr>
+    </w:p>
+    <w:p>
+      <w:pPr>
+        <w:pStyle w:val="Heading2"/>
+      </w:pPr>
+      <w:r>
+        <w:t>12.10 If something goes wrong</w:t>
+      </w:r>
+    </w:p>
+    <w:tbl>
+      <w:tblPr>
+        <w:tblW w:type="auto" w:w="0"/>
+        <w:jc w:val="center"/>
+        <w:tblBorders>
+          <w:top w:val="single" w:sz="4" w:space="0" w:color="C9D1DC"/>
+          <w:left w:val="single" w:sz="4" w:space="0" w:color="C9D1DC"/>
+          <w:bottom w:val="single" w:sz="4" w:space="0" w:color="C9D1DC"/>
+          <w:right w:val="single" w:sz="4" w:space="0" w:color="C9D1DC"/>
+          <w:insideH w:val="single" w:sz="4" w:space="0" w:color="C9D1DC"/>
+          <w:insideV w:val="single" w:sz="4" w:space="0" w:color="C9D1DC"/>
+        </w:tblBorders>
+        <w:tblLook w:firstColumn="1" w:firstRow="1" w:lastColumn="0" w:lastRow="0" w:noHBand="0" w:noVBand="1" w:val="04A0"/>
+      </w:tblPr>
+      <w:tblGrid>
+        <w:gridCol w:w="3200"/>
+        <w:gridCol w:w="6160"/>
+      </w:tblGrid>
+      <w:tr>
+        <w:trPr>
+          <w:tblHeader w:val="true"/>
+        </w:trPr>
+        <w:tc>
+          <w:tcPr>
+            <w:tcW w:type="dxa" w:w="3200"/>
+            <w:shd w:val="clear" w:color="auto" w:fill="0F2A4A"/>
+          </w:tcPr>
+          <w:p>
+            <w:r>
+              <w:rPr>
+                <w:b/>
+                <w:color w:val="FFFFFF"/>
+                <w:sz w:val="20"/>
+              </w:rPr>
+              <w:t>What you see</w:t>
+            </w:r>
+          </w:p>
+        </w:tc>
+        <w:tc>
+          <w:tcPr>
+            <w:tcW w:type="dxa" w:w="6160"/>
+            <w:shd w:val="clear" w:color="auto" w:fill="0F2A4A"/>
+          </w:tcPr>
+          <w:p>
+            <w:r>
+              <w:rPr>
+                <w:b/>
+                <w:color w:val="FFFFFF"/>
+                <w:sz w:val="20"/>
+              </w:rPr>
+              <w:t>What to do</w:t>
+            </w:r>
+          </w:p>
+        </w:tc>
+      </w:tr>
+      <w:tr>
+        <w:tc>
+          <w:tcPr>
+            <w:tcW w:type="dxa" w:w="3200"/>
+          </w:tcPr>
+          <w:p>
+            <w:pPr>
+              <w:spacing w:after="40"/>
+            </w:pPr>
+            <w:r>
+              <w:rPr>
+                <w:b/>
+                <w:i w:val="0"/>
+                <w:sz w:val="20"/>
+              </w:rPr>
+              <w:t xml:space="preserve">Tax filing shows an error when it opens</w:t>
+            </w:r>
+          </w:p>
+        </w:tc>
+        <w:tc>
+          <w:tcPr>
+            <w:tcW w:type="dxa" w:w="6160"/>
+          </w:tcPr>
+          <w:p>
+            <w:pPr>
+              <w:spacing w:after="40"/>
+            </w:pPr>
+            <w:r>
+              <w:rPr>
+                <w:b w:val="0"/>
+                <w:i w:val="0"/>
+                <w:sz w:val="20"/>
+              </w:rPr>
+              <w:t xml:space="preserve">Ask your administrator to run Run database migrations (14.3). The tab needs a table that an older database does not have.</w:t>
+            </w:r>
+          </w:p>
+        </w:tc>
+      </w:tr>
+      <w:tr>
+        <w:tc>
+          <w:tcPr>
+            <w:tcW w:type="dxa" w:w="3200"/>
+            <w:shd w:val="clear" w:color="auto" w:fill="F4F7FB"/>
+          </w:tcPr>
+          <w:p>
+            <w:pPr>
+              <w:spacing w:after="40"/>
+            </w:pPr>
+            <w:r>
+              <w:rPr>
+                <w:b/>
+                <w:i w:val="0"/>
+                <w:sz w:val="20"/>
+              </w:rPr>
+              <w:t xml:space="preserve">Upload W-2 or Upload T4 says Claude is off</w:t>
+            </w:r>
+          </w:p>
+        </w:tc>
+        <w:tc>
+          <w:tcPr>
+            <w:tcW w:type="dxa" w:w="6160"/>
+            <w:shd w:val="clear" w:color="auto" w:fill="F4F7FB"/>
+          </w:tcPr>
+          <w:p>
+            <w:pPr>
+              <w:spacing w:after="40"/>
+            </w:pPr>
+            <w:r>
+              <w:rPr>
+                <w:b w:val="0"/>
+                <w:i w:val="0"/>
+                <w:sz w:val="20"/>
+              </w:rPr>
+              <w:t xml:space="preserve">Ask your administrator to set ANTHROPIC_API_KEY (14.1). Meanwhile type the boxes in.</w:t>
+            </w:r>
+          </w:p>
+        </w:tc>
+      </w:tr>
+      <w:tr>
+        <w:tc>
+          <w:tcPr>
+            <w:tcW w:type="dxa" w:w="3200"/>
+          </w:tcPr>
+          <w:p>
+            <w:pPr>
+              <w:spacing w:after="40"/>
+            </w:pPr>
+            <w:r>
+              <w:rPr>
+                <w:b/>
+                <w:i w:val="0"/>
+                <w:sz w:val="20"/>
+              </w:rPr>
+              <w:t xml:space="preserve">The state tax line is missing</w:t>
+            </w:r>
+          </w:p>
+        </w:tc>
+        <w:tc>
+          <w:tcPr>
+            <w:tcW w:type="dxa" w:w="6160"/>
+          </w:tcPr>
+          <w:p>
+            <w:pPr>
+              <w:spacing w:after="40"/>
+            </w:pPr>
+            <w:r>
+              <w:rPr>
+                <w:b w:val="0"/>
+                <w:i w:val="0"/>
+                <w:sz w:val="20"/>
+              </w:rPr>
+              <w:t xml:space="preserve">Choose your state on the </w:t>
+            </w:r>
+            <w:r>
+              <w:rPr>
+                <w:b/>
+                <w:i w:val="0"/>
+                <w:sz w:val="20"/>
+              </w:rPr>
+              <w:t xml:space="preserve">Your state</w:t>
+            </w:r>
+            <w:r>
+              <w:rPr>
+                <w:b w:val="0"/>
+                <w:i w:val="0"/>
+                <w:sz w:val="20"/>
+              </w:rPr>
+              <w:t xml:space="preserve"> page. Washington is not estimated.</w:t>
+            </w:r>
+          </w:p>
+        </w:tc>
+      </w:tr>
+      <w:tr>
+        <w:tc>
+          <w:tcPr>
+            <w:tcW w:type="dxa" w:w="3200"/>
+            <w:shd w:val="clear" w:color="auto" w:fill="F4F7FB"/>
+          </w:tcPr>
+          <w:p>
+            <w:pPr>
+              <w:spacing w:after="40"/>
+            </w:pPr>
+            <w:r>
+              <w:rPr>
+                <w:b/>
+                <w:i w:val="0"/>
+                <w:sz w:val="20"/>
+              </w:rPr>
+              <w:t xml:space="preserve">A Canadian return says “federal only”</w:t>
+            </w:r>
+          </w:p>
+        </w:tc>
+        <w:tc>
+          <w:tcPr>
+            <w:tcW w:type="dxa" w:w="6160"/>
+            <w:shd w:val="clear" w:color="auto" w:fill="F4F7FB"/>
+          </w:tcPr>
+          <w:p>
+            <w:pPr>
+              <w:spacing w:after="40"/>
+            </w:pPr>
+            <w:r>
+              <w:rPr>
+                <w:b w:val="0"/>
+                <w:i w:val="0"/>
+                <w:sz w:val="20"/>
+              </w:rPr>
+              <w:t xml:space="preserve">Choose your province on the </w:t>
+            </w:r>
+            <w:r>
+              <w:rPr>
+                <w:b/>
+                <w:i w:val="0"/>
+                <w:sz w:val="20"/>
+              </w:rPr>
+              <w:t xml:space="preserve">About you</w:t>
+            </w:r>
+            <w:r>
+              <w:rPr>
+                <w:b w:val="0"/>
+                <w:i w:val="0"/>
+                <w:sz w:val="20"/>
+              </w:rPr>
+              <w:t xml:space="preserve"> page. Quebec is federal only.</w:t>
+            </w:r>
+          </w:p>
+        </w:tc>
+      </w:tr>
+      <w:tr>
+        <w:tc>
+          <w:tcPr>
+            <w:tcW w:type="dxa" w:w="3200"/>
+          </w:tcPr>
+          <w:p>
+            <w:pPr>
+              <w:spacing w:after="40"/>
+            </w:pPr>
+            <w:r>
+              <w:rPr>
+                <w:b/>
+                <w:i w:val="0"/>
+                <w:sz w:val="20"/>
+              </w:rPr>
+              <w:t xml:space="preserve">The refund looks too high or too low</w:t>
+            </w:r>
+          </w:p>
+        </w:tc>
+        <w:tc>
+          <w:tcPr>
+            <w:tcW w:type="dxa" w:w="6160"/>
+          </w:tcPr>
+          <w:p>
+            <w:pPr>
+              <w:spacing w:after="40"/>
+            </w:pPr>
+            <w:r>
+              <w:rPr>
+                <w:b w:val="0"/>
+                <w:i w:val="0"/>
+                <w:sz w:val="20"/>
+              </w:rPr>
+              <w:t xml:space="preserve">Open </w:t>
+            </w:r>
+            <w:r>
+              <w:rPr>
+                <w:b/>
+                <w:i w:val="0"/>
+                <w:sz w:val="20"/>
+              </w:rPr>
+              <w:t xml:space="preserve">Review</w:t>
+            </w:r>
+            <w:r>
+              <w:rPr>
+                <w:b w:val="0"/>
+                <w:i w:val="0"/>
+                <w:sz w:val="20"/>
+              </w:rPr>
+              <w:t xml:space="preserve"> for warnings, then check each page against your slips. A box left empty counts as zero.</w:t>
+            </w:r>
+          </w:p>
+        </w:tc>
+      </w:tr>
+    </w:tbl>
+    <w:p>
+      <w:pPr>
+        <w:spacing w:after="40"/>
+      </w:pPr>
+    </w:p>
+    <w:p>
+      <w:r>
+        <w:br w:type="page"/>
+      </w:r>
+    </w:p>
+    <w:p>
+      <w:pPr>
+        <w:pStyle w:val="Heading1"/>
+      </w:pPr>
+      <w:r>
+        <w:t>Part 13 · Standard routines</w:t>
+      </w:r>
+    </w:p>
+    <w:p>
+      <w:pPr>
+        <w:pStyle w:val="Heading2"/>
+      </w:pPr>
+      <w:r>
+        <w:t>13.1 Every morning (about 10 minutes)</w:t>
       </w:r>
     </w:p>
     <w:p>
@@ -12811,7 +15193,7 @@
         <w:pStyle w:val="Heading2"/>
       </w:pPr>
       <w:r>
-        <w:t>12.2 During the day</w:t>
+        <w:t>13.2 During the day</w:t>
       </w:r>
     </w:p>
     <w:p>
@@ -12855,7 +15237,7 @@
         <w:pStyle w:val="Heading2"/>
       </w:pPr>
       <w:r>
-        <w:t>12.3 Every Friday (about 30 minutes)</w:t>
+        <w:t>13.3 Every Friday (about 30 minutes)</w:t>
       </w:r>
     </w:p>
     <w:p>
@@ -12987,7 +15369,7 @@
         <w:pStyle w:val="Heading2"/>
       </w:pPr>
       <w:r>
-        <w:t>12.4 Month end</w:t>
+        <w:t>13.4 Month end</w:t>
       </w:r>
     </w:p>
     <w:p>
@@ -13175,7 +15557,7 @@
         <w:pStyle w:val="Heading2"/>
       </w:pPr>
       <w:r>
-        <w:t>12.5 Compliance deadlines to know</w:t>
+        <w:t>13.5 Compliance deadlines to know</w:t>
       </w:r>
     </w:p>
     <w:tbl>
@@ -13426,7 +15808,7 @@
         <w:pStyle w:val="Heading1"/>
       </w:pPr>
       <w:r>
-        <w:t>Part 13 · Administration</w:t>
+        <w:t>Part 14 · Administration</w:t>
       </w:r>
     </w:p>
     <w:p>
@@ -13443,7 +15825,7 @@
         <w:pStyle w:val="Heading2"/>
       </w:pPr>
       <w:r>
-        <w:t>13.1 Settings that switch features on</w:t>
+        <w:t>14.1 Settings that switch features on</w:t>
       </w:r>
     </w:p>
     <w:tbl>
@@ -13690,7 +16072,7 @@
                 <w:i w:val="0"/>
                 <w:sz w:val="20"/>
               </w:rPr>
-              <w:t xml:space="preserve">Claude reading orders, invoices, RFQs and drawings, suggesting accounts in AI bookkeeping, and Counsel</w:t>
+              <w:t xml:space="preserve">Claude reading orders, invoices, RFQs and drawings, suggesting accounts in AI bookkeeping, and Counsel, and reading W-2 and T4 slips and PDF or photo statements</w:t>
             </w:r>
           </w:p>
         </w:tc>
@@ -14172,7 +16554,7 @@
         <w:pStyle w:val="Heading2"/>
       </w:pPr>
       <w:r>
-        <w:t>13.2 Changing the passphrase</w:t>
+        <w:t>14.2 Changing the passphrase</w:t>
       </w:r>
     </w:p>
     <w:p>
@@ -14245,7 +16627,7 @@
         <w:pStyle w:val="Heading2"/>
       </w:pPr>
       <w:r>
-        <w:t>13.3 Database updates</w:t>
+        <w:t>14.3 Database updates</w:t>
       </w:r>
     </w:p>
     <w:p>
@@ -14300,7 +16682,7 @@
         <w:pStyle w:val="Heading2"/>
       </w:pPr>
       <w:r>
-        <w:t>13.4 Loading the tariff and screening lists</w:t>
+        <w:t>14.4 Loading the tariff and screening lists</w:t>
       </w:r>
     </w:p>
     <w:p>
@@ -14359,7 +16741,7 @@
         <w:pStyle w:val="Heading2"/>
       </w:pPr>
       <w:r>
-        <w:t>13.5 The health check</w:t>
+        <w:t>14.5 The health check</w:t>
       </w:r>
     </w:p>
     <w:p>
@@ -14388,7 +16770,7 @@
         <w:pStyle w:val="Heading1"/>
       </w:pPr>
       <w:r>
-        <w:t>Part 14 · Troubleshooting</w:t>
+        <w:t>Part 15 · Troubleshooting</w:t>
       </w:r>
     </w:p>
     <w:tbl>
@@ -14530,7 +16912,7 @@
                 <w:i w:val="0"/>
                 <w:sz w:val="20"/>
               </w:rPr>
-              <w:t xml:space="preserve"> (13.3)</w:t>
+              <w:t xml:space="preserve"> (14.3)</w:t>
             </w:r>
           </w:p>
         </w:tc>
@@ -15556,7 +17938,7 @@
                 <w:i w:val="0"/>
                 <w:sz w:val="20"/>
               </w:rPr>
-              <w:t xml:space="preserve">Administrator: set ANTHROPIC_API_KEY (13.1)</w:t>
+              <w:t xml:space="preserve">Administrator: set ANTHROPIC_API_KEY (14.1)</w:t>
             </w:r>
           </w:p>
         </w:tc>
@@ -15671,7 +18053,7 @@
                 <w:i w:val="0"/>
                 <w:sz w:val="20"/>
               </w:rPr>
-              <w:t xml:space="preserve">Administrator: set both in Netlify and run a new production deploy (13.1, 13.2)</w:t>
+              <w:t xml:space="preserve">Administrator: set both in Netlify and run a new production deploy (14.1, 14.2)</w:t>
             </w:r>
           </w:p>
         </w:tc>
@@ -19299,6 +21681,18 @@
     </w:lvlOverride>
   </w:num>
   <w:num w:numId="29">
+    <w:abstractNumId w:val="7"/>
+    <w:lvlOverride w:ilvl="0">
+      <w:startOverride w:val="1"/>
+    </w:lvlOverride>
+  </w:num>
+  <w:num w:numId="30">
+    <w:abstractNumId w:val="7"/>
+    <w:lvlOverride w:ilvl="0">
+      <w:startOverride w:val="1"/>
+    </w:lvlOverride>
+  </w:num>
+  <w:num w:numId="31">
     <w:abstractNumId w:val="7"/>
     <w:lvlOverride w:ilvl="0">
       <w:startOverride w:val="1"/>

</xml_diff>

<commit_message>
Training guide: Tax filing and statement upload entries in Appendix A
Co-Authored-By: Claude Sonnet 5.5 <noreply@anthropic.com>
Claude-Session: https://claude.ai/code/session_01CEBT7Vo5qSapA8phj8RKSd
</commit_message>
<xml_diff>
--- a/docs/GloblexAI-Office-ERP-Operations-and-Training-Guide.docx
+++ b/docs/GloblexAI-Office-ERP-Operations-and-Training-Guide.docx
@@ -19083,7 +19083,241 @@
                 <w:i w:val="0"/>
                 <w:sz w:val="20"/>
               </w:rPr>
-              <w:t xml:space="preserve">AI bookkeeping → Import and sort</w:t>
+              <w:t xml:space="preserve">AI bookkeeping → Upload statement (CSV, OFX, PDF or photo)</w:t>
+            </w:r>
+          </w:p>
+        </w:tc>
+      </w:tr>
+      <w:tr>
+        <w:tc>
+          <w:tcPr>
+            <w:tcW w:type="dxa" w:w="4320"/>
+          </w:tcPr>
+          <w:p>
+            <w:pPr>
+              <w:spacing w:after="40"/>
+            </w:pPr>
+            <w:r>
+              <w:rPr>
+                <w:b w:val="0"/>
+                <w:i w:val="0"/>
+                <w:sz w:val="20"/>
+              </w:rPr>
+              <w:t xml:space="preserve">Prepare an income tax return (U.S. or Canada)</w:t>
+            </w:r>
+          </w:p>
+        </w:tc>
+        <w:tc>
+          <w:tcPr>
+            <w:tcW w:type="dxa" w:w="5040"/>
+          </w:tcPr>
+          <w:p>
+            <w:pPr>
+              <w:spacing w:after="40"/>
+            </w:pPr>
+            <w:r>
+              <w:rPr>
+                <w:b w:val="0"/>
+                <w:i w:val="0"/>
+                <w:sz w:val="20"/>
+              </w:rPr>
+              <w:t xml:space="preserve">Tax filing → Start a return</w:t>
+            </w:r>
+          </w:p>
+        </w:tc>
+      </w:tr>
+      <w:tr>
+        <w:tc>
+          <w:tcPr>
+            <w:tcW w:type="dxa" w:w="4320"/>
+            <w:shd w:val="clear" w:color="auto" w:fill="F4F7FB"/>
+          </w:tcPr>
+          <w:p>
+            <w:pPr>
+              <w:spacing w:after="40"/>
+            </w:pPr>
+            <w:r>
+              <w:rPr>
+                <w:b w:val="0"/>
+                <w:i w:val="0"/>
+                <w:sz w:val="20"/>
+              </w:rPr>
+              <w:t xml:space="preserve">Read a W-2 or T4 instead of typing it</w:t>
+            </w:r>
+          </w:p>
+        </w:tc>
+        <w:tc>
+          <w:tcPr>
+            <w:tcW w:type="dxa" w:w="5040"/>
+            <w:shd w:val="clear" w:color="auto" w:fill="F4F7FB"/>
+          </w:tcPr>
+          <w:p>
+            <w:pPr>
+              <w:spacing w:after="40"/>
+            </w:pPr>
+            <w:r>
+              <w:rPr>
+                <w:b w:val="0"/>
+                <w:i w:val="0"/>
+                <w:sz w:val="20"/>
+              </w:rPr>
+              <w:t xml:space="preserve">Tax filing → Job income → Upload W-2 / Upload T4</w:t>
+            </w:r>
+          </w:p>
+        </w:tc>
+      </w:tr>
+      <w:tr>
+        <w:tc>
+          <w:tcPr>
+            <w:tcW w:type="dxa" w:w="4320"/>
+          </w:tcPr>
+          <w:p>
+            <w:pPr>
+              <w:spacing w:after="40"/>
+            </w:pPr>
+            <w:r>
+              <w:rPr>
+                <w:b w:val="0"/>
+                <w:i w:val="0"/>
+                <w:sz w:val="20"/>
+              </w:rPr>
+              <w:t xml:space="preserve">See my estimated refund or balance owing</w:t>
+            </w:r>
+          </w:p>
+        </w:tc>
+        <w:tc>
+          <w:tcPr>
+            <w:tcW w:type="dxa" w:w="5040"/>
+          </w:tcPr>
+          <w:p>
+            <w:pPr>
+              <w:spacing w:after="40"/>
+            </w:pPr>
+            <w:r>
+              <w:rPr>
+                <w:b w:val="0"/>
+                <w:i w:val="0"/>
+                <w:sz w:val="20"/>
+              </w:rPr>
+              <w:t xml:space="preserve">Tax filing → the panel on the right</w:t>
+            </w:r>
+          </w:p>
+        </w:tc>
+      </w:tr>
+      <w:tr>
+        <w:tc>
+          <w:tcPr>
+            <w:tcW w:type="dxa" w:w="4320"/>
+            <w:shd w:val="clear" w:color="auto" w:fill="F4F7FB"/>
+          </w:tcPr>
+          <w:p>
+            <w:pPr>
+              <w:spacing w:after="40"/>
+            </w:pPr>
+            <w:r>
+              <w:rPr>
+                <w:b w:val="0"/>
+                <w:i w:val="0"/>
+                <w:sz w:val="20"/>
+              </w:rPr>
+              <w:t xml:space="preserve">Check what a tax return does not cover</w:t>
+            </w:r>
+          </w:p>
+        </w:tc>
+        <w:tc>
+          <w:tcPr>
+            <w:tcW w:type="dxa" w:w="5040"/>
+            <w:shd w:val="clear" w:color="auto" w:fill="F4F7FB"/>
+          </w:tcPr>
+          <w:p>
+            <w:pPr>
+              <w:spacing w:after="40"/>
+            </w:pPr>
+            <w:r>
+              <w:rPr>
+                <w:b w:val="0"/>
+                <w:i w:val="0"/>
+                <w:sz w:val="20"/>
+              </w:rPr>
+              <w:t xml:space="preserve">Tax filing → Review → Not included in this version</w:t>
+            </w:r>
+          </w:p>
+        </w:tc>
+      </w:tr>
+      <w:tr>
+        <w:tc>
+          <w:tcPr>
+            <w:tcW w:type="dxa" w:w="4320"/>
+          </w:tcPr>
+          <w:p>
+            <w:pPr>
+              <w:spacing w:after="40"/>
+            </w:pPr>
+            <w:r>
+              <w:rPr>
+                <w:b w:val="0"/>
+                <w:i w:val="0"/>
+                <w:sz w:val="20"/>
+              </w:rPr>
+              <w:t xml:space="preserve">Print or save my tax return as a PDF</w:t>
+            </w:r>
+          </w:p>
+        </w:tc>
+        <w:tc>
+          <w:tcPr>
+            <w:tcW w:type="dxa" w:w="5040"/>
+          </w:tcPr>
+          <w:p>
+            <w:pPr>
+              <w:spacing w:after="40"/>
+            </w:pPr>
+            <w:r>
+              <w:rPr>
+                <w:b w:val="0"/>
+                <w:i w:val="0"/>
+                <w:sz w:val="20"/>
+              </w:rPr>
+              <w:t xml:space="preserve">Tax filing → Your return → Print or save as PDF</w:t>
+            </w:r>
+          </w:p>
+        </w:tc>
+      </w:tr>
+      <w:tr>
+        <w:tc>
+          <w:tcPr>
+            <w:tcW w:type="dxa" w:w="4320"/>
+            <w:shd w:val="clear" w:color="auto" w:fill="F4F7FB"/>
+          </w:tcPr>
+          <w:p>
+            <w:pPr>
+              <w:spacing w:after="40"/>
+            </w:pPr>
+            <w:r>
+              <w:rPr>
+                <w:b w:val="0"/>
+                <w:i w:val="0"/>
+                <w:sz w:val="20"/>
+              </w:rPr>
+              <w:t xml:space="preserve">Find something in this guide</w:t>
+            </w:r>
+          </w:p>
+        </w:tc>
+        <w:tc>
+          <w:tcPr>
+            <w:tcW w:type="dxa" w:w="5040"/>
+            <w:shd w:val="clear" w:color="auto" w:fill="F4F7FB"/>
+          </w:tcPr>
+          <w:p>
+            <w:pPr>
+              <w:spacing w:after="40"/>
+            </w:pPr>
+            <w:r>
+              <w:rPr>
+                <w:b w:val="0"/>
+                <w:i w:val="0"/>
+                <w:sz w:val="20"/>
+              </w:rPr>
+              <w:t xml:space="preserve">App → Training guide → Quick search (top or bottom)</w:t>
             </w:r>
           </w:p>
         </w:tc>

</xml_diff>

<commit_message>
Training guide: Tax filing and statement upload entries in Appendix A (#81)
Claude-Session: https://claude.ai/code/session_01CEBT7Vo5qSapA8phj8RKSd

Co-authored-by: Claude <noreply@anthropic.com>
</commit_message>
<xml_diff>
--- a/docs/GloblexAI-Office-ERP-Operations-and-Training-Guide.docx
+++ b/docs/GloblexAI-Office-ERP-Operations-and-Training-Guide.docx
@@ -19083,7 +19083,241 @@
                 <w:i w:val="0"/>
                 <w:sz w:val="20"/>
               </w:rPr>
-              <w:t xml:space="preserve">AI bookkeeping → Import and sort</w:t>
+              <w:t xml:space="preserve">AI bookkeeping → Upload statement (CSV, OFX, PDF or photo)</w:t>
+            </w:r>
+          </w:p>
+        </w:tc>
+      </w:tr>
+      <w:tr>
+        <w:tc>
+          <w:tcPr>
+            <w:tcW w:type="dxa" w:w="4320"/>
+          </w:tcPr>
+          <w:p>
+            <w:pPr>
+              <w:spacing w:after="40"/>
+            </w:pPr>
+            <w:r>
+              <w:rPr>
+                <w:b w:val="0"/>
+                <w:i w:val="0"/>
+                <w:sz w:val="20"/>
+              </w:rPr>
+              <w:t xml:space="preserve">Prepare an income tax return (U.S. or Canada)</w:t>
+            </w:r>
+          </w:p>
+        </w:tc>
+        <w:tc>
+          <w:tcPr>
+            <w:tcW w:type="dxa" w:w="5040"/>
+          </w:tcPr>
+          <w:p>
+            <w:pPr>
+              <w:spacing w:after="40"/>
+            </w:pPr>
+            <w:r>
+              <w:rPr>
+                <w:b w:val="0"/>
+                <w:i w:val="0"/>
+                <w:sz w:val="20"/>
+              </w:rPr>
+              <w:t xml:space="preserve">Tax filing → Start a return</w:t>
+            </w:r>
+          </w:p>
+        </w:tc>
+      </w:tr>
+      <w:tr>
+        <w:tc>
+          <w:tcPr>
+            <w:tcW w:type="dxa" w:w="4320"/>
+            <w:shd w:val="clear" w:color="auto" w:fill="F4F7FB"/>
+          </w:tcPr>
+          <w:p>
+            <w:pPr>
+              <w:spacing w:after="40"/>
+            </w:pPr>
+            <w:r>
+              <w:rPr>
+                <w:b w:val="0"/>
+                <w:i w:val="0"/>
+                <w:sz w:val="20"/>
+              </w:rPr>
+              <w:t xml:space="preserve">Read a W-2 or T4 instead of typing it</w:t>
+            </w:r>
+          </w:p>
+        </w:tc>
+        <w:tc>
+          <w:tcPr>
+            <w:tcW w:type="dxa" w:w="5040"/>
+            <w:shd w:val="clear" w:color="auto" w:fill="F4F7FB"/>
+          </w:tcPr>
+          <w:p>
+            <w:pPr>
+              <w:spacing w:after="40"/>
+            </w:pPr>
+            <w:r>
+              <w:rPr>
+                <w:b w:val="0"/>
+                <w:i w:val="0"/>
+                <w:sz w:val="20"/>
+              </w:rPr>
+              <w:t xml:space="preserve">Tax filing → Job income → Upload W-2 / Upload T4</w:t>
+            </w:r>
+          </w:p>
+        </w:tc>
+      </w:tr>
+      <w:tr>
+        <w:tc>
+          <w:tcPr>
+            <w:tcW w:type="dxa" w:w="4320"/>
+          </w:tcPr>
+          <w:p>
+            <w:pPr>
+              <w:spacing w:after="40"/>
+            </w:pPr>
+            <w:r>
+              <w:rPr>
+                <w:b w:val="0"/>
+                <w:i w:val="0"/>
+                <w:sz w:val="20"/>
+              </w:rPr>
+              <w:t xml:space="preserve">See my estimated refund or balance owing</w:t>
+            </w:r>
+          </w:p>
+        </w:tc>
+        <w:tc>
+          <w:tcPr>
+            <w:tcW w:type="dxa" w:w="5040"/>
+          </w:tcPr>
+          <w:p>
+            <w:pPr>
+              <w:spacing w:after="40"/>
+            </w:pPr>
+            <w:r>
+              <w:rPr>
+                <w:b w:val="0"/>
+                <w:i w:val="0"/>
+                <w:sz w:val="20"/>
+              </w:rPr>
+              <w:t xml:space="preserve">Tax filing → the panel on the right</w:t>
+            </w:r>
+          </w:p>
+        </w:tc>
+      </w:tr>
+      <w:tr>
+        <w:tc>
+          <w:tcPr>
+            <w:tcW w:type="dxa" w:w="4320"/>
+            <w:shd w:val="clear" w:color="auto" w:fill="F4F7FB"/>
+          </w:tcPr>
+          <w:p>
+            <w:pPr>
+              <w:spacing w:after="40"/>
+            </w:pPr>
+            <w:r>
+              <w:rPr>
+                <w:b w:val="0"/>
+                <w:i w:val="0"/>
+                <w:sz w:val="20"/>
+              </w:rPr>
+              <w:t xml:space="preserve">Check what a tax return does not cover</w:t>
+            </w:r>
+          </w:p>
+        </w:tc>
+        <w:tc>
+          <w:tcPr>
+            <w:tcW w:type="dxa" w:w="5040"/>
+            <w:shd w:val="clear" w:color="auto" w:fill="F4F7FB"/>
+          </w:tcPr>
+          <w:p>
+            <w:pPr>
+              <w:spacing w:after="40"/>
+            </w:pPr>
+            <w:r>
+              <w:rPr>
+                <w:b w:val="0"/>
+                <w:i w:val="0"/>
+                <w:sz w:val="20"/>
+              </w:rPr>
+              <w:t xml:space="preserve">Tax filing → Review → Not included in this version</w:t>
+            </w:r>
+          </w:p>
+        </w:tc>
+      </w:tr>
+      <w:tr>
+        <w:tc>
+          <w:tcPr>
+            <w:tcW w:type="dxa" w:w="4320"/>
+          </w:tcPr>
+          <w:p>
+            <w:pPr>
+              <w:spacing w:after="40"/>
+            </w:pPr>
+            <w:r>
+              <w:rPr>
+                <w:b w:val="0"/>
+                <w:i w:val="0"/>
+                <w:sz w:val="20"/>
+              </w:rPr>
+              <w:t xml:space="preserve">Print or save my tax return as a PDF</w:t>
+            </w:r>
+          </w:p>
+        </w:tc>
+        <w:tc>
+          <w:tcPr>
+            <w:tcW w:type="dxa" w:w="5040"/>
+          </w:tcPr>
+          <w:p>
+            <w:pPr>
+              <w:spacing w:after="40"/>
+            </w:pPr>
+            <w:r>
+              <w:rPr>
+                <w:b w:val="0"/>
+                <w:i w:val="0"/>
+                <w:sz w:val="20"/>
+              </w:rPr>
+              <w:t xml:space="preserve">Tax filing → Your return → Print or save as PDF</w:t>
+            </w:r>
+          </w:p>
+        </w:tc>
+      </w:tr>
+      <w:tr>
+        <w:tc>
+          <w:tcPr>
+            <w:tcW w:type="dxa" w:w="4320"/>
+            <w:shd w:val="clear" w:color="auto" w:fill="F4F7FB"/>
+          </w:tcPr>
+          <w:p>
+            <w:pPr>
+              <w:spacing w:after="40"/>
+            </w:pPr>
+            <w:r>
+              <w:rPr>
+                <w:b w:val="0"/>
+                <w:i w:val="0"/>
+                <w:sz w:val="20"/>
+              </w:rPr>
+              <w:t xml:space="preserve">Find something in this guide</w:t>
+            </w:r>
+          </w:p>
+        </w:tc>
+        <w:tc>
+          <w:tcPr>
+            <w:tcW w:type="dxa" w:w="5040"/>
+            <w:shd w:val="clear" w:color="auto" w:fill="F4F7FB"/>
+          </w:tcPr>
+          <w:p>
+            <w:pPr>
+              <w:spacing w:after="40"/>
+            </w:pPr>
+            <w:r>
+              <w:rPr>
+                <w:b w:val="0"/>
+                <w:i w:val="0"/>
+                <w:sz w:val="20"/>
+              </w:rPr>
+              <w:t xml:space="preserve">App → Training guide → Quick search (top or bottom)</w:t>
             </w:r>
           </w:p>
         </w:tc>

</xml_diff>